<commit_message>
Task 6 Group Project Proposals
Task 6 Group Project Proposals
</commit_message>
<xml_diff>
--- a/datalabtasks_deliverables/Task 6 Group Project Proposals/ProjectProposal_Template.docx
+++ b/datalabtasks_deliverables/Task 6 Group Project Proposals/ProjectProposal_Template.docx
@@ -239,6 +239,12 @@
           <w:lang w:val="en-GB"/>
         </w:rPr>
         <w:t>12/05/2026</w:t>
+      </w:r>
+      <w:r>
+        <w:rPr>
+          <w:lang w:val="en-GB"/>
+        </w:rPr>
+        <w:t>/</w:t>
       </w:r>
     </w:p>
     <w:p>
@@ -853,16 +859,16 @@
           <w:rFonts w:eastAsia="Times New Roman" w:cs="Times New Roman"/>
           <w:color w:val="000000"/>
           <w:kern w:val="0"/>
-          <w:lang w:eastAsia="en-GB"/>
-          <w14:ligatures w14:val="none"/>
-        </w:rPr>
-      </w:pPr>
-      <w:r>
-        <w:rPr>
-          <w:rFonts w:eastAsia="Times New Roman" w:cs="Times New Roman"/>
-          <w:color w:val="000000"/>
-          <w:kern w:val="0"/>
-          <w:lang w:eastAsia="en-GB"/>
+          <w:lang w:val="en-GB" w:eastAsia="en-GB"/>
+          <w14:ligatures w14:val="none"/>
+        </w:rPr>
+      </w:pPr>
+      <w:r>
+        <w:rPr>
+          <w:rFonts w:eastAsia="Times New Roman" w:cs="Times New Roman"/>
+          <w:color w:val="000000"/>
+          <w:kern w:val="0"/>
+          <w:lang w:val="en-GB" w:eastAsia="en-GB"/>
           <w14:ligatures w14:val="none"/>
         </w:rPr>
         <w:t>This section should outline the </w:t>
@@ -874,7 +880,7 @@
           <w:bCs/>
           <w:color w:val="000000"/>
           <w:kern w:val="0"/>
-          <w:lang w:eastAsia="en-GB"/>
+          <w:lang w:val="en-GB" w:eastAsia="en-GB"/>
           <w14:ligatures w14:val="none"/>
         </w:rPr>
         <w:t>datasets</w:t>
@@ -884,7 +890,7 @@
           <w:rFonts w:eastAsia="Times New Roman" w:cs="Times New Roman"/>
           <w:color w:val="000000"/>
           <w:kern w:val="0"/>
-          <w:lang w:eastAsia="en-GB"/>
+          <w:lang w:val="en-GB" w:eastAsia="en-GB"/>
           <w14:ligatures w14:val="none"/>
         </w:rPr>
         <w:t> you plan to use for the project. Begin by describing the </w:t>
@@ -896,7 +902,7 @@
           <w:bCs/>
           <w:color w:val="000000"/>
           <w:kern w:val="0"/>
-          <w:lang w:eastAsia="en-GB"/>
+          <w:lang w:val="en-GB" w:eastAsia="en-GB"/>
           <w14:ligatures w14:val="none"/>
         </w:rPr>
         <w:t>data sources</w:t>
@@ -906,30 +912,10 @@
           <w:rFonts w:eastAsia="Times New Roman" w:cs="Times New Roman"/>
           <w:color w:val="000000"/>
           <w:kern w:val="0"/>
-          <w:lang w:eastAsia="en-GB"/>
-          <w14:ligatures w14:val="none"/>
-        </w:rPr>
-        <w:t>—include relevant details such as where the data is coming from, how it’s structured, and its key attributes or features.</w:t>
-      </w:r>
-      <w:r>
-        <w:rPr>
-          <w:rFonts w:eastAsia="Times New Roman" w:cs="Times New Roman"/>
-          <w:color w:val="000000"/>
-          <w:kern w:val="0"/>
-          <w:lang w:eastAsia="en-GB"/>
-          <w14:ligatures w14:val="none"/>
-        </w:rPr>
-        <w:t xml:space="preserve"> </w:t>
-      </w:r>
-      <w:r>
-        <w:rPr>
-          <w:rFonts w:eastAsia="Times New Roman" w:cs="Times New Roman"/>
-          <w:color w:val="000000"/>
-          <w:kern w:val="0"/>
-          <w:lang w:eastAsia="en-GB"/>
-          <w14:ligatures w14:val="none"/>
-        </w:rPr>
-        <w:t>Discuss any potential data quality issues (e.g., missing values, outliers) and how these will be handled in the pre-processing phase..</w:t>
+          <w:lang w:val="en-GB" w:eastAsia="en-GB"/>
+          <w14:ligatures w14:val="none"/>
+        </w:rPr>
+        <w:t>—include relevant details such as where the data is coming from, how it’s structured, and its key attributes or features. Discuss any potential data quality issues (e.g., missing values, outliers) and how these will be handled in the pre-processing phase..</w:t>
       </w:r>
     </w:p>
     <w:p>
@@ -974,7 +960,7 @@
           <w:rFonts w:eastAsia="Times New Roman" w:cs="Times New Roman"/>
           <w:color w:val="000000"/>
           <w:kern w:val="0"/>
-          <w:lang w:eastAsia="en-GB"/>
+          <w:lang w:val="en-GB" w:eastAsia="en-GB"/>
           <w14:ligatures w14:val="none"/>
         </w:rPr>
         <w:t>In this section, describe the </w:t>
@@ -986,20 +972,30 @@
           <w:bCs/>
           <w:color w:val="000000"/>
           <w:kern w:val="0"/>
+          <w:lang w:val="en-GB" w:eastAsia="en-GB"/>
+          <w14:ligatures w14:val="none"/>
+        </w:rPr>
+        <w:t>approach</w:t>
+      </w:r>
+      <w:r>
+        <w:rPr>
+          <w:rFonts w:eastAsia="Times New Roman" w:cs="Times New Roman"/>
+          <w:color w:val="000000"/>
+          <w:kern w:val="0"/>
+          <w:lang w:val="en-GB" w:eastAsia="en-GB"/>
+          <w14:ligatures w14:val="none"/>
+        </w:rPr>
+        <w:t xml:space="preserve"> your team will take to solve the problem using machine learning techniques. </w:t>
+      </w:r>
+      <w:r>
+        <w:rPr>
+          <w:rFonts w:eastAsia="Times New Roman" w:cs="Times New Roman"/>
+          <w:color w:val="000000"/>
+          <w:kern w:val="0"/>
           <w:lang w:eastAsia="en-GB"/>
           <w14:ligatures w14:val="none"/>
         </w:rPr>
-        <w:t>approach</w:t>
-      </w:r>
-      <w:r>
-        <w:rPr>
-          <w:rFonts w:eastAsia="Times New Roman" w:cs="Times New Roman"/>
-          <w:color w:val="000000"/>
-          <w:kern w:val="0"/>
-          <w:lang w:eastAsia="en-GB"/>
-          <w14:ligatures w14:val="none"/>
-        </w:rPr>
-        <w:t> your team will take to solve the problem using machine learning techniques. Break it down into clearly defined steps:</w:t>
+        <w:t>Break it down into clearly defined steps:</w:t>
       </w:r>
     </w:p>
     <w:p>
@@ -1013,7 +1009,7 @@
           <w:rFonts w:eastAsia="Times New Roman" w:cs="Times New Roman"/>
           <w:color w:val="000000"/>
           <w:kern w:val="0"/>
-          <w:lang w:eastAsia="en-GB"/>
+          <w:lang w:val="en-GB" w:eastAsia="en-GB"/>
           <w14:ligatures w14:val="none"/>
         </w:rPr>
       </w:pPr>
@@ -1024,7 +1020,7 @@
           <w:bCs/>
           <w:color w:val="000000"/>
           <w:kern w:val="0"/>
-          <w:lang w:eastAsia="en-GB"/>
+          <w:lang w:val="en-GB" w:eastAsia="en-GB"/>
           <w14:ligatures w14:val="none"/>
         </w:rPr>
         <w:t>Data Collection &amp; Pre-processing</w:t>
@@ -1034,7 +1030,7 @@
           <w:rFonts w:eastAsia="Times New Roman" w:cs="Times New Roman"/>
           <w:color w:val="000000"/>
           <w:kern w:val="0"/>
-          <w:lang w:eastAsia="en-GB"/>
+          <w:lang w:val="en-GB" w:eastAsia="en-GB"/>
           <w14:ligatures w14:val="none"/>
         </w:rPr>
         <w:t>: Explain how you will gather and clean the data, handle missing values, and address any inconsistencies or biases.</w:t>
@@ -1051,7 +1047,7 @@
           <w:rFonts w:eastAsia="Times New Roman" w:cs="Times New Roman"/>
           <w:color w:val="000000"/>
           <w:kern w:val="0"/>
-          <w:lang w:eastAsia="en-GB"/>
+          <w:lang w:val="en-GB" w:eastAsia="en-GB"/>
           <w14:ligatures w14:val="none"/>
         </w:rPr>
       </w:pPr>
@@ -1062,7 +1058,7 @@
           <w:bCs/>
           <w:color w:val="000000"/>
           <w:kern w:val="0"/>
-          <w:lang w:eastAsia="en-GB"/>
+          <w:lang w:val="en-GB" w:eastAsia="en-GB"/>
           <w14:ligatures w14:val="none"/>
         </w:rPr>
         <w:t>Model Selection &amp; Training</w:t>
@@ -1072,7 +1068,7 @@
           <w:rFonts w:eastAsia="Times New Roman" w:cs="Times New Roman"/>
           <w:color w:val="000000"/>
           <w:kern w:val="0"/>
-          <w:lang w:eastAsia="en-GB"/>
+          <w:lang w:val="en-GB" w:eastAsia="en-GB"/>
           <w14:ligatures w14:val="none"/>
         </w:rPr>
         <w:t>: Identify the </w:t>
@@ -1084,7 +1080,7 @@
           <w:bCs/>
           <w:color w:val="000000"/>
           <w:kern w:val="0"/>
-          <w:lang w:eastAsia="en-GB"/>
+          <w:lang w:val="en-GB" w:eastAsia="en-GB"/>
           <w14:ligatures w14:val="none"/>
         </w:rPr>
         <w:t>machine learning models</w:t>
@@ -1094,7 +1090,7 @@
           <w:rFonts w:eastAsia="Times New Roman" w:cs="Times New Roman"/>
           <w:color w:val="000000"/>
           <w:kern w:val="0"/>
-          <w:lang w:eastAsia="en-GB"/>
+          <w:lang w:val="en-GB" w:eastAsia="en-GB"/>
           <w14:ligatures w14:val="none"/>
         </w:rPr>
         <w:t> (e.g., regression, classification, neural networks) you plan to use and justify why these models are well-suited for your problem. Explain how you will split the data for </w:t>
@@ -1106,7 +1102,7 @@
           <w:bCs/>
           <w:color w:val="000000"/>
           <w:kern w:val="0"/>
-          <w:lang w:eastAsia="en-GB"/>
+          <w:lang w:val="en-GB" w:eastAsia="en-GB"/>
           <w14:ligatures w14:val="none"/>
         </w:rPr>
         <w:t>training</w:t>
@@ -1116,7 +1112,7 @@
           <w:rFonts w:eastAsia="Times New Roman" w:cs="Times New Roman"/>
           <w:color w:val="000000"/>
           <w:kern w:val="0"/>
-          <w:lang w:eastAsia="en-GB"/>
+          <w:lang w:val="en-GB" w:eastAsia="en-GB"/>
           <w14:ligatures w14:val="none"/>
         </w:rPr>
         <w:t> and </w:t>
@@ -1128,7 +1124,7 @@
           <w:bCs/>
           <w:color w:val="000000"/>
           <w:kern w:val="0"/>
-          <w:lang w:eastAsia="en-GB"/>
+          <w:lang w:val="en-GB" w:eastAsia="en-GB"/>
           <w14:ligatures w14:val="none"/>
         </w:rPr>
         <w:t>validation</w:t>
@@ -1138,7 +1134,7 @@
           <w:rFonts w:eastAsia="Times New Roman" w:cs="Times New Roman"/>
           <w:color w:val="000000"/>
           <w:kern w:val="0"/>
-          <w:lang w:eastAsia="en-GB"/>
+          <w:lang w:val="en-GB" w:eastAsia="en-GB"/>
           <w14:ligatures w14:val="none"/>
         </w:rPr>
         <w:t>.</w:t>
@@ -1155,7 +1151,7 @@
           <w:rFonts w:eastAsia="Times New Roman" w:cs="Times New Roman"/>
           <w:color w:val="000000"/>
           <w:kern w:val="0"/>
-          <w:lang w:eastAsia="en-GB"/>
+          <w:lang w:val="en-GB" w:eastAsia="en-GB"/>
           <w14:ligatures w14:val="none"/>
         </w:rPr>
       </w:pPr>
@@ -1166,7 +1162,7 @@
           <w:bCs/>
           <w:color w:val="000000"/>
           <w:kern w:val="0"/>
-          <w:lang w:eastAsia="en-GB"/>
+          <w:lang w:val="en-GB" w:eastAsia="en-GB"/>
           <w14:ligatures w14:val="none"/>
         </w:rPr>
         <w:t>Evaluation Metrics</w:t>
@@ -1176,7 +1172,7 @@
           <w:rFonts w:eastAsia="Times New Roman" w:cs="Times New Roman"/>
           <w:color w:val="000000"/>
           <w:kern w:val="0"/>
-          <w:lang w:eastAsia="en-GB"/>
+          <w:lang w:val="en-GB" w:eastAsia="en-GB"/>
           <w14:ligatures w14:val="none"/>
         </w:rPr>
         <w:t>: Discuss how you will assess the model's performance. Which evaluation metrics (e.g., accuracy, precision, recall, F1 score) will be used to validate your results?</w:t>
@@ -1193,7 +1189,7 @@
           <w:rFonts w:eastAsia="Times New Roman" w:cs="Times New Roman"/>
           <w:color w:val="000000"/>
           <w:kern w:val="0"/>
-          <w:lang w:eastAsia="en-GB"/>
+          <w:lang w:val="en-GB" w:eastAsia="en-GB"/>
           <w14:ligatures w14:val="none"/>
         </w:rPr>
       </w:pPr>
@@ -1204,7 +1200,7 @@
           <w:bCs/>
           <w:color w:val="000000"/>
           <w:kern w:val="0"/>
-          <w:lang w:eastAsia="en-GB"/>
+          <w:lang w:val="en-GB" w:eastAsia="en-GB"/>
           <w14:ligatures w14:val="none"/>
         </w:rPr>
         <w:t>Deployment</w:t>
@@ -1214,7 +1210,7 @@
           <w:rFonts w:eastAsia="Times New Roman" w:cs="Times New Roman"/>
           <w:color w:val="000000"/>
           <w:kern w:val="0"/>
-          <w:lang w:eastAsia="en-GB"/>
+          <w:lang w:val="en-GB" w:eastAsia="en-GB"/>
           <w14:ligatures w14:val="none"/>
         </w:rPr>
         <w:t>: Outline how you will deploy the final model into a production environment. Will it be embedded into an existing system, or will you develop a new application</w:t>
@@ -1224,7 +1220,7 @@
           <w:rFonts w:eastAsia="Times New Roman" w:cs="Times New Roman"/>
           <w:color w:val="000000"/>
           <w:kern w:val="0"/>
-          <w:lang w:eastAsia="en-GB"/>
+          <w:lang w:val="en-GB" w:eastAsia="en-GB"/>
           <w14:ligatures w14:val="none"/>
         </w:rPr>
         <w:t>?</w:t>
@@ -2168,19 +2164,11 @@
             <w:r>
               <w:t>á</w:t>
             </w:r>
-            <w:proofErr w:type="spellStart"/>
-            <w:r>
-              <w:rPr>
-                <w:lang w:val="en-GB"/>
-              </w:rPr>
-              <w:t>dor</w:t>
-            </w:r>
-            <w:proofErr w:type="spellEnd"/>
-            <w:r>
-              <w:rPr>
-                <w:lang w:val="en-GB"/>
-              </w:rPr>
-              <w:t>, Gergely</w:t>
+            <w:r>
+              <w:rPr>
+                <w:lang w:val="en-GB"/>
+              </w:rPr>
+              <w:t>dor, Gergely</w:t>
             </w:r>
           </w:p>
         </w:tc>
@@ -2326,19 +2314,11 @@
                 <w:lang w:val="en-GB"/>
               </w:rPr>
             </w:pPr>
-            <w:proofErr w:type="spellStart"/>
-            <w:r>
-              <w:rPr>
-                <w:lang w:val="en-GB"/>
-              </w:rPr>
-              <w:t>Qusaily</w:t>
-            </w:r>
-            <w:proofErr w:type="spellEnd"/>
-            <w:r>
-              <w:rPr>
-                <w:lang w:val="en-GB"/>
-              </w:rPr>
-              <w:t>, Qusai Al</w:t>
+            <w:r>
+              <w:rPr>
+                <w:lang w:val="en-GB"/>
+              </w:rPr>
+              <w:t>Qusaily, Qusai Al</w:t>
             </w:r>
           </w:p>
         </w:tc>
@@ -2720,6 +2700,9 @@
                 <w:fldChar w:fldCharType="begin"/>
               </w:r>
               <w:r>
+                <w:rPr>
+                  <w:lang w:val="en-GB"/>
+                </w:rPr>
                 <w:instrText>BIBLIOGRAPHY</w:instrText>
               </w:r>
               <w:r>
@@ -2813,16 +2796,16 @@
           <w:rFonts w:eastAsia="Times New Roman" w:cs="Times New Roman"/>
           <w:color w:val="000000"/>
           <w:kern w:val="0"/>
-          <w:lang w:eastAsia="en-GB"/>
-          <w14:ligatures w14:val="none"/>
-        </w:rPr>
-      </w:pPr>
-      <w:r>
-        <w:rPr>
-          <w:rFonts w:eastAsia="Times New Roman" w:cs="Times New Roman"/>
-          <w:color w:val="000000"/>
-          <w:kern w:val="0"/>
-          <w:lang w:eastAsia="en-GB"/>
+          <w:lang w:val="en-GB" w:eastAsia="en-GB"/>
+          <w14:ligatures w14:val="none"/>
+        </w:rPr>
+      </w:pPr>
+      <w:r>
+        <w:rPr>
+          <w:rFonts w:eastAsia="Times New Roman" w:cs="Times New Roman"/>
+          <w:color w:val="000000"/>
+          <w:kern w:val="0"/>
+          <w:lang w:val="en-GB" w:eastAsia="en-GB"/>
           <w14:ligatures w14:val="none"/>
         </w:rPr>
         <w:t>In this section, include all the </w:t>
@@ -2834,7 +2817,7 @@
           <w:bCs/>
           <w:color w:val="000000"/>
           <w:kern w:val="0"/>
-          <w:lang w:eastAsia="en-GB"/>
+          <w:lang w:val="en-GB" w:eastAsia="en-GB"/>
           <w14:ligatures w14:val="none"/>
         </w:rPr>
         <w:t>references</w:t>
@@ -2844,7 +2827,7 @@
           <w:rFonts w:eastAsia="Times New Roman" w:cs="Times New Roman"/>
           <w:color w:val="000000"/>
           <w:kern w:val="0"/>
-          <w:lang w:eastAsia="en-GB"/>
+          <w:lang w:val="en-GB" w:eastAsia="en-GB"/>
           <w14:ligatures w14:val="none"/>
         </w:rPr>
         <w:t> or </w:t>
@@ -2856,7 +2839,7 @@
           <w:bCs/>
           <w:color w:val="000000"/>
           <w:kern w:val="0"/>
-          <w:lang w:eastAsia="en-GB"/>
+          <w:lang w:val="en-GB" w:eastAsia="en-GB"/>
           <w14:ligatures w14:val="none"/>
         </w:rPr>
         <w:t>sources</w:t>
@@ -2866,7 +2849,7 @@
           <w:rFonts w:eastAsia="Times New Roman" w:cs="Times New Roman"/>
           <w:color w:val="000000"/>
           <w:kern w:val="0"/>
-          <w:lang w:eastAsia="en-GB"/>
+          <w:lang w:val="en-GB" w:eastAsia="en-GB"/>
           <w14:ligatures w14:val="none"/>
         </w:rPr>
         <w:t> you consulted during the development of your proposal. These can include academic papers, datasets, articles, websites, and any other materials that contributed to your understanding of the problem or guided your methodology.</w:t>
@@ -2879,16 +2862,16 @@
           <w:rFonts w:eastAsia="Times New Roman" w:cs="Times New Roman"/>
           <w:color w:val="000000"/>
           <w:kern w:val="0"/>
-          <w:lang w:eastAsia="en-GB"/>
-          <w14:ligatures w14:val="none"/>
-        </w:rPr>
-      </w:pPr>
-      <w:r>
-        <w:rPr>
-          <w:rFonts w:eastAsia="Times New Roman" w:cs="Times New Roman"/>
-          <w:color w:val="000000"/>
-          <w:kern w:val="0"/>
-          <w:lang w:eastAsia="en-GB"/>
+          <w:lang w:val="en-GB" w:eastAsia="en-GB"/>
+          <w14:ligatures w14:val="none"/>
+        </w:rPr>
+      </w:pPr>
+      <w:r>
+        <w:rPr>
+          <w:rFonts w:eastAsia="Times New Roman" w:cs="Times New Roman"/>
+          <w:color w:val="000000"/>
+          <w:kern w:val="0"/>
+          <w:lang w:val="en-GB" w:eastAsia="en-GB"/>
           <w14:ligatures w14:val="none"/>
         </w:rPr>
         <w:t>Please ensure that all references are cited and formatted according to the </w:t>
@@ -2900,7 +2883,7 @@
           <w:bCs/>
           <w:color w:val="000000"/>
           <w:kern w:val="0"/>
-          <w:lang w:eastAsia="en-GB"/>
+          <w:lang w:val="en-GB" w:eastAsia="en-GB"/>
           <w14:ligatures w14:val="none"/>
         </w:rPr>
         <w:t>APA style</w:t>
@@ -2910,7 +2893,7 @@
           <w:rFonts w:eastAsia="Times New Roman" w:cs="Times New Roman"/>
           <w:color w:val="000000"/>
           <w:kern w:val="0"/>
-          <w:lang w:eastAsia="en-GB"/>
+          <w:lang w:val="en-GB" w:eastAsia="en-GB"/>
           <w14:ligatures w14:val="none"/>
         </w:rPr>
         <w:t>. You can find detailed guidance on how to format your references in the APA style</w:t>
@@ -2920,7 +2903,7 @@
           <w:rFonts w:eastAsia="Times New Roman" w:cs="Times New Roman"/>
           <w:color w:val="000000"/>
           <w:kern w:val="0"/>
-          <w:lang w:eastAsia="en-GB"/>
+          <w:lang w:val="en-GB" w:eastAsia="en-GB"/>
           <w14:ligatures w14:val="none"/>
         </w:rPr>
         <w:t xml:space="preserve">. You can find all information about citing APA, including citing generative AI, on this page </w:t>
@@ -2931,7 +2914,7 @@
             <w:rStyle w:val="Hyperlink"/>
             <w:rFonts w:eastAsia="Times New Roman" w:cs="Times New Roman"/>
             <w:kern w:val="0"/>
-            <w:lang w:eastAsia="en-GB"/>
+            <w:lang w:val="en-GB" w:eastAsia="en-GB"/>
             <w14:ligatures w14:val="none"/>
           </w:rPr>
           <w:t>https://buas.libguides.com/c.php?g=178504&amp;p=1173145</w:t>
@@ -2942,7 +2925,7 @@
           <w:rFonts w:eastAsia="Times New Roman" w:cs="Times New Roman"/>
           <w:color w:val="000000"/>
           <w:kern w:val="0"/>
-          <w:lang w:eastAsia="en-GB"/>
+          <w:lang w:val="en-GB" w:eastAsia="en-GB"/>
           <w14:ligatures w14:val="none"/>
         </w:rPr>
         <w:t xml:space="preserve"> from the BUas library.</w:t>
@@ -2955,7 +2938,7 @@
           <w:rFonts w:eastAsia="Times New Roman" w:cs="Times New Roman"/>
           <w:color w:val="000000"/>
           <w:kern w:val="0"/>
-          <w:lang w:eastAsia="en-GB"/>
+          <w:lang w:val="en-GB" w:eastAsia="en-GB"/>
           <w14:ligatures w14:val="none"/>
         </w:rPr>
       </w:pPr>
@@ -4826,52 +4809,21 @@
 </file>
 
 <file path=customXml/item1.xml><?xml version="1.0" encoding="utf-8"?>
-<b:Sources xmlns:b="http://schemas.openxmlformats.org/officeDocument/2006/bibliography" xmlns="http://schemas.openxmlformats.org/officeDocument/2006/bibliography" SelectedStyle="\APASixthEditionOfficeOnline.xsl" StyleName="APA" Version="6">
-  <b:Source>
-    <b:Tag>Phi20</b:Tag>
-    <b:SourceType>InternetSite</b:SourceType>
-    <b:Guid>{370EA8DA-55BD-47F2-A140-624A4CA438B9}</b:Guid>
-    <b:Author>
-      <b:Author>
-        <b:NameList>
-          <b:Person>
-            <b:Last>Ndikum</b:Last>
-            <b:First>Philip</b:First>
-          </b:Person>
-        </b:NameList>
-      </b:Author>
-    </b:Author>
-    <b:Title>Machine Learning Algorithms for Financial Asset Price Forecasting</b:Title>
-    <b:InternetSiteTitle>arxiv</b:InternetSiteTitle>
-    <b:Year>2020</b:Year>
-    <b:URL>https://arxiv.org/abs/2004.01504</b:URL>
-    <b:RefOrder>1</b:RefOrder>
-  </b:Source>
-  <b:Source>
-    <b:Tag>Alb23</b:Tag>
-    <b:SourceType>InternetSite</b:SourceType>
-    <b:Guid>{CAC6EDDE-0592-4C82-9906-7CB97CCD92C8}</b:Guid>
-    <b:Author>
-      <b:Author>
-        <b:NameList>
-          <b:Person>
-            <b:Last>Albert Wong</b:Last>
-            <b:First>Steven</b:First>
-            <b:Middle>Whang, Emilio Sagre, Niha Sachin, Gustavo Dutra, Yew-Wei Lim, Gaetan Hains, Youry Khmelevsky, Frank Zhang</b:Middle>
-          </b:Person>
-        </b:NameList>
-      </b:Author>
-    </b:Author>
-    <b:Title>Short-Term Stock Price Forecasting using exogenous variables and Machine Learning Algorithms</b:Title>
-    <b:InternetSiteTitle>Trading and Market Microstructure</b:InternetSiteTitle>
-    <b:Year>2023</b:Year>
-    <b:URL>https://arxiv.org/abs/2309.00618</b:URL>
-    <b:RefOrder>2</b:RefOrder>
-  </b:Source>
-</b:Sources>
+<p:properties xmlns:p="http://schemas.microsoft.com/office/2006/metadata/properties" xmlns:xsi="http://www.w3.org/2001/XMLSchema-instance" xmlns:pc="http://schemas.microsoft.com/office/infopath/2007/PartnerControls">
+  <documentManagement/>
+</p:properties>
 </file>
 
 <file path=customXml/item2.xml><?xml version="1.0" encoding="utf-8"?>
+<?mso-contentType ?>
+<FormTemplates xmlns="http://schemas.microsoft.com/sharepoint/v3/contenttype/forms">
+  <Display>DocumentLibraryForm</Display>
+  <Edit>DocumentLibraryForm</Edit>
+  <New>DocumentLibraryForm</New>
+</FormTemplates>
+</file>
+
+<file path=customXml/item3.xml><?xml version="1.0" encoding="utf-8"?>
 <ct:contentTypeSchema xmlns:ct="http://schemas.microsoft.com/office/2006/metadata/contentType" xmlns:ma="http://schemas.microsoft.com/office/2006/metadata/properties/metaAttributes" ct:_="" ma:_="" ma:contentTypeName="Document" ma:contentTypeID="0x010100CA0648AB48CC2344B6C41470F89B25D4" ma:contentTypeVersion="4" ma:contentTypeDescription="Create a new document." ma:contentTypeScope="" ma:versionID="a660c338eb59bfff4af50e265a6ab854">
   <xsd:schema xmlns:xsd="http://www.w3.org/2001/XMLSchema" xmlns:xs="http://www.w3.org/2001/XMLSchema" xmlns:p="http://schemas.microsoft.com/office/2006/metadata/properties" xmlns:ns2="f3492271-d953-408b-9284-5d0a710cdb1a" targetNamespace="http://schemas.microsoft.com/office/2006/metadata/properties" ma:root="true" ma:fieldsID="5f8157e55ce76d062aad01a2da979587" ns2:_="">
     <xsd:import namespace="f3492271-d953-408b-9284-5d0a710cdb1a"/>
@@ -5015,30 +4967,70 @@
 </ct:contentTypeSchema>
 </file>
 
-<file path=customXml/item3.xml><?xml version="1.0" encoding="utf-8"?>
-<?mso-contentType ?>
-<FormTemplates xmlns="http://schemas.microsoft.com/sharepoint/v3/contenttype/forms">
-  <Display>DocumentLibraryForm</Display>
-  <Edit>DocumentLibraryForm</Edit>
-  <New>DocumentLibraryForm</New>
-</FormTemplates>
-</file>
-
 <file path=customXml/item4.xml><?xml version="1.0" encoding="utf-8"?>
-<p:properties xmlns:p="http://schemas.microsoft.com/office/2006/metadata/properties" xmlns:xsi="http://www.w3.org/2001/XMLSchema-instance" xmlns:pc="http://schemas.microsoft.com/office/infopath/2007/PartnerControls">
-  <documentManagement/>
-</p:properties>
+<b:Sources xmlns:b="http://schemas.openxmlformats.org/officeDocument/2006/bibliography" xmlns="http://schemas.openxmlformats.org/officeDocument/2006/bibliography" SelectedStyle="\APASixthEditionOfficeOnline.xsl" StyleName="APA" Version="6">
+  <b:Source>
+    <b:Tag>Phi20</b:Tag>
+    <b:SourceType>InternetSite</b:SourceType>
+    <b:Guid>{370EA8DA-55BD-47F2-A140-624A4CA438B9}</b:Guid>
+    <b:Author>
+      <b:Author>
+        <b:NameList>
+          <b:Person>
+            <b:Last>Ndikum</b:Last>
+            <b:First>Philip</b:First>
+          </b:Person>
+        </b:NameList>
+      </b:Author>
+    </b:Author>
+    <b:Title>Machine Learning Algorithms for Financial Asset Price Forecasting</b:Title>
+    <b:InternetSiteTitle>arxiv</b:InternetSiteTitle>
+    <b:Year>2020</b:Year>
+    <b:URL>https://arxiv.org/abs/2004.01504</b:URL>
+    <b:RefOrder>1</b:RefOrder>
+  </b:Source>
+  <b:Source>
+    <b:Tag>Alb23</b:Tag>
+    <b:SourceType>InternetSite</b:SourceType>
+    <b:Guid>{CAC6EDDE-0592-4C82-9906-7CB97CCD92C8}</b:Guid>
+    <b:Author>
+      <b:Author>
+        <b:NameList>
+          <b:Person>
+            <b:Last>Albert Wong</b:Last>
+            <b:First>Steven</b:First>
+            <b:Middle>Whang, Emilio Sagre, Niha Sachin, Gustavo Dutra, Yew-Wei Lim, Gaetan Hains, Youry Khmelevsky, Frank Zhang</b:Middle>
+          </b:Person>
+        </b:NameList>
+      </b:Author>
+    </b:Author>
+    <b:Title>Short-Term Stock Price Forecasting using exogenous variables and Machine Learning Algorithms</b:Title>
+    <b:InternetSiteTitle>Trading and Market Microstructure</b:InternetSiteTitle>
+    <b:Year>2023</b:Year>
+    <b:URL>https://arxiv.org/abs/2309.00618</b:URL>
+    <b:RefOrder>2</b:RefOrder>
+  </b:Source>
+</b:Sources>
 </file>
 
 <file path=customXml/itemProps1.xml><?xml version="1.0" encoding="utf-8"?>
-<ds:datastoreItem xmlns:ds="http://schemas.openxmlformats.org/officeDocument/2006/customXml" ds:itemID="{C8132FE0-DAB3-4537-BC70-39321B387155}">
+<ds:datastoreItem xmlns:ds="http://schemas.openxmlformats.org/officeDocument/2006/customXml" ds:itemID="{A8834EE7-90FD-4006-BF8D-556140116A2D}">
   <ds:schemaRefs>
-    <ds:schemaRef ds:uri="http://schemas.openxmlformats.org/officeDocument/2006/bibliography"/>
+    <ds:schemaRef ds:uri="http://schemas.microsoft.com/office/2006/metadata/properties"/>
+    <ds:schemaRef ds:uri="http://schemas.microsoft.com/office/infopath/2007/PartnerControls"/>
   </ds:schemaRefs>
 </ds:datastoreItem>
 </file>
 
 <file path=customXml/itemProps2.xml><?xml version="1.0" encoding="utf-8"?>
+<ds:datastoreItem xmlns:ds="http://schemas.openxmlformats.org/officeDocument/2006/customXml" ds:itemID="{09ECDD89-9376-4D0D-8E13-549D769B12AB}">
+  <ds:schemaRefs>
+    <ds:schemaRef ds:uri="http://schemas.microsoft.com/sharepoint/v3/contenttype/forms"/>
+  </ds:schemaRefs>
+</ds:datastoreItem>
+</file>
+
+<file path=customXml/itemProps3.xml><?xml version="1.0" encoding="utf-8"?>
 <ds:datastoreItem xmlns:ds="http://schemas.openxmlformats.org/officeDocument/2006/customXml" ds:itemID="{0646EBB2-5A1D-42FE-B060-FCDBA64E390D}">
   <ds:schemaRefs>
     <ds:schemaRef ds:uri="http://schemas.microsoft.com/office/2006/metadata/contentType"/>
@@ -5056,19 +5048,10 @@
 </ds:datastoreItem>
 </file>
 
-<file path=customXml/itemProps3.xml><?xml version="1.0" encoding="utf-8"?>
-<ds:datastoreItem xmlns:ds="http://schemas.openxmlformats.org/officeDocument/2006/customXml" ds:itemID="{09ECDD89-9376-4D0D-8E13-549D769B12AB}">
+<file path=customXml/itemProps4.xml><?xml version="1.0" encoding="utf-8"?>
+<ds:datastoreItem xmlns:ds="http://schemas.openxmlformats.org/officeDocument/2006/customXml" ds:itemID="{C8132FE0-DAB3-4537-BC70-39321B387155}">
   <ds:schemaRefs>
-    <ds:schemaRef ds:uri="http://schemas.microsoft.com/sharepoint/v3/contenttype/forms"/>
-  </ds:schemaRefs>
-</ds:datastoreItem>
-</file>
-
-<file path=customXml/itemProps4.xml><?xml version="1.0" encoding="utf-8"?>
-<ds:datastoreItem xmlns:ds="http://schemas.openxmlformats.org/officeDocument/2006/customXml" ds:itemID="{A8834EE7-90FD-4006-BF8D-556140116A2D}">
-  <ds:schemaRefs>
-    <ds:schemaRef ds:uri="http://schemas.microsoft.com/office/2006/metadata/properties"/>
-    <ds:schemaRef ds:uri="http://schemas.microsoft.com/office/infopath/2007/PartnerControls"/>
+    <ds:schemaRef ds:uri="http://schemas.openxmlformats.org/officeDocument/2006/bibliography"/>
   </ds:schemaRefs>
 </ds:datastoreItem>
 </file>
</xml_diff>

<commit_message>
Slides Group project proposal
Slides Group project proposal
</commit_message>
<xml_diff>
--- a/datalabtasks_deliverables/Task 6 Group Project Proposals/ProjectProposal_Template.docx
+++ b/datalabtasks_deliverables/Task 6 Group Project Proposals/ProjectProposal_Template.docx
@@ -1,6 +1,6 @@
 
 <file path=word/document.xml><?xml version="1.0" encoding="utf-8"?>
-<w:document xmlns:wpc="http://schemas.microsoft.com/office/word/2010/wordprocessingCanvas" xmlns:cx="http://schemas.microsoft.com/office/drawing/2014/chartex" xmlns:cx1="http://schemas.microsoft.com/office/drawing/2015/9/8/chartex" xmlns:cx2="http://schemas.microsoft.com/office/drawing/2015/10/21/chartex" xmlns:cx3="http://schemas.microsoft.com/office/drawing/2016/5/9/chartex" xmlns:cx4="http://schemas.microsoft.com/office/drawing/2016/5/10/chartex" xmlns:cx5="http://schemas.microsoft.com/office/drawing/2016/5/11/chartex" xmlns:cx6="http://schemas.microsoft.com/office/drawing/2016/5/12/chartex" xmlns:cx7="http://schemas.microsoft.com/office/drawing/2016/5/13/chartex" xmlns:cx8="http://schemas.microsoft.com/office/drawing/2016/5/14/chartex" xmlns:mc="http://schemas.openxmlformats.org/markup-compatibility/2006" xmlns:aink="http://schemas.microsoft.com/office/drawing/2016/ink" xmlns:am3d="http://schemas.microsoft.com/office/drawing/2017/model3d" xmlns:o="urn:schemas-microsoft-com:office:office" xmlns:r="http://schemas.openxmlformats.org/officeDocument/2006/relationships" xmlns:m="http://schemas.openxmlformats.org/officeDocument/2006/math" xmlns:v="urn:schemas-microsoft-com:vml" xmlns:wp14="http://schemas.microsoft.com/office/word/2010/wordprocessingDrawing" xmlns:wp="http://schemas.openxmlformats.org/drawingml/2006/wordprocessingDrawing" xmlns:w10="urn:schemas-microsoft-com:office:word" xmlns:w="http://schemas.openxmlformats.org/wordprocessingml/2006/main" xmlns:w14="http://schemas.microsoft.com/office/word/2010/wordml" xmlns:w15="http://schemas.microsoft.com/office/word/2012/wordml" xmlns:w16cex="http://schemas.microsoft.com/office/word/2018/wordml/cex" xmlns:w16cid="http://schemas.microsoft.com/office/word/2016/wordml/cid" xmlns:w16="http://schemas.microsoft.com/office/word/2018/wordml" xmlns:w16sdtdh="http://schemas.microsoft.com/office/word/2020/wordml/sdtdatahash" xmlns:w16se="http://schemas.microsoft.com/office/word/2015/wordml/symex" xmlns:wpg="http://schemas.microsoft.com/office/word/2010/wordprocessingGroup" xmlns:wpi="http://schemas.microsoft.com/office/word/2010/wordprocessingInk" xmlns:wne="http://schemas.microsoft.com/office/word/2006/wordml" xmlns:wps="http://schemas.microsoft.com/office/word/2010/wordprocessingShape" mc:Ignorable="w14 w15 w16se w16cid w16 w16cex w16sdtdh wp14">
+<w:document xmlns:wpc="http://schemas.microsoft.com/office/word/2010/wordprocessingCanvas" xmlns:cx="http://schemas.microsoft.com/office/drawing/2014/chartex" xmlns:cx1="http://schemas.microsoft.com/office/drawing/2015/9/8/chartex" xmlns:cx2="http://schemas.microsoft.com/office/drawing/2015/10/21/chartex" xmlns:cx3="http://schemas.microsoft.com/office/drawing/2016/5/9/chartex" xmlns:cx4="http://schemas.microsoft.com/office/drawing/2016/5/10/chartex" xmlns:cx5="http://schemas.microsoft.com/office/drawing/2016/5/11/chartex" xmlns:cx6="http://schemas.microsoft.com/office/drawing/2016/5/12/chartex" xmlns:cx7="http://schemas.microsoft.com/office/drawing/2016/5/13/chartex" xmlns:cx8="http://schemas.microsoft.com/office/drawing/2016/5/14/chartex" xmlns:mc="http://schemas.openxmlformats.org/markup-compatibility/2006" xmlns:aink="http://schemas.microsoft.com/office/drawing/2016/ink" xmlns:am3d="http://schemas.microsoft.com/office/drawing/2017/model3d" xmlns:o="urn:schemas-microsoft-com:office:office" xmlns:oel="http://schemas.microsoft.com/office/2019/extlst" xmlns:r="http://schemas.openxmlformats.org/officeDocument/2006/relationships" xmlns:m="http://schemas.openxmlformats.org/officeDocument/2006/math" xmlns:v="urn:schemas-microsoft-com:vml" xmlns:wp14="http://schemas.microsoft.com/office/word/2010/wordprocessingDrawing" xmlns:wp="http://schemas.openxmlformats.org/drawingml/2006/wordprocessingDrawing" xmlns:w10="urn:schemas-microsoft-com:office:word" xmlns:w="http://schemas.openxmlformats.org/wordprocessingml/2006/main" xmlns:w14="http://schemas.microsoft.com/office/word/2010/wordml" xmlns:w15="http://schemas.microsoft.com/office/word/2012/wordml" xmlns:w16cex="http://schemas.microsoft.com/office/word/2018/wordml/cex" xmlns:w16cid="http://schemas.microsoft.com/office/word/2016/wordml/cid" xmlns:w16="http://schemas.microsoft.com/office/word/2018/wordml" xmlns:w16du="http://schemas.microsoft.com/office/word/2023/wordml/word16du" xmlns:w16sdtdh="http://schemas.microsoft.com/office/word/2020/wordml/sdtdatahash" xmlns:w16sdtfl="http://schemas.microsoft.com/office/word/2024/wordml/sdtformatlock" xmlns:w16se="http://schemas.microsoft.com/office/word/2015/wordml/symex" xmlns:wpg="http://schemas.microsoft.com/office/word/2010/wordprocessingGroup" xmlns:wpi="http://schemas.microsoft.com/office/word/2010/wordprocessingInk" xmlns:wne="http://schemas.microsoft.com/office/word/2006/wordml" xmlns:wps="http://schemas.microsoft.com/office/word/2010/wordprocessingShape" mc:Ignorable="w14 w15 w16se w16cid w16 w16cex w16sdtdh w16sdtfl w16du wp14">
   <w:body>
     <w:p>
       <w:pPr>
@@ -119,7 +119,7 @@
           <w:szCs w:val="36"/>
           <w:lang w:val="en-GB"/>
         </w:rPr>
-        <w:t>Title of the Project</w:t>
+        <w:t>Day to day stock price predictor</w:t>
       </w:r>
     </w:p>
     <w:p>
@@ -262,7 +262,7 @@
     </w:p>
     <w:p>
       <w:pPr>
-        <w:pStyle w:val="a7"/>
+        <w:pStyle w:val="ListParagraph"/>
         <w:numPr>
           <w:ilvl w:val="0"/>
           <w:numId w:val="3"/>
@@ -396,21 +396,21 @@
       </w:r>
       <w:r>
         <w:rPr>
-          <w:rStyle w:val="ac"/>
+          <w:rStyle w:val="Strong"/>
           <w:rFonts w:cs="Arial"/>
         </w:rPr>
         <w:t>exogenous</w:t>
       </w:r>
       <w:r>
         <w:rPr>
-          <w:rStyle w:val="ac"/>
+          <w:rStyle w:val="Strong"/>
           <w:rFonts w:cs="Arial"/>
         </w:rPr>
         <w:t xml:space="preserve"> </w:t>
       </w:r>
       <w:r>
         <w:rPr>
-          <w:rStyle w:val="ac"/>
+          <w:rStyle w:val="Strong"/>
           <w:rFonts w:cs="Arial"/>
           <w:b w:val="0"/>
           <w:bCs w:val="0"/>
@@ -585,7 +585,7 @@
     </w:p>
     <w:p>
       <w:pPr>
-        <w:pStyle w:val="a7"/>
+        <w:pStyle w:val="ListParagraph"/>
         <w:numPr>
           <w:ilvl w:val="0"/>
           <w:numId w:val="3"/>
@@ -628,29 +628,7 @@
           <w:lang w:val="en-GB" w:eastAsia="en-GB"/>
           <w14:ligatures w14:val="none"/>
         </w:rPr>
-        <w:t xml:space="preserve">Predicting short-term stock price movements is one of the most challenging problems in quantitative finance. The prediction and forecasting of asset </w:t>
-      </w:r>
-      <w:proofErr w:type="gramStart"/>
-      <w:r>
-        <w:rPr>
-          <w:rFonts w:eastAsia="Times New Roman" w:cs="Times New Roman"/>
-          <w:color w:val="000000"/>
-          <w:kern w:val="0"/>
-          <w:lang w:val="en-GB" w:eastAsia="en-GB"/>
-          <w14:ligatures w14:val="none"/>
-        </w:rPr>
-        <w:t>prices</w:t>
-      </w:r>
-      <w:proofErr w:type="gramEnd"/>
-      <w:r>
-        <w:rPr>
-          <w:rFonts w:eastAsia="Times New Roman" w:cs="Times New Roman"/>
-          <w:color w:val="000000"/>
-          <w:kern w:val="0"/>
-          <w:lang w:val="en-GB" w:eastAsia="en-GB"/>
-          <w14:ligatures w14:val="none"/>
-        </w:rPr>
-        <w:t xml:space="preserve"> and returns remains one of the most challenging problems for quantitative finance and practitioners alike, and the massive increase in data generated in recent years presents an opportunity to leverage machine learning algorithms </w:t>
+        <w:t xml:space="preserve">Predicting short-term stock price movements is one of the most challenging problems in quantitative finance. The prediction and forecasting of asset prices and returns remains one of the most challenging problems for quantitative finance and practitioners alike, and the massive increase in data generated in recent years presents an opportunity to leverage machine learning algorithms </w:t>
       </w:r>
       <w:sdt>
         <w:sdtPr>
@@ -664,7 +642,6 @@
           <w:id w:val="-1844305189"/>
           <w:citation/>
         </w:sdtPr>
-        <w:sdtEndPr/>
         <w:sdtContent>
           <w:r>
             <w:rPr>
@@ -785,7 +762,6 @@
           <w:id w:val="474502583"/>
           <w:citation/>
         </w:sdtPr>
-        <w:sdtEndPr/>
         <w:sdtContent>
           <w:r>
             <w:rPr>
@@ -881,6 +857,7 @@
           <w:lang w:val="en-GB" w:eastAsia="en-GB"/>
           <w14:ligatures w14:val="none"/>
         </w:rPr>
+        <w:lastRenderedPageBreak/>
         <w:t>The goals of this project are:</w:t>
       </w:r>
     </w:p>
@@ -907,7 +884,6 @@
           <w:lang w:val="en-GB" w:eastAsia="en-GB"/>
           <w14:ligatures w14:val="none"/>
         </w:rPr>
-        <w:lastRenderedPageBreak/>
         <w:t>Develop a machine learning model that forecasts the next-day closing price of MSFT</w:t>
       </w:r>
     </w:p>
@@ -1017,7 +993,7 @@
     </w:p>
     <w:p>
       <w:pPr>
-        <w:pStyle w:val="a7"/>
+        <w:pStyle w:val="ListParagraph"/>
         <w:numPr>
           <w:ilvl w:val="0"/>
           <w:numId w:val="3"/>
@@ -1125,24 +1101,12 @@
           <w:lang w:eastAsia="en-GB"/>
           <w14:ligatures w14:val="none"/>
         </w:rPr>
-        <w:t xml:space="preserve">Discuss any potential data quality issues (e.g., missing values, outliers) and how these will be handled in the pre-processing </w:t>
-      </w:r>
-      <w:proofErr w:type="gramStart"/>
-      <w:r>
-        <w:rPr>
-          <w:rFonts w:eastAsia="Times New Roman" w:cs="Times New Roman"/>
-          <w:color w:val="000000"/>
-          <w:kern w:val="0"/>
-          <w:lang w:eastAsia="en-GB"/>
-          <w14:ligatures w14:val="none"/>
-        </w:rPr>
-        <w:t>phase..</w:t>
-      </w:r>
-      <w:proofErr w:type="gramEnd"/>
+        <w:t>Discuss any potential data quality issues (e.g., missing values, outliers) and how these will be handled in the pre-processing phase..</w:t>
+      </w:r>
     </w:p>
     <w:p>
       <w:pPr>
-        <w:pStyle w:val="a7"/>
+        <w:pStyle w:val="ListParagraph"/>
         <w:numPr>
           <w:ilvl w:val="0"/>
           <w:numId w:val="3"/>
@@ -1440,7 +1404,7 @@
     </w:p>
     <w:p>
       <w:pPr>
-        <w:pStyle w:val="a7"/>
+        <w:pStyle w:val="ListParagraph"/>
         <w:numPr>
           <w:ilvl w:val="0"/>
           <w:numId w:val="3"/>
@@ -1691,7 +1655,14 @@
               <w:rPr>
                 <w:lang w:val="en-GB"/>
               </w:rPr>
-              <w:t>ML modelling (Task 10), app architecture (Task 13), production ready code (Task 11), group proposal (Task 6)</w:t>
+              <w:t xml:space="preserve">ML modelling (Task 10), app architecture (Task 13), production ready </w:t>
+            </w:r>
+            <w:r>
+              <w:rPr>
+                <w:lang w:val="en-GB"/>
+              </w:rPr>
+              <w:lastRenderedPageBreak/>
+              <w:t>code (Task 11), group proposal (Task 6)</w:t>
             </w:r>
           </w:p>
         </w:tc>
@@ -1715,7 +1686,15 @@
               <w:rPr>
                 <w:lang w:val="en-GB"/>
               </w:rPr>
-              <w:t>Group proposal document, model notebook</w:t>
+              <w:lastRenderedPageBreak/>
+              <w:t xml:space="preserve">Group proposal document, </w:t>
+            </w:r>
+            <w:r>
+              <w:rPr>
+                <w:lang w:val="en-GB"/>
+              </w:rPr>
+              <w:lastRenderedPageBreak/>
+              <w:t>model notebook</w:t>
             </w:r>
           </w:p>
         </w:tc>
@@ -1739,6 +1718,7 @@
               <w:rPr>
                 <w:lang w:val="en-GB"/>
               </w:rPr>
+              <w:lastRenderedPageBreak/>
               <w:t>Tuesday: final proposal presentation</w:t>
             </w:r>
           </w:p>
@@ -1765,7 +1745,6 @@
               <w:rPr>
                 <w:lang w:val="en-GB"/>
               </w:rPr>
-              <w:lastRenderedPageBreak/>
               <w:t>Week 5</w:t>
             </w:r>
           </w:p>
@@ -2546,21 +2525,7 @@
               <w:rPr>
                 <w:lang w:val="en-GB"/>
               </w:rPr>
-              <w:t xml:space="preserve">, </w:t>
-            </w:r>
-            <w:proofErr w:type="spellStart"/>
-            <w:r>
-              <w:rPr>
-                <w:lang w:val="en-GB"/>
-              </w:rPr>
-              <w:t>Qusai</w:t>
-            </w:r>
-            <w:proofErr w:type="spellEnd"/>
-            <w:r>
-              <w:rPr>
-                <w:lang w:val="en-GB"/>
-              </w:rPr>
-              <w:t xml:space="preserve"> Al</w:t>
+              <w:t>, Qusai Al</w:t>
             </w:r>
           </w:p>
         </w:tc>
@@ -2636,6 +2601,7 @@
               <w:rPr>
                 <w:lang w:val="en-GB"/>
               </w:rPr>
+              <w:lastRenderedPageBreak/>
               <w:t>Task 10 - ML model development</w:t>
             </w:r>
           </w:p>
@@ -2786,7 +2752,6 @@
               <w:rPr>
                 <w:lang w:val="en-GB"/>
               </w:rPr>
-              <w:lastRenderedPageBreak/>
               <w:t>Task 13 - Application development</w:t>
             </w:r>
           </w:p>
@@ -2889,11 +2854,10 @@
           <w:docPartUnique/>
         </w:docPartObj>
       </w:sdtPr>
-      <w:sdtEndPr/>
       <w:sdtContent>
         <w:p>
           <w:pPr>
-            <w:pStyle w:val="1"/>
+            <w:pStyle w:val="Heading1"/>
             <w:numPr>
               <w:ilvl w:val="0"/>
               <w:numId w:val="3"/>
@@ -2925,11 +2889,10 @@
             <w:id w:val="-573587230"/>
             <w:bibliography/>
           </w:sdtPr>
-          <w:sdtEndPr/>
           <w:sdtContent>
             <w:p>
               <w:pPr>
-                <w:pStyle w:val="af"/>
+                <w:pStyle w:val="Bibliography"/>
                 <w:ind w:left="720" w:hanging="720"/>
                 <w:rPr>
                   <w:noProof/>
@@ -2973,7 +2936,7 @@
             </w:p>
             <w:p>
               <w:pPr>
-                <w:pStyle w:val="af"/>
+                <w:pStyle w:val="Bibliography"/>
                 <w:ind w:left="720" w:hanging="720"/>
                 <w:rPr>
                   <w:noProof/>
@@ -3150,7 +3113,7 @@
       <w:hyperlink r:id="rId9" w:history="1">
         <w:r>
           <w:rPr>
-            <w:rStyle w:val="ad"/>
+            <w:rStyle w:val="Hyperlink"/>
             <w:rFonts w:eastAsia="Times New Roman" w:cs="Times New Roman"/>
             <w:kern w:val="0"/>
             <w:lang w:eastAsia="en-GB"/>
@@ -3201,7 +3164,7 @@
 </file>
 
 <file path=word/numbering.xml><?xml version="1.0" encoding="utf-8"?>
-<w:numbering xmlns:wpc="http://schemas.microsoft.com/office/word/2010/wordprocessingCanvas" xmlns:cx="http://schemas.microsoft.com/office/drawing/2014/chartex" xmlns:cx1="http://schemas.microsoft.com/office/drawing/2015/9/8/chartex" xmlns:cx2="http://schemas.microsoft.com/office/drawing/2015/10/21/chartex" xmlns:cx3="http://schemas.microsoft.com/office/drawing/2016/5/9/chartex" xmlns:cx4="http://schemas.microsoft.com/office/drawing/2016/5/10/chartex" xmlns:cx5="http://schemas.microsoft.com/office/drawing/2016/5/11/chartex" xmlns:cx6="http://schemas.microsoft.com/office/drawing/2016/5/12/chartex" xmlns:cx7="http://schemas.microsoft.com/office/drawing/2016/5/13/chartex" xmlns:cx8="http://schemas.microsoft.com/office/drawing/2016/5/14/chartex" xmlns:mc="http://schemas.openxmlformats.org/markup-compatibility/2006" xmlns:aink="http://schemas.microsoft.com/office/drawing/2016/ink" xmlns:am3d="http://schemas.microsoft.com/office/drawing/2017/model3d" xmlns:o="urn:schemas-microsoft-com:office:office" xmlns:r="http://schemas.openxmlformats.org/officeDocument/2006/relationships" xmlns:m="http://schemas.openxmlformats.org/officeDocument/2006/math" xmlns:v="urn:schemas-microsoft-com:vml" xmlns:wp14="http://schemas.microsoft.com/office/word/2010/wordprocessingDrawing" xmlns:wp="http://schemas.openxmlformats.org/drawingml/2006/wordprocessingDrawing" xmlns:w10="urn:schemas-microsoft-com:office:word" xmlns:w="http://schemas.openxmlformats.org/wordprocessingml/2006/main" xmlns:w14="http://schemas.microsoft.com/office/word/2010/wordml" xmlns:w15="http://schemas.microsoft.com/office/word/2012/wordml" xmlns:w16cex="http://schemas.microsoft.com/office/word/2018/wordml/cex" xmlns:w16cid="http://schemas.microsoft.com/office/word/2016/wordml/cid" xmlns:w16="http://schemas.microsoft.com/office/word/2018/wordml" xmlns:w16sdtdh="http://schemas.microsoft.com/office/word/2020/wordml/sdtdatahash" xmlns:w16se="http://schemas.microsoft.com/office/word/2015/wordml/symex" xmlns:wpg="http://schemas.microsoft.com/office/word/2010/wordprocessingGroup" xmlns:wpi="http://schemas.microsoft.com/office/word/2010/wordprocessingInk" xmlns:wne="http://schemas.microsoft.com/office/word/2006/wordml" xmlns:wps="http://schemas.microsoft.com/office/word/2010/wordprocessingShape" mc:Ignorable="w14 w15 w16se w16cid w16 w16cex w16sdtdh wp14">
+<w:numbering xmlns:wpc="http://schemas.microsoft.com/office/word/2010/wordprocessingCanvas" xmlns:cx="http://schemas.microsoft.com/office/drawing/2014/chartex" xmlns:cx1="http://schemas.microsoft.com/office/drawing/2015/9/8/chartex" xmlns:cx2="http://schemas.microsoft.com/office/drawing/2015/10/21/chartex" xmlns:cx3="http://schemas.microsoft.com/office/drawing/2016/5/9/chartex" xmlns:cx4="http://schemas.microsoft.com/office/drawing/2016/5/10/chartex" xmlns:cx5="http://schemas.microsoft.com/office/drawing/2016/5/11/chartex" xmlns:cx6="http://schemas.microsoft.com/office/drawing/2016/5/12/chartex" xmlns:cx7="http://schemas.microsoft.com/office/drawing/2016/5/13/chartex" xmlns:cx8="http://schemas.microsoft.com/office/drawing/2016/5/14/chartex" xmlns:mc="http://schemas.openxmlformats.org/markup-compatibility/2006" xmlns:aink="http://schemas.microsoft.com/office/drawing/2016/ink" xmlns:am3d="http://schemas.microsoft.com/office/drawing/2017/model3d" xmlns:o="urn:schemas-microsoft-com:office:office" xmlns:oel="http://schemas.microsoft.com/office/2019/extlst" xmlns:r="http://schemas.openxmlformats.org/officeDocument/2006/relationships" xmlns:m="http://schemas.openxmlformats.org/officeDocument/2006/math" xmlns:v="urn:schemas-microsoft-com:vml" xmlns:wp14="http://schemas.microsoft.com/office/word/2010/wordprocessingDrawing" xmlns:wp="http://schemas.openxmlformats.org/drawingml/2006/wordprocessingDrawing" xmlns:w10="urn:schemas-microsoft-com:office:word" xmlns:w="http://schemas.openxmlformats.org/wordprocessingml/2006/main" xmlns:w14="http://schemas.microsoft.com/office/word/2010/wordml" xmlns:w15="http://schemas.microsoft.com/office/word/2012/wordml" xmlns:w16cex="http://schemas.microsoft.com/office/word/2018/wordml/cex" xmlns:w16cid="http://schemas.microsoft.com/office/word/2016/wordml/cid" xmlns:w16="http://schemas.microsoft.com/office/word/2018/wordml" xmlns:w16du="http://schemas.microsoft.com/office/word/2023/wordml/word16du" xmlns:w16sdtdh="http://schemas.microsoft.com/office/word/2020/wordml/sdtdatahash" xmlns:w16sdtfl="http://schemas.microsoft.com/office/word/2024/wordml/sdtformatlock" xmlns:w16se="http://schemas.microsoft.com/office/word/2015/wordml/symex" xmlns:wpg="http://schemas.microsoft.com/office/word/2010/wordprocessingGroup" xmlns:wpi="http://schemas.microsoft.com/office/word/2010/wordprocessingInk" xmlns:wne="http://schemas.microsoft.com/office/word/2006/wordml" xmlns:wps="http://schemas.microsoft.com/office/word/2010/wordprocessingShape" mc:Ignorable="w14 w15 w16se w16cid w16 w16cex w16sdtdh w16sdtfl w16du wp14">
   <w:abstractNum w:abstractNumId="0" w15:restartNumberingAfterBreak="0">
     <w:nsid w:val="33493FC4"/>
     <w:multiLevelType w:val="hybridMultilevel"/>
@@ -3767,26 +3730,26 @@
       </w:pPr>
     </w:lvl>
   </w:abstractNum>
-  <w:num w:numId="1">
+  <w:num w:numId="1" w16cid:durableId="1510018963">
     <w:abstractNumId w:val="0"/>
   </w:num>
-  <w:num w:numId="2">
+  <w:num w:numId="2" w16cid:durableId="406538478">
     <w:abstractNumId w:val="2"/>
   </w:num>
-  <w:num w:numId="3">
+  <w:num w:numId="3" w16cid:durableId="932280022">
     <w:abstractNumId w:val="4"/>
   </w:num>
-  <w:num w:numId="4">
+  <w:num w:numId="4" w16cid:durableId="1021277151">
     <w:abstractNumId w:val="3"/>
   </w:num>
-  <w:num w:numId="5">
+  <w:num w:numId="5" w16cid:durableId="669910041">
     <w:abstractNumId w:val="1"/>
   </w:num>
 </w:numbering>
 </file>
 
 <file path=word/styles.xml><?xml version="1.0" encoding="utf-8"?>
-<w:styles xmlns:mc="http://schemas.openxmlformats.org/markup-compatibility/2006" xmlns:r="http://schemas.openxmlformats.org/officeDocument/2006/relationships" xmlns:w="http://schemas.openxmlformats.org/wordprocessingml/2006/main" xmlns:w14="http://schemas.microsoft.com/office/word/2010/wordml" xmlns:w15="http://schemas.microsoft.com/office/word/2012/wordml" xmlns:w16cex="http://schemas.microsoft.com/office/word/2018/wordml/cex" xmlns:w16cid="http://schemas.microsoft.com/office/word/2016/wordml/cid" xmlns:w16="http://schemas.microsoft.com/office/word/2018/wordml" xmlns:w16sdtdh="http://schemas.microsoft.com/office/word/2020/wordml/sdtdatahash" xmlns:w16se="http://schemas.microsoft.com/office/word/2015/wordml/symex" mc:Ignorable="w14 w15 w16se w16cid w16 w16cex w16sdtdh">
+<w:styles xmlns:mc="http://schemas.openxmlformats.org/markup-compatibility/2006" xmlns:r="http://schemas.openxmlformats.org/officeDocument/2006/relationships" xmlns:w="http://schemas.openxmlformats.org/wordprocessingml/2006/main" xmlns:w14="http://schemas.microsoft.com/office/word/2010/wordml" xmlns:w15="http://schemas.microsoft.com/office/word/2012/wordml" xmlns:w16cex="http://schemas.microsoft.com/office/word/2018/wordml/cex" xmlns:w16cid="http://schemas.microsoft.com/office/word/2016/wordml/cid" xmlns:w16="http://schemas.microsoft.com/office/word/2018/wordml" xmlns:w16du="http://schemas.microsoft.com/office/word/2023/wordml/word16du" xmlns:w16sdtdh="http://schemas.microsoft.com/office/word/2020/wordml/sdtdatahash" xmlns:w16sdtfl="http://schemas.microsoft.com/office/word/2024/wordml/sdtformatlock" xmlns:w16se="http://schemas.microsoft.com/office/word/2015/wordml/symex" mc:Ignorable="w14 w15 w16se w16cid w16 w16cex w16sdtdh w16sdtfl w16du">
   <w:docDefaults>
     <w:rPrDefault>
       <w:rPr>
@@ -4182,15 +4145,15 @@
     <w:lsdException w:name="Unresolved Mention" w:semiHidden="1" w:unhideWhenUsed="1"/>
     <w:lsdException w:name="Smart Link" w:semiHidden="1" w:unhideWhenUsed="1"/>
   </w:latentStyles>
-  <w:style w:type="paragraph" w:default="1" w:styleId="a">
+  <w:style w:type="paragraph" w:default="1" w:styleId="Normal">
     <w:name w:val="Normal"/>
     <w:qFormat/>
   </w:style>
-  <w:style w:type="paragraph" w:styleId="1">
+  <w:style w:type="paragraph" w:styleId="Heading1">
     <w:name w:val="heading 1"/>
-    <w:basedOn w:val="a"/>
-    <w:next w:val="a"/>
-    <w:link w:val="10"/>
+    <w:basedOn w:val="Normal"/>
+    <w:next w:val="Normal"/>
+    <w:link w:val="Heading1Char"/>
     <w:uiPriority w:val="9"/>
     <w:qFormat/>
     <w:rsid w:val="00FD5A73"/>
@@ -4207,11 +4170,11 @@
       <w:szCs w:val="40"/>
     </w:rPr>
   </w:style>
-  <w:style w:type="paragraph" w:styleId="2">
+  <w:style w:type="paragraph" w:styleId="Heading2">
     <w:name w:val="heading 2"/>
-    <w:basedOn w:val="a"/>
-    <w:next w:val="a"/>
-    <w:link w:val="20"/>
+    <w:basedOn w:val="Normal"/>
+    <w:next w:val="Normal"/>
+    <w:link w:val="Heading2Char"/>
     <w:uiPriority w:val="9"/>
     <w:semiHidden/>
     <w:unhideWhenUsed/>
@@ -4230,11 +4193,11 @@
       <w:szCs w:val="32"/>
     </w:rPr>
   </w:style>
-  <w:style w:type="paragraph" w:styleId="3">
+  <w:style w:type="paragraph" w:styleId="Heading3">
     <w:name w:val="heading 3"/>
-    <w:basedOn w:val="a"/>
-    <w:next w:val="a"/>
-    <w:link w:val="30"/>
+    <w:basedOn w:val="Normal"/>
+    <w:next w:val="Normal"/>
+    <w:link w:val="Heading3Char"/>
     <w:uiPriority w:val="9"/>
     <w:semiHidden/>
     <w:unhideWhenUsed/>
@@ -4253,11 +4216,11 @@
       <w:szCs w:val="28"/>
     </w:rPr>
   </w:style>
-  <w:style w:type="paragraph" w:styleId="4">
+  <w:style w:type="paragraph" w:styleId="Heading4">
     <w:name w:val="heading 4"/>
-    <w:basedOn w:val="a"/>
-    <w:next w:val="a"/>
-    <w:link w:val="40"/>
+    <w:basedOn w:val="Normal"/>
+    <w:next w:val="Normal"/>
+    <w:link w:val="Heading4Char"/>
     <w:uiPriority w:val="9"/>
     <w:semiHidden/>
     <w:unhideWhenUsed/>
@@ -4276,11 +4239,11 @@
       <w:color w:val="0F4761" w:themeColor="accent1" w:themeShade="BF"/>
     </w:rPr>
   </w:style>
-  <w:style w:type="paragraph" w:styleId="5">
+  <w:style w:type="paragraph" w:styleId="Heading5">
     <w:name w:val="heading 5"/>
-    <w:basedOn w:val="a"/>
-    <w:next w:val="a"/>
-    <w:link w:val="50"/>
+    <w:basedOn w:val="Normal"/>
+    <w:next w:val="Normal"/>
+    <w:link w:val="Heading5Char"/>
     <w:uiPriority w:val="9"/>
     <w:semiHidden/>
     <w:unhideWhenUsed/>
@@ -4297,11 +4260,11 @@
       <w:color w:val="0F4761" w:themeColor="accent1" w:themeShade="BF"/>
     </w:rPr>
   </w:style>
-  <w:style w:type="paragraph" w:styleId="6">
+  <w:style w:type="paragraph" w:styleId="Heading6">
     <w:name w:val="heading 6"/>
-    <w:basedOn w:val="a"/>
-    <w:next w:val="a"/>
-    <w:link w:val="60"/>
+    <w:basedOn w:val="Normal"/>
+    <w:next w:val="Normal"/>
+    <w:link w:val="Heading6Char"/>
     <w:uiPriority w:val="9"/>
     <w:semiHidden/>
     <w:unhideWhenUsed/>
@@ -4320,11 +4283,11 @@
       <w:color w:val="595959" w:themeColor="text1" w:themeTint="A6"/>
     </w:rPr>
   </w:style>
-  <w:style w:type="paragraph" w:styleId="7">
+  <w:style w:type="paragraph" w:styleId="Heading7">
     <w:name w:val="heading 7"/>
-    <w:basedOn w:val="a"/>
-    <w:next w:val="a"/>
-    <w:link w:val="70"/>
+    <w:basedOn w:val="Normal"/>
+    <w:next w:val="Normal"/>
+    <w:link w:val="Heading7Char"/>
     <w:uiPriority w:val="9"/>
     <w:semiHidden/>
     <w:unhideWhenUsed/>
@@ -4341,11 +4304,11 @@
       <w:color w:val="595959" w:themeColor="text1" w:themeTint="A6"/>
     </w:rPr>
   </w:style>
-  <w:style w:type="paragraph" w:styleId="8">
+  <w:style w:type="paragraph" w:styleId="Heading8">
     <w:name w:val="heading 8"/>
-    <w:basedOn w:val="a"/>
-    <w:next w:val="a"/>
-    <w:link w:val="80"/>
+    <w:basedOn w:val="Normal"/>
+    <w:next w:val="Normal"/>
+    <w:link w:val="Heading8Char"/>
     <w:uiPriority w:val="9"/>
     <w:semiHidden/>
     <w:unhideWhenUsed/>
@@ -4364,11 +4327,11 @@
       <w:color w:val="272727" w:themeColor="text1" w:themeTint="D8"/>
     </w:rPr>
   </w:style>
-  <w:style w:type="paragraph" w:styleId="9">
+  <w:style w:type="paragraph" w:styleId="Heading9">
     <w:name w:val="heading 9"/>
-    <w:basedOn w:val="a"/>
-    <w:next w:val="a"/>
-    <w:link w:val="90"/>
+    <w:basedOn w:val="Normal"/>
+    <w:next w:val="Normal"/>
+    <w:link w:val="Heading9Char"/>
     <w:uiPriority w:val="9"/>
     <w:semiHidden/>
     <w:unhideWhenUsed/>
@@ -4385,13 +4348,13 @@
       <w:color w:val="272727" w:themeColor="text1" w:themeTint="D8"/>
     </w:rPr>
   </w:style>
-  <w:style w:type="character" w:default="1" w:styleId="a0">
+  <w:style w:type="character" w:default="1" w:styleId="DefaultParagraphFont">
     <w:name w:val="Default Paragraph Font"/>
     <w:uiPriority w:val="1"/>
     <w:semiHidden/>
     <w:unhideWhenUsed/>
   </w:style>
-  <w:style w:type="table" w:default="1" w:styleId="a1">
+  <w:style w:type="table" w:default="1" w:styleId="TableNormal">
     <w:name w:val="Normal Table"/>
     <w:uiPriority w:val="99"/>
     <w:semiHidden/>
@@ -4406,16 +4369,16 @@
       </w:tblCellMar>
     </w:tblPr>
   </w:style>
-  <w:style w:type="numbering" w:default="1" w:styleId="a2">
+  <w:style w:type="numbering" w:default="1" w:styleId="NoList">
     <w:name w:val="No List"/>
     <w:uiPriority w:val="99"/>
     <w:semiHidden/>
     <w:unhideWhenUsed/>
   </w:style>
-  <w:style w:type="character" w:customStyle="1" w:styleId="10">
-    <w:name w:val="Заголовок 1 Знак"/>
-    <w:basedOn w:val="a0"/>
-    <w:link w:val="1"/>
+  <w:style w:type="character" w:customStyle="1" w:styleId="Heading1Char">
+    <w:name w:val="Heading 1 Char"/>
+    <w:basedOn w:val="DefaultParagraphFont"/>
+    <w:link w:val="Heading1"/>
     <w:uiPriority w:val="9"/>
     <w:rsid w:val="00FD5A73"/>
     <w:rPr>
@@ -4425,10 +4388,10 @@
       <w:szCs w:val="40"/>
     </w:rPr>
   </w:style>
-  <w:style w:type="character" w:customStyle="1" w:styleId="20">
-    <w:name w:val="Заголовок 2 Знак"/>
-    <w:basedOn w:val="a0"/>
-    <w:link w:val="2"/>
+  <w:style w:type="character" w:customStyle="1" w:styleId="Heading2Char">
+    <w:name w:val="Heading 2 Char"/>
+    <w:basedOn w:val="DefaultParagraphFont"/>
+    <w:link w:val="Heading2"/>
     <w:uiPriority w:val="9"/>
     <w:semiHidden/>
     <w:rsid w:val="00FD5A73"/>
@@ -4439,10 +4402,10 @@
       <w:szCs w:val="32"/>
     </w:rPr>
   </w:style>
-  <w:style w:type="character" w:customStyle="1" w:styleId="30">
-    <w:name w:val="Заголовок 3 Знак"/>
-    <w:basedOn w:val="a0"/>
-    <w:link w:val="3"/>
+  <w:style w:type="character" w:customStyle="1" w:styleId="Heading3Char">
+    <w:name w:val="Heading 3 Char"/>
+    <w:basedOn w:val="DefaultParagraphFont"/>
+    <w:link w:val="Heading3"/>
     <w:uiPriority w:val="9"/>
     <w:semiHidden/>
     <w:rsid w:val="00FD5A73"/>
@@ -4453,10 +4416,10 @@
       <w:szCs w:val="28"/>
     </w:rPr>
   </w:style>
-  <w:style w:type="character" w:customStyle="1" w:styleId="40">
-    <w:name w:val="Заголовок 4 Знак"/>
-    <w:basedOn w:val="a0"/>
-    <w:link w:val="4"/>
+  <w:style w:type="character" w:customStyle="1" w:styleId="Heading4Char">
+    <w:name w:val="Heading 4 Char"/>
+    <w:basedOn w:val="DefaultParagraphFont"/>
+    <w:link w:val="Heading4"/>
     <w:uiPriority w:val="9"/>
     <w:semiHidden/>
     <w:rsid w:val="00FD5A73"/>
@@ -4467,10 +4430,10 @@
       <w:color w:val="0F4761" w:themeColor="accent1" w:themeShade="BF"/>
     </w:rPr>
   </w:style>
-  <w:style w:type="character" w:customStyle="1" w:styleId="50">
-    <w:name w:val="Заголовок 5 Знак"/>
-    <w:basedOn w:val="a0"/>
-    <w:link w:val="5"/>
+  <w:style w:type="character" w:customStyle="1" w:styleId="Heading5Char">
+    <w:name w:val="Heading 5 Char"/>
+    <w:basedOn w:val="DefaultParagraphFont"/>
+    <w:link w:val="Heading5"/>
     <w:uiPriority w:val="9"/>
     <w:semiHidden/>
     <w:rsid w:val="00FD5A73"/>
@@ -4479,10 +4442,10 @@
       <w:color w:val="0F4761" w:themeColor="accent1" w:themeShade="BF"/>
     </w:rPr>
   </w:style>
-  <w:style w:type="character" w:customStyle="1" w:styleId="60">
-    <w:name w:val="Заголовок 6 Знак"/>
-    <w:basedOn w:val="a0"/>
-    <w:link w:val="6"/>
+  <w:style w:type="character" w:customStyle="1" w:styleId="Heading6Char">
+    <w:name w:val="Heading 6 Char"/>
+    <w:basedOn w:val="DefaultParagraphFont"/>
+    <w:link w:val="Heading6"/>
     <w:uiPriority w:val="9"/>
     <w:semiHidden/>
     <w:rsid w:val="00FD5A73"/>
@@ -4493,10 +4456,10 @@
       <w:color w:val="595959" w:themeColor="text1" w:themeTint="A6"/>
     </w:rPr>
   </w:style>
-  <w:style w:type="character" w:customStyle="1" w:styleId="70">
-    <w:name w:val="Заголовок 7 Знак"/>
-    <w:basedOn w:val="a0"/>
-    <w:link w:val="7"/>
+  <w:style w:type="character" w:customStyle="1" w:styleId="Heading7Char">
+    <w:name w:val="Heading 7 Char"/>
+    <w:basedOn w:val="DefaultParagraphFont"/>
+    <w:link w:val="Heading7"/>
     <w:uiPriority w:val="9"/>
     <w:semiHidden/>
     <w:rsid w:val="00FD5A73"/>
@@ -4505,10 +4468,10 @@
       <w:color w:val="595959" w:themeColor="text1" w:themeTint="A6"/>
     </w:rPr>
   </w:style>
-  <w:style w:type="character" w:customStyle="1" w:styleId="80">
-    <w:name w:val="Заголовок 8 Знак"/>
-    <w:basedOn w:val="a0"/>
-    <w:link w:val="8"/>
+  <w:style w:type="character" w:customStyle="1" w:styleId="Heading8Char">
+    <w:name w:val="Heading 8 Char"/>
+    <w:basedOn w:val="DefaultParagraphFont"/>
+    <w:link w:val="Heading8"/>
     <w:uiPriority w:val="9"/>
     <w:semiHidden/>
     <w:rsid w:val="00FD5A73"/>
@@ -4519,10 +4482,10 @@
       <w:color w:val="272727" w:themeColor="text1" w:themeTint="D8"/>
     </w:rPr>
   </w:style>
-  <w:style w:type="character" w:customStyle="1" w:styleId="90">
-    <w:name w:val="Заголовок 9 Знак"/>
-    <w:basedOn w:val="a0"/>
-    <w:link w:val="9"/>
+  <w:style w:type="character" w:customStyle="1" w:styleId="Heading9Char">
+    <w:name w:val="Heading 9 Char"/>
+    <w:basedOn w:val="DefaultParagraphFont"/>
+    <w:link w:val="Heading9"/>
     <w:uiPriority w:val="9"/>
     <w:semiHidden/>
     <w:rsid w:val="00FD5A73"/>
@@ -4531,11 +4494,11 @@
       <w:color w:val="272727" w:themeColor="text1" w:themeTint="D8"/>
     </w:rPr>
   </w:style>
-  <w:style w:type="paragraph" w:styleId="a3">
+  <w:style w:type="paragraph" w:styleId="Title">
     <w:name w:val="Title"/>
-    <w:basedOn w:val="a"/>
-    <w:next w:val="a"/>
-    <w:link w:val="a4"/>
+    <w:basedOn w:val="Normal"/>
+    <w:next w:val="Normal"/>
+    <w:link w:val="TitleChar"/>
     <w:uiPriority w:val="10"/>
     <w:qFormat/>
     <w:rsid w:val="00FD5A73"/>
@@ -4551,10 +4514,10 @@
       <w:szCs w:val="56"/>
     </w:rPr>
   </w:style>
-  <w:style w:type="character" w:customStyle="1" w:styleId="a4">
-    <w:name w:val="Заголовок Знак"/>
-    <w:basedOn w:val="a0"/>
-    <w:link w:val="a3"/>
+  <w:style w:type="character" w:customStyle="1" w:styleId="TitleChar">
+    <w:name w:val="Title Char"/>
+    <w:basedOn w:val="DefaultParagraphFont"/>
+    <w:link w:val="Title"/>
     <w:uiPriority w:val="10"/>
     <w:rsid w:val="00FD5A73"/>
     <w:rPr>
@@ -4565,11 +4528,11 @@
       <w:szCs w:val="56"/>
     </w:rPr>
   </w:style>
-  <w:style w:type="paragraph" w:styleId="a5">
+  <w:style w:type="paragraph" w:styleId="Subtitle">
     <w:name w:val="Subtitle"/>
-    <w:basedOn w:val="a"/>
-    <w:next w:val="a"/>
-    <w:link w:val="a6"/>
+    <w:basedOn w:val="Normal"/>
+    <w:next w:val="Normal"/>
+    <w:link w:val="SubtitleChar"/>
     <w:uiPriority w:val="11"/>
     <w:qFormat/>
     <w:rsid w:val="00FD5A73"/>
@@ -4586,10 +4549,10 @@
       <w:szCs w:val="28"/>
     </w:rPr>
   </w:style>
-  <w:style w:type="character" w:customStyle="1" w:styleId="a6">
-    <w:name w:val="Подзаголовок Знак"/>
-    <w:basedOn w:val="a0"/>
-    <w:link w:val="a5"/>
+  <w:style w:type="character" w:customStyle="1" w:styleId="SubtitleChar">
+    <w:name w:val="Subtitle Char"/>
+    <w:basedOn w:val="DefaultParagraphFont"/>
+    <w:link w:val="Subtitle"/>
     <w:uiPriority w:val="11"/>
     <w:rsid w:val="00FD5A73"/>
     <w:rPr>
@@ -4600,11 +4563,11 @@
       <w:szCs w:val="28"/>
     </w:rPr>
   </w:style>
-  <w:style w:type="paragraph" w:styleId="21">
+  <w:style w:type="paragraph" w:styleId="Quote">
     <w:name w:val="Quote"/>
-    <w:basedOn w:val="a"/>
-    <w:next w:val="a"/>
-    <w:link w:val="22"/>
+    <w:basedOn w:val="Normal"/>
+    <w:next w:val="Normal"/>
+    <w:link w:val="QuoteChar"/>
     <w:uiPriority w:val="29"/>
     <w:qFormat/>
     <w:rsid w:val="00FD5A73"/>
@@ -4618,10 +4581,10 @@
       <w:color w:val="404040" w:themeColor="text1" w:themeTint="BF"/>
     </w:rPr>
   </w:style>
-  <w:style w:type="character" w:customStyle="1" w:styleId="22">
-    <w:name w:val="Цитата 2 Знак"/>
-    <w:basedOn w:val="a0"/>
-    <w:link w:val="21"/>
+  <w:style w:type="character" w:customStyle="1" w:styleId="QuoteChar">
+    <w:name w:val="Quote Char"/>
+    <w:basedOn w:val="DefaultParagraphFont"/>
+    <w:link w:val="Quote"/>
     <w:uiPriority w:val="29"/>
     <w:rsid w:val="00FD5A73"/>
     <w:rPr>
@@ -4630,9 +4593,9 @@
       <w:color w:val="404040" w:themeColor="text1" w:themeTint="BF"/>
     </w:rPr>
   </w:style>
-  <w:style w:type="paragraph" w:styleId="a7">
+  <w:style w:type="paragraph" w:styleId="ListParagraph">
     <w:name w:val="List Paragraph"/>
-    <w:basedOn w:val="a"/>
+    <w:basedOn w:val="Normal"/>
     <w:uiPriority w:val="34"/>
     <w:qFormat/>
     <w:rsid w:val="00FD5A73"/>
@@ -4641,9 +4604,9 @@
       <w:contextualSpacing/>
     </w:pPr>
   </w:style>
-  <w:style w:type="character" w:styleId="a8">
+  <w:style w:type="character" w:styleId="IntenseEmphasis">
     <w:name w:val="Intense Emphasis"/>
-    <w:basedOn w:val="a0"/>
+    <w:basedOn w:val="DefaultParagraphFont"/>
     <w:uiPriority w:val="21"/>
     <w:qFormat/>
     <w:rsid w:val="00FD5A73"/>
@@ -4653,11 +4616,11 @@
       <w:color w:val="0F4761" w:themeColor="accent1" w:themeShade="BF"/>
     </w:rPr>
   </w:style>
-  <w:style w:type="paragraph" w:styleId="a9">
+  <w:style w:type="paragraph" w:styleId="IntenseQuote">
     <w:name w:val="Intense Quote"/>
-    <w:basedOn w:val="a"/>
-    <w:next w:val="a"/>
-    <w:link w:val="aa"/>
+    <w:basedOn w:val="Normal"/>
+    <w:next w:val="Normal"/>
+    <w:link w:val="IntenseQuoteChar"/>
     <w:uiPriority w:val="30"/>
     <w:qFormat/>
     <w:rsid w:val="00FD5A73"/>
@@ -4676,10 +4639,10 @@
       <w:color w:val="0F4761" w:themeColor="accent1" w:themeShade="BF"/>
     </w:rPr>
   </w:style>
-  <w:style w:type="character" w:customStyle="1" w:styleId="aa">
-    <w:name w:val="Выделенная цитата Знак"/>
-    <w:basedOn w:val="a0"/>
-    <w:link w:val="a9"/>
+  <w:style w:type="character" w:customStyle="1" w:styleId="IntenseQuoteChar">
+    <w:name w:val="Intense Quote Char"/>
+    <w:basedOn w:val="DefaultParagraphFont"/>
+    <w:link w:val="IntenseQuote"/>
     <w:uiPriority w:val="30"/>
     <w:rsid w:val="00FD5A73"/>
     <w:rPr>
@@ -4688,9 +4651,9 @@
       <w:color w:val="0F4761" w:themeColor="accent1" w:themeShade="BF"/>
     </w:rPr>
   </w:style>
-  <w:style w:type="character" w:styleId="ab">
+  <w:style w:type="character" w:styleId="IntenseReference">
     <w:name w:val="Intense Reference"/>
-    <w:basedOn w:val="a0"/>
+    <w:basedOn w:val="DefaultParagraphFont"/>
     <w:uiPriority w:val="32"/>
     <w:qFormat/>
     <w:rsid w:val="00FD5A73"/>
@@ -4704,12 +4667,12 @@
   </w:style>
   <w:style w:type="character" w:customStyle="1" w:styleId="apple-converted-space">
     <w:name w:val="apple-converted-space"/>
-    <w:basedOn w:val="a0"/>
+    <w:basedOn w:val="DefaultParagraphFont"/>
     <w:rsid w:val="00FE3B45"/>
   </w:style>
-  <w:style w:type="character" w:styleId="ac">
+  <w:style w:type="character" w:styleId="Strong">
     <w:name w:val="Strong"/>
-    <w:basedOn w:val="a0"/>
+    <w:basedOn w:val="DefaultParagraphFont"/>
     <w:uiPriority w:val="22"/>
     <w:qFormat/>
     <w:rsid w:val="00FE3B45"/>
@@ -4718,9 +4681,9 @@
       <w:bCs/>
     </w:rPr>
   </w:style>
-  <w:style w:type="character" w:styleId="ad">
+  <w:style w:type="character" w:styleId="Hyperlink">
     <w:name w:val="Hyperlink"/>
-    <w:basedOn w:val="a0"/>
+    <w:basedOn w:val="DefaultParagraphFont"/>
     <w:uiPriority w:val="99"/>
     <w:unhideWhenUsed/>
     <w:rsid w:val="00205B2C"/>
@@ -4729,9 +4692,9 @@
       <w:u w:val="single"/>
     </w:rPr>
   </w:style>
-  <w:style w:type="character" w:styleId="ae">
+  <w:style w:type="character" w:styleId="UnresolvedMention">
     <w:name w:val="Unresolved Mention"/>
-    <w:basedOn w:val="a0"/>
+    <w:basedOn w:val="DefaultParagraphFont"/>
     <w:uiPriority w:val="99"/>
     <w:semiHidden/>
     <w:unhideWhenUsed/>
@@ -4741,10 +4704,10 @@
       <w:shd w:val="clear" w:color="auto" w:fill="E1DFDD"/>
     </w:rPr>
   </w:style>
-  <w:style w:type="paragraph" w:styleId="af">
+  <w:style w:type="paragraph" w:styleId="Bibliography">
     <w:name w:val="Bibliography"/>
-    <w:basedOn w:val="a"/>
-    <w:next w:val="a"/>
+    <w:basedOn w:val="Normal"/>
+    <w:next w:val="Normal"/>
     <w:uiPriority w:val="37"/>
     <w:unhideWhenUsed/>
     <w:rsid w:val="002B3BFB"/>
@@ -5048,6 +5011,67 @@
 </file>
 
 <file path=customXml/item1.xml><?xml version="1.0" encoding="utf-8"?>
+<b:Sources xmlns:b="http://schemas.openxmlformats.org/officeDocument/2006/bibliography" xmlns="http://schemas.openxmlformats.org/officeDocument/2006/bibliography" SelectedStyle="\APASixthEditionOfficeOnline.xsl" StyleName="APA" Version="6">
+  <b:Source>
+    <b:Tag>Phi20</b:Tag>
+    <b:SourceType>InternetSite</b:SourceType>
+    <b:Guid>{370EA8DA-55BD-47F2-A140-624A4CA438B9}</b:Guid>
+    <b:Author>
+      <b:Author>
+        <b:NameList>
+          <b:Person>
+            <b:Last>Ndikum</b:Last>
+            <b:First>Philip</b:First>
+          </b:Person>
+        </b:NameList>
+      </b:Author>
+    </b:Author>
+    <b:Title>Machine Learning Algorithms for Financial Asset Price Forecasting</b:Title>
+    <b:InternetSiteTitle>arxiv</b:InternetSiteTitle>
+    <b:Year>2020</b:Year>
+    <b:URL>https://arxiv.org/abs/2004.01504</b:URL>
+    <b:RefOrder>1</b:RefOrder>
+  </b:Source>
+  <b:Source>
+    <b:Tag>Alb23</b:Tag>
+    <b:SourceType>InternetSite</b:SourceType>
+    <b:Guid>{CAC6EDDE-0592-4C82-9906-7CB97CCD92C8}</b:Guid>
+    <b:Author>
+      <b:Author>
+        <b:NameList>
+          <b:Person>
+            <b:Last>Albert Wong</b:Last>
+            <b:First>Steven</b:First>
+            <b:Middle>Whang, Emilio Sagre, Niha Sachin, Gustavo Dutra, Yew-Wei Lim, Gaetan Hains, Youry Khmelevsky, Frank Zhang</b:Middle>
+          </b:Person>
+        </b:NameList>
+      </b:Author>
+    </b:Author>
+    <b:Title>Short-Term Stock Price Forecasting using exogenous variables and Machine Learning Algorithms</b:Title>
+    <b:InternetSiteTitle>Trading and Market Microstructure</b:InternetSiteTitle>
+    <b:Year>2023</b:Year>
+    <b:URL>https://arxiv.org/abs/2309.00618</b:URL>
+    <b:RefOrder>2</b:RefOrder>
+  </b:Source>
+</b:Sources>
+</file>
+
+<file path=customXml/item2.xml><?xml version="1.0" encoding="utf-8"?>
+<p:properties xmlns:p="http://schemas.microsoft.com/office/2006/metadata/properties" xmlns:xsi="http://www.w3.org/2001/XMLSchema-instance" xmlns:pc="http://schemas.microsoft.com/office/infopath/2007/PartnerControls">
+  <documentManagement/>
+</p:properties>
+</file>
+
+<file path=customXml/item3.xml><?xml version="1.0" encoding="utf-8"?>
+<?mso-contentType ?>
+<FormTemplates xmlns="http://schemas.microsoft.com/sharepoint/v3/contenttype/forms">
+  <Display>DocumentLibraryForm</Display>
+  <Edit>DocumentLibraryForm</Edit>
+  <New>DocumentLibraryForm</New>
+</FormTemplates>
+</file>
+
+<file path=customXml/item4.xml><?xml version="1.0" encoding="utf-8"?>
 <ct:contentTypeSchema xmlns:ct="http://schemas.microsoft.com/office/2006/metadata/contentType" xmlns:ma="http://schemas.microsoft.com/office/2006/metadata/properties/metaAttributes" ct:_="" ma:_="" ma:contentTypeName="Document" ma:contentTypeID="0x010100CA0648AB48CC2344B6C41470F89B25D4" ma:contentTypeVersion="4" ma:contentTypeDescription="Create a new document." ma:contentTypeScope="" ma:versionID="a660c338eb59bfff4af50e265a6ab854">
   <xsd:schema xmlns:xsd="http://www.w3.org/2001/XMLSchema" xmlns:xs="http://www.w3.org/2001/XMLSchema" xmlns:p="http://schemas.microsoft.com/office/2006/metadata/properties" xmlns:ns2="f3492271-d953-408b-9284-5d0a710cdb1a" targetNamespace="http://schemas.microsoft.com/office/2006/metadata/properties" ma:root="true" ma:fieldsID="5f8157e55ce76d062aad01a2da979587" ns2:_="">
     <xsd:import namespace="f3492271-d953-408b-9284-5d0a710cdb1a"/>
@@ -5191,68 +5215,32 @@
 </ct:contentTypeSchema>
 </file>
 
-<file path=customXml/item2.xml><?xml version="1.0" encoding="utf-8"?>
-<?mso-contentType ?>
-<FormTemplates xmlns="http://schemas.microsoft.com/sharepoint/v3/contenttype/forms">
-  <Display>DocumentLibraryForm</Display>
-  <Edit>DocumentLibraryForm</Edit>
-  <New>DocumentLibraryForm</New>
-</FormTemplates>
+<file path=customXml/itemProps1.xml><?xml version="1.0" encoding="utf-8"?>
+<ds:datastoreItem xmlns:ds="http://schemas.openxmlformats.org/officeDocument/2006/customXml" ds:itemID="{C8132FE0-DAB3-4537-BC70-39321B387155}">
+  <ds:schemaRefs>
+    <ds:schemaRef ds:uri="http://schemas.openxmlformats.org/officeDocument/2006/bibliography"/>
+  </ds:schemaRefs>
+</ds:datastoreItem>
 </file>
 
-<file path=customXml/item3.xml><?xml version="1.0" encoding="utf-8"?>
-<p:properties xmlns:p="http://schemas.microsoft.com/office/2006/metadata/properties" xmlns:xsi="http://www.w3.org/2001/XMLSchema-instance" xmlns:pc="http://schemas.microsoft.com/office/infopath/2007/PartnerControls">
-  <documentManagement/>
-</p:properties>
+<file path=customXml/itemProps2.xml><?xml version="1.0" encoding="utf-8"?>
+<ds:datastoreItem xmlns:ds="http://schemas.openxmlformats.org/officeDocument/2006/customXml" ds:itemID="{A8834EE7-90FD-4006-BF8D-556140116A2D}">
+  <ds:schemaRefs>
+    <ds:schemaRef ds:uri="http://schemas.microsoft.com/office/2006/metadata/properties"/>
+    <ds:schemaRef ds:uri="http://schemas.microsoft.com/office/infopath/2007/PartnerControls"/>
+  </ds:schemaRefs>
+</ds:datastoreItem>
 </file>
 
-<file path=customXml/item4.xml><?xml version="1.0" encoding="utf-8"?>
-<b:Sources xmlns:b="http://schemas.openxmlformats.org/officeDocument/2006/bibliography" xmlns="http://schemas.openxmlformats.org/officeDocument/2006/bibliography" SelectedStyle="\APASixthEditionOfficeOnline.xsl" StyleName="APA" Version="6">
-  <b:Source>
-    <b:Tag>Phi20</b:Tag>
-    <b:SourceType>InternetSite</b:SourceType>
-    <b:Guid>{370EA8DA-55BD-47F2-A140-624A4CA438B9}</b:Guid>
-    <b:Author>
-      <b:Author>
-        <b:NameList>
-          <b:Person>
-            <b:Last>Ndikum</b:Last>
-            <b:First>Philip</b:First>
-          </b:Person>
-        </b:NameList>
-      </b:Author>
-    </b:Author>
-    <b:Title>Machine Learning Algorithms for Financial Asset Price Forecasting</b:Title>
-    <b:InternetSiteTitle>arxiv</b:InternetSiteTitle>
-    <b:Year>2020</b:Year>
-    <b:URL>https://arxiv.org/abs/2004.01504</b:URL>
-    <b:RefOrder>1</b:RefOrder>
-  </b:Source>
-  <b:Source>
-    <b:Tag>Alb23</b:Tag>
-    <b:SourceType>InternetSite</b:SourceType>
-    <b:Guid>{CAC6EDDE-0592-4C82-9906-7CB97CCD92C8}</b:Guid>
-    <b:Author>
-      <b:Author>
-        <b:NameList>
-          <b:Person>
-            <b:Last>Albert Wong</b:Last>
-            <b:First>Steven</b:First>
-            <b:Middle>Whang, Emilio Sagre, Niha Sachin, Gustavo Dutra, Yew-Wei Lim, Gaetan Hains, Youry Khmelevsky, Frank Zhang</b:Middle>
-          </b:Person>
-        </b:NameList>
-      </b:Author>
-    </b:Author>
-    <b:Title>Short-Term Stock Price Forecasting using exogenous variables and Machine Learning Algorithms</b:Title>
-    <b:InternetSiteTitle>Trading and Market Microstructure</b:InternetSiteTitle>
-    <b:Year>2023</b:Year>
-    <b:URL>https://arxiv.org/abs/2309.00618</b:URL>
-    <b:RefOrder>2</b:RefOrder>
-  </b:Source>
-</b:Sources>
+<file path=customXml/itemProps3.xml><?xml version="1.0" encoding="utf-8"?>
+<ds:datastoreItem xmlns:ds="http://schemas.openxmlformats.org/officeDocument/2006/customXml" ds:itemID="{09ECDD89-9376-4D0D-8E13-549D769B12AB}">
+  <ds:schemaRefs>
+    <ds:schemaRef ds:uri="http://schemas.microsoft.com/sharepoint/v3/contenttype/forms"/>
+  </ds:schemaRefs>
+</ds:datastoreItem>
 </file>
 
-<file path=customXml/itemProps1.xml><?xml version="1.0" encoding="utf-8"?>
+<file path=customXml/itemProps4.xml><?xml version="1.0" encoding="utf-8"?>
 <ds:datastoreItem xmlns:ds="http://schemas.openxmlformats.org/officeDocument/2006/customXml" ds:itemID="{0646EBB2-5A1D-42FE-B060-FCDBA64E390D}">
   <ds:schemaRefs>
     <ds:schemaRef ds:uri="http://schemas.microsoft.com/office/2006/metadata/contentType"/>
@@ -5268,29 +5256,4 @@
     <ds:schemaRef ds:uri="http://schemas.microsoft.com/internal/obd"/>
   </ds:schemaRefs>
 </ds:datastoreItem>
-</file>
-
-<file path=customXml/itemProps2.xml><?xml version="1.0" encoding="utf-8"?>
-<ds:datastoreItem xmlns:ds="http://schemas.openxmlformats.org/officeDocument/2006/customXml" ds:itemID="{09ECDD89-9376-4D0D-8E13-549D769B12AB}">
-  <ds:schemaRefs>
-    <ds:schemaRef ds:uri="http://schemas.microsoft.com/sharepoint/v3/contenttype/forms"/>
-  </ds:schemaRefs>
-</ds:datastoreItem>
-</file>
-
-<file path=customXml/itemProps3.xml><?xml version="1.0" encoding="utf-8"?>
-<ds:datastoreItem xmlns:ds="http://schemas.openxmlformats.org/officeDocument/2006/customXml" ds:itemID="{A8834EE7-90FD-4006-BF8D-556140116A2D}">
-  <ds:schemaRefs>
-    <ds:schemaRef ds:uri="http://schemas.microsoft.com/office/2006/metadata/properties"/>
-    <ds:schemaRef ds:uri="http://schemas.microsoft.com/office/infopath/2007/PartnerControls"/>
-  </ds:schemaRefs>
-</ds:datastoreItem>
-</file>
-
-<file path=customXml/itemProps4.xml><?xml version="1.0" encoding="utf-8"?>
-<ds:datastoreItem xmlns:ds="http://schemas.openxmlformats.org/officeDocument/2006/customXml" ds:itemID="{C8132FE0-DAB3-4537-BC70-39321B387155}">
-  <ds:schemaRefs>
-    <ds:schemaRef ds:uri="http://schemas.openxmlformats.org/officeDocument/2006/bibliography"/>
-  </ds:schemaRefs>
-</ds:datastoreItem>
 </file>
</xml_diff>

<commit_message>
Filled in data and methodology in group proposal
</commit_message>
<xml_diff>
--- a/datalabtasks_deliverables/Task 6 Group Project Proposals/ProjectProposal_Template.docx
+++ b/datalabtasks_deliverables/Task 6 Group Project Proposals/ProjectProposal_Template.docx
@@ -262,7 +262,7 @@
     </w:p>
     <w:p>
       <w:pPr>
-        <w:pStyle w:val="Listaszerbekezds"/>
+        <w:pStyle w:val="ListParagraph"/>
         <w:numPr>
           <w:ilvl w:val="0"/>
           <w:numId w:val="3"/>
@@ -396,21 +396,21 @@
       </w:r>
       <w:r>
         <w:rPr>
-          <w:rStyle w:val="Kiemels2"/>
+          <w:rStyle w:val="Strong"/>
           <w:rFonts w:cs="Arial"/>
         </w:rPr>
         <w:t>exogenous</w:t>
       </w:r>
       <w:r>
         <w:rPr>
-          <w:rStyle w:val="Kiemels2"/>
+          <w:rStyle w:val="Strong"/>
           <w:rFonts w:cs="Arial"/>
         </w:rPr>
         <w:t xml:space="preserve"> </w:t>
       </w:r>
       <w:r>
         <w:rPr>
-          <w:rStyle w:val="Kiemels2"/>
+          <w:rStyle w:val="Strong"/>
           <w:rFonts w:cs="Arial"/>
           <w:b w:val="0"/>
           <w:bCs w:val="0"/>
@@ -428,29 +428,7 @@
           <w:lang w:eastAsia="en-GB"/>
           <w14:ligatures w14:val="none"/>
         </w:rPr>
-        <w:t xml:space="preserve">combined with MSFT </w:t>
-      </w:r>
-      <w:proofErr w:type="gramStart"/>
-      <w:r>
-        <w:rPr>
-          <w:rFonts w:eastAsia="Times New Roman" w:cs="Times New Roman"/>
-          <w:color w:val="000000"/>
-          <w:kern w:val="0"/>
-          <w:lang w:eastAsia="en-GB"/>
-          <w14:ligatures w14:val="none"/>
-        </w:rPr>
-        <w:t>stock data</w:t>
-      </w:r>
-      <w:proofErr w:type="gramEnd"/>
-      <w:r>
-        <w:rPr>
-          <w:rFonts w:eastAsia="Times New Roman" w:cs="Times New Roman"/>
-          <w:color w:val="000000"/>
-          <w:kern w:val="0"/>
-          <w:lang w:eastAsia="en-GB"/>
-          <w14:ligatures w14:val="none"/>
-        </w:rPr>
-        <w:t xml:space="preserve"> via statistical modeling and machine learning. The stakeholders are team members, academic supervisors, and retails investors, the last being end user and main stakeholder. This is essential to develop such a tool, as non-professional investors would significantly benefit from it.</w:t>
+        <w:t>combined with MSFT stock data via statistical modeling and machine learning. The stakeholders are team members, academic supervisors, and retails investors, the last being end user and main stakeholder. This is essential to develop such a tool, as non-professional investors would significantly benefit from it.</w:t>
       </w:r>
     </w:p>
     <w:p>
@@ -494,29 +472,7 @@
           <w:lang w:eastAsia="en-GB"/>
           <w14:ligatures w14:val="none"/>
         </w:rPr>
-        <w:t xml:space="preserve"> across Internet, and more importantly, such tools already exist. They benefit from applying </w:t>
-      </w:r>
-      <w:proofErr w:type="gramStart"/>
-      <w:r>
-        <w:rPr>
-          <w:rFonts w:eastAsia="Times New Roman" w:cs="Times New Roman"/>
-          <w:color w:val="000000"/>
-          <w:kern w:val="0"/>
-          <w:lang w:eastAsia="en-GB"/>
-          <w14:ligatures w14:val="none"/>
-        </w:rPr>
-        <w:t>machine learning</w:t>
-      </w:r>
-      <w:proofErr w:type="gramEnd"/>
-      <w:r>
-        <w:rPr>
-          <w:rFonts w:eastAsia="Times New Roman" w:cs="Times New Roman"/>
-          <w:color w:val="000000"/>
-          <w:kern w:val="0"/>
-          <w:lang w:eastAsia="en-GB"/>
-          <w14:ligatures w14:val="none"/>
-        </w:rPr>
-        <w:t xml:space="preserve"> to spot </w:t>
+        <w:t xml:space="preserve"> across Internet, and more importantly, such tools already exist. They benefit from applying machine learning to spot </w:t>
       </w:r>
       <w:r>
         <w:rPr>
@@ -629,7 +585,7 @@
     </w:p>
     <w:p>
       <w:pPr>
-        <w:pStyle w:val="Listaszerbekezds"/>
+        <w:pStyle w:val="ListParagraph"/>
         <w:numPr>
           <w:ilvl w:val="0"/>
           <w:numId w:val="3"/>
@@ -672,29 +628,7 @@
           <w:lang w:val="en-GB" w:eastAsia="en-GB"/>
           <w14:ligatures w14:val="none"/>
         </w:rPr>
-        <w:t xml:space="preserve">Predicting short-term stock price movements is one of the most challenging problems in quantitative finance. The prediction and forecasting of asset prices and </w:t>
-      </w:r>
-      <w:proofErr w:type="gramStart"/>
-      <w:r>
-        <w:rPr>
-          <w:rFonts w:eastAsia="Times New Roman" w:cs="Times New Roman"/>
-          <w:color w:val="000000"/>
-          <w:kern w:val="0"/>
-          <w:lang w:val="en-GB" w:eastAsia="en-GB"/>
-          <w14:ligatures w14:val="none"/>
-        </w:rPr>
-        <w:t>returns</w:t>
-      </w:r>
-      <w:proofErr w:type="gramEnd"/>
-      <w:r>
-        <w:rPr>
-          <w:rFonts w:eastAsia="Times New Roman" w:cs="Times New Roman"/>
-          <w:color w:val="000000"/>
-          <w:kern w:val="0"/>
-          <w:lang w:val="en-GB" w:eastAsia="en-GB"/>
-          <w14:ligatures w14:val="none"/>
-        </w:rPr>
-        <w:t xml:space="preserve"> remains one of the most challenging problems for quantitative finance and practitioners alike, and the massive increase in data generated in recent years presents an opportunity to leverage machine learning algorithms </w:t>
+        <w:t xml:space="preserve">Predicting short-term stock price movements is one of the most challenging problems in quantitative finance. The prediction and forecasting of asset prices and returns remains one of the most challenging problems for quantitative finance and practitioners alike, and the massive increase in data generated in recent years presents an opportunity to leverage machine learning algorithms </w:t>
       </w:r>
       <w:sdt>
         <w:sdtPr>
@@ -1059,7 +993,7 @@
     </w:p>
     <w:p>
       <w:pPr>
-        <w:pStyle w:val="Listaszerbekezds"/>
+        <w:pStyle w:val="ListParagraph"/>
         <w:numPr>
           <w:ilvl w:val="0"/>
           <w:numId w:val="3"/>
@@ -1103,61 +1037,80 @@
           <w:lang w:eastAsia="en-GB"/>
           <w14:ligatures w14:val="none"/>
         </w:rPr>
-        <w:t>This project forecasts the next-day closing price of Microsoft Corporation (MSFT) stock using a multi-source approach that combines stock-specific trading data with market indices, macroeconomic indicators, commodity prices, and exchange rates. Equity prices are shaped by sector-wide trends, monetary policy, currency movements, and commodity markets, so incorporating these external signals should improve predictive power over a univariate baseline.</w:t>
+        <w:t>This section should outline the </w:t>
+      </w:r>
+      <w:r>
+        <w:rPr>
+          <w:rFonts w:eastAsia="Times New Roman" w:cs="Times New Roman"/>
+          <w:b/>
+          <w:bCs/>
+          <w:color w:val="000000"/>
+          <w:kern w:val="0"/>
+          <w:lang w:eastAsia="en-GB"/>
+          <w14:ligatures w14:val="none"/>
+        </w:rPr>
+        <w:t>datasets</w:t>
+      </w:r>
+      <w:r>
+        <w:rPr>
+          <w:rFonts w:eastAsia="Times New Roman" w:cs="Times New Roman"/>
+          <w:color w:val="000000"/>
+          <w:kern w:val="0"/>
+          <w:lang w:eastAsia="en-GB"/>
+          <w14:ligatures w14:val="none"/>
+        </w:rPr>
+        <w:t> you plan to use for the project. Begin by describing the </w:t>
+      </w:r>
+      <w:r>
+        <w:rPr>
+          <w:rFonts w:eastAsia="Times New Roman" w:cs="Times New Roman"/>
+          <w:b/>
+          <w:bCs/>
+          <w:color w:val="000000"/>
+          <w:kern w:val="0"/>
+          <w:lang w:eastAsia="en-GB"/>
+          <w14:ligatures w14:val="none"/>
+        </w:rPr>
+        <w:t>data sources</w:t>
+      </w:r>
+      <w:r>
+        <w:rPr>
+          <w:rFonts w:eastAsia="Times New Roman" w:cs="Times New Roman"/>
+          <w:color w:val="000000"/>
+          <w:kern w:val="0"/>
+          <w:lang w:eastAsia="en-GB"/>
+          <w14:ligatures w14:val="none"/>
+        </w:rPr>
+        <w:t>—include relevant details such as where the data is coming from, how it’s structured, and its key attributes or features.</w:t>
+      </w:r>
+      <w:r>
+        <w:rPr>
+          <w:rFonts w:eastAsia="Times New Roman" w:cs="Times New Roman"/>
+          <w:color w:val="000000"/>
+          <w:kern w:val="0"/>
+          <w:lang w:eastAsia="en-GB"/>
+          <w14:ligatures w14:val="none"/>
+        </w:rPr>
+        <w:t xml:space="preserve"> </w:t>
+      </w:r>
+      <w:r>
+        <w:rPr>
+          <w:rFonts w:eastAsia="Times New Roman" w:cs="Times New Roman"/>
+          <w:color w:val="000000"/>
+          <w:kern w:val="0"/>
+          <w:lang w:eastAsia="en-GB"/>
+          <w14:ligatures w14:val="none"/>
+        </w:rPr>
+        <w:t>Discuss any potential data quality issues (e.g., missing values, outliers) and how these will be handled in the pre-processing phase..</w:t>
       </w:r>
     </w:p>
     <w:p>
       <w:pPr>
-        <w:spacing w:before="100" w:beforeAutospacing="1" w:after="100" w:afterAutospacing="1" w:line="240" w:lineRule="auto"/>
-        <w:rPr>
-          <w:rFonts w:eastAsia="Times New Roman" w:cs="Times New Roman"/>
-          <w:color w:val="000000"/>
-          <w:kern w:val="0"/>
-          <w:lang w:eastAsia="en-GB"/>
-          <w14:ligatures w14:val="none"/>
-        </w:rPr>
-      </w:pPr>
-      <w:r>
-        <w:rPr>
-          <w:rFonts w:eastAsia="Times New Roman" w:cs="Times New Roman"/>
-          <w:color w:val="000000"/>
-          <w:kern w:val="0"/>
-          <w:lang w:eastAsia="en-GB"/>
-          <w14:ligatures w14:val="none"/>
-        </w:rPr>
-        <w:t>The project uses eight datasets provided within the block's data package, all spanning approximately February 2015 through February 2025. The primary dataset is MSFT daily stock data (2,515 records) with Open, High, Low, Close, Volume, and Transactions — Close being the target variable. Supplementary daily datasets include the Nasdaq Composite, Dow Jones, and S&amp;P 500 indices for broad market sentiment; crude oil (WTI) and gold (XAU/USD) for commodity dynamics; and USD exchange rates against ten major currencies for international exposure. A macroeconomic indicators dataset provides twelve variables (GDP Growth, Unemployment, CPI, Fed Funds Rate, VIX, Treasury Yields, among others) at mixed frequencies, resulting in substantial null values that will require forward-filling during preprocessing.</w:t>
-      </w:r>
-    </w:p>
-    <w:p>
-      <w:pPr>
-        <w:spacing w:before="100" w:beforeAutospacing="1" w:after="100" w:afterAutospacing="1" w:line="240" w:lineRule="auto"/>
-        <w:rPr>
-          <w:rFonts w:eastAsia="Times New Roman" w:cs="Times New Roman"/>
-          <w:color w:val="000000"/>
-          <w:kern w:val="0"/>
-          <w:lang w:eastAsia="en-GB"/>
-          <w14:ligatures w14:val="none"/>
-        </w:rPr>
-      </w:pPr>
-      <w:r>
-        <w:rPr>
-          <w:rFonts w:eastAsia="Times New Roman" w:cs="Times New Roman"/>
-          <w:color w:val="000000"/>
-          <w:kern w:val="0"/>
-          <w:lang w:eastAsia="en-GB"/>
-          <w14:ligatures w14:val="none"/>
-        </w:rPr>
-        <w:t>The daily datasets contain no missing values and no unexpected temporal gaps — all gaps correspond to standard weekends and holidays. Eight MSFT trading days show extreme returns exceeding 8%, mostly during the March 2020 COVID-19 onset. These are genuine market events and will be retained, with robust scaling used to limit their influence during training. No duplicate dates or data inconsistencies were found.</w:t>
-      </w:r>
-    </w:p>
-    <w:p>
-      <w:pPr>
-        <w:pStyle w:val="Listaszerbekezds"/>
+        <w:pStyle w:val="ListParagraph"/>
         <w:numPr>
           <w:ilvl w:val="0"/>
           <w:numId w:val="3"/>
         </w:numPr>
-        <w:spacing w:before="100" w:beforeAutospacing="1" w:after="100" w:afterAutospacing="1" w:line="240" w:lineRule="auto"/>
         <w:rPr>
           <w:b/>
           <w:bCs/>
@@ -1191,6 +1144,16 @@
       <w:r>
         <w:rPr>
           <w:rFonts w:eastAsia="Times New Roman" w:cs="Times New Roman"/>
+          <w:color w:val="000000"/>
+          <w:kern w:val="0"/>
+          <w:lang w:eastAsia="en-GB"/>
+          <w14:ligatures w14:val="none"/>
+        </w:rPr>
+        <w:t>In this section, describe the </w:t>
+      </w:r>
+      <w:r>
+        <w:rPr>
+          <w:rFonts w:eastAsia="Times New Roman" w:cs="Times New Roman"/>
           <w:b/>
           <w:bCs/>
           <w:color w:val="000000"/>
@@ -1198,11 +1161,25 @@
           <w:lang w:eastAsia="en-GB"/>
           <w14:ligatures w14:val="none"/>
         </w:rPr>
-        <w:t>2.1 Data Collection and Preprocessing</w:t>
+        <w:t>approach</w:t>
+      </w:r>
+      <w:r>
+        <w:rPr>
+          <w:rFonts w:eastAsia="Times New Roman" w:cs="Times New Roman"/>
+          <w:color w:val="000000"/>
+          <w:kern w:val="0"/>
+          <w:lang w:eastAsia="en-GB"/>
+          <w14:ligatures w14:val="none"/>
+        </w:rPr>
+        <w:t> your team will take to solve the problem using machine learning techniques. Break it down into clearly defined steps:</w:t>
       </w:r>
     </w:p>
     <w:p>
       <w:pPr>
+        <w:numPr>
+          <w:ilvl w:val="0"/>
+          <w:numId w:val="4"/>
+        </w:numPr>
         <w:spacing w:before="100" w:beforeAutospacing="1" w:after="100" w:afterAutospacing="1" w:line="240" w:lineRule="auto"/>
         <w:rPr>
           <w:rFonts w:eastAsia="Times New Roman" w:cs="Times New Roman"/>
@@ -1215,38 +1192,32 @@
       <w:r>
         <w:rPr>
           <w:rFonts w:eastAsia="Times New Roman" w:cs="Times New Roman"/>
-          <w:color w:val="000000"/>
-          <w:kern w:val="0"/>
-          <w:lang w:eastAsia="en-GB"/>
-          <w14:ligatures w14:val="none"/>
-        </w:rPr>
-        <w:t xml:space="preserve">All CSV files will be loaded into a PostgreSQL database. The MSFT date range serves as the reference index to which all other datasets are aligned. Macroeconomic indicators are </w:t>
-      </w:r>
-      <w:proofErr w:type="gramStart"/>
-      <w:r>
-        <w:rPr>
-          <w:rFonts w:eastAsia="Times New Roman" w:cs="Times New Roman"/>
-          <w:color w:val="000000"/>
-          <w:kern w:val="0"/>
-          <w:lang w:eastAsia="en-GB"/>
-          <w14:ligatures w14:val="none"/>
-        </w:rPr>
-        <w:t>forward-filled</w:t>
-      </w:r>
-      <w:proofErr w:type="gramEnd"/>
-      <w:r>
-        <w:rPr>
-          <w:rFonts w:eastAsia="Times New Roman" w:cs="Times New Roman"/>
-          <w:color w:val="000000"/>
-          <w:kern w:val="0"/>
-          <w:lang w:eastAsia="en-GB"/>
-          <w14:ligatures w14:val="none"/>
-        </w:rPr>
-        <w:t xml:space="preserve"> to daily granularity so the model only accesses information available at prediction time, avoiding lookahead bias.</w:t>
+          <w:b/>
+          <w:bCs/>
+          <w:color w:val="000000"/>
+          <w:kern w:val="0"/>
+          <w:lang w:eastAsia="en-GB"/>
+          <w14:ligatures w14:val="none"/>
+        </w:rPr>
+        <w:t>Data Collection &amp; Pre-processing</w:t>
+      </w:r>
+      <w:r>
+        <w:rPr>
+          <w:rFonts w:eastAsia="Times New Roman" w:cs="Times New Roman"/>
+          <w:color w:val="000000"/>
+          <w:kern w:val="0"/>
+          <w:lang w:eastAsia="en-GB"/>
+          <w14:ligatures w14:val="none"/>
+        </w:rPr>
+        <w:t>: Explain how you will gather and clean the data, handle missing values, and address any inconsistencies or biases.</w:t>
       </w:r>
     </w:p>
     <w:p>
       <w:pPr>
+        <w:numPr>
+          <w:ilvl w:val="0"/>
+          <w:numId w:val="4"/>
+        </w:numPr>
         <w:spacing w:before="100" w:beforeAutospacing="1" w:after="100" w:afterAutospacing="1" w:line="240" w:lineRule="auto"/>
         <w:rPr>
           <w:rFonts w:eastAsia="Times New Roman" w:cs="Times New Roman"/>
@@ -1259,17 +1230,98 @@
       <w:r>
         <w:rPr>
           <w:rFonts w:eastAsia="Times New Roman" w:cs="Times New Roman"/>
-          <w:color w:val="000000"/>
-          <w:kern w:val="0"/>
-          <w:lang w:eastAsia="en-GB"/>
-          <w14:ligatures w14:val="none"/>
-        </w:rPr>
-        <w:lastRenderedPageBreak/>
-        <w:t>Engineered features will span five categories: lag features (1- to 21-day returns), rolling statistics (moving averages, volatility), technical indicators (RSI, MACD, Bollinger Bands, ATR), cross-asset features (index returns, commodity and currency changes, macro levels), and calendar features (day of week, month, quarter). Numerical features will be standardized using a robust scaler to limit outlier influence; categorical features will be one-hot encoded.</w:t>
+          <w:b/>
+          <w:bCs/>
+          <w:color w:val="000000"/>
+          <w:kern w:val="0"/>
+          <w:lang w:eastAsia="en-GB"/>
+          <w14:ligatures w14:val="none"/>
+        </w:rPr>
+        <w:t>Model Selection &amp; Training</w:t>
+      </w:r>
+      <w:r>
+        <w:rPr>
+          <w:rFonts w:eastAsia="Times New Roman" w:cs="Times New Roman"/>
+          <w:color w:val="000000"/>
+          <w:kern w:val="0"/>
+          <w:lang w:eastAsia="en-GB"/>
+          <w14:ligatures w14:val="none"/>
+        </w:rPr>
+        <w:t>: Identify the </w:t>
+      </w:r>
+      <w:r>
+        <w:rPr>
+          <w:rFonts w:eastAsia="Times New Roman" w:cs="Times New Roman"/>
+          <w:b/>
+          <w:bCs/>
+          <w:color w:val="000000"/>
+          <w:kern w:val="0"/>
+          <w:lang w:eastAsia="en-GB"/>
+          <w14:ligatures w14:val="none"/>
+        </w:rPr>
+        <w:t>machine learning models</w:t>
+      </w:r>
+      <w:r>
+        <w:rPr>
+          <w:rFonts w:eastAsia="Times New Roman" w:cs="Times New Roman"/>
+          <w:color w:val="000000"/>
+          <w:kern w:val="0"/>
+          <w:lang w:eastAsia="en-GB"/>
+          <w14:ligatures w14:val="none"/>
+        </w:rPr>
+        <w:t> (e.g., regression, classification, neural networks) you plan to use and justify why these models are well-suited for your problem. Explain how you will split the data for </w:t>
+      </w:r>
+      <w:r>
+        <w:rPr>
+          <w:rFonts w:eastAsia="Times New Roman" w:cs="Times New Roman"/>
+          <w:b/>
+          <w:bCs/>
+          <w:color w:val="000000"/>
+          <w:kern w:val="0"/>
+          <w:lang w:eastAsia="en-GB"/>
+          <w14:ligatures w14:val="none"/>
+        </w:rPr>
+        <w:t>training</w:t>
+      </w:r>
+      <w:r>
+        <w:rPr>
+          <w:rFonts w:eastAsia="Times New Roman" w:cs="Times New Roman"/>
+          <w:color w:val="000000"/>
+          <w:kern w:val="0"/>
+          <w:lang w:eastAsia="en-GB"/>
+          <w14:ligatures w14:val="none"/>
+        </w:rPr>
+        <w:t> and </w:t>
+      </w:r>
+      <w:r>
+        <w:rPr>
+          <w:rFonts w:eastAsia="Times New Roman" w:cs="Times New Roman"/>
+          <w:b/>
+          <w:bCs/>
+          <w:color w:val="000000"/>
+          <w:kern w:val="0"/>
+          <w:lang w:eastAsia="en-GB"/>
+          <w14:ligatures w14:val="none"/>
+        </w:rPr>
+        <w:t>validation</w:t>
+      </w:r>
+      <w:r>
+        <w:rPr>
+          <w:rFonts w:eastAsia="Times New Roman" w:cs="Times New Roman"/>
+          <w:color w:val="000000"/>
+          <w:kern w:val="0"/>
+          <w:lang w:eastAsia="en-GB"/>
+          <w14:ligatures w14:val="none"/>
+        </w:rPr>
+        <w:t>.</w:t>
       </w:r>
     </w:p>
     <w:p>
       <w:pPr>
+        <w:numPr>
+          <w:ilvl w:val="0"/>
+          <w:numId w:val="4"/>
+        </w:numPr>
         <w:spacing w:before="100" w:beforeAutospacing="1" w:after="100" w:afterAutospacing="1" w:line="240" w:lineRule="auto"/>
         <w:rPr>
           <w:rFonts w:eastAsia="Times New Roman" w:cs="Times New Roman"/>
@@ -1289,11 +1341,25 @@
           <w:lang w:eastAsia="en-GB"/>
           <w14:ligatures w14:val="none"/>
         </w:rPr>
-        <w:t>2.2 Model Selection and Training</w:t>
+        <w:t>Evaluation Metrics</w:t>
+      </w:r>
+      <w:r>
+        <w:rPr>
+          <w:rFonts w:eastAsia="Times New Roman" w:cs="Times New Roman"/>
+          <w:color w:val="000000"/>
+          <w:kern w:val="0"/>
+          <w:lang w:eastAsia="en-GB"/>
+          <w14:ligatures w14:val="none"/>
+        </w:rPr>
+        <w:t>: Discuss how you will assess the model's performance. Which evaluation metrics (e.g., accuracy, precision, recall, F1 score) will be used to validate your results?</w:t>
       </w:r>
     </w:p>
     <w:p>
       <w:pPr>
+        <w:numPr>
+          <w:ilvl w:val="0"/>
+          <w:numId w:val="4"/>
+        </w:numPr>
         <w:spacing w:before="100" w:beforeAutospacing="1" w:after="100" w:afterAutospacing="1" w:line="240" w:lineRule="auto"/>
         <w:rPr>
           <w:rFonts w:eastAsia="Times New Roman" w:cs="Times New Roman"/>
@@ -1306,302 +1372,43 @@
       <w:r>
         <w:rPr>
           <w:rFonts w:eastAsia="Times New Roman" w:cs="Times New Roman"/>
-          <w:color w:val="000000"/>
-          <w:kern w:val="0"/>
-          <w:lang w:eastAsia="en-GB"/>
-          <w14:ligatures w14:val="none"/>
-        </w:rPr>
-        <w:t xml:space="preserve">The task is a supervised regression problem: predict day </w:t>
-      </w:r>
-      <w:r>
-        <w:rPr>
-          <w:rFonts w:eastAsia="Times New Roman" w:cs="Times New Roman"/>
-          <w:i/>
-          <w:iCs/>
-          <w:color w:val="000000"/>
-          <w:kern w:val="0"/>
-          <w:lang w:eastAsia="en-GB"/>
-          <w14:ligatures w14:val="none"/>
-        </w:rPr>
-        <w:t>t+1</w:t>
-      </w:r>
-      <w:r>
-        <w:rPr>
-          <w:rFonts w:eastAsia="Times New Roman" w:cs="Times New Roman"/>
-          <w:color w:val="000000"/>
-          <w:kern w:val="0"/>
-          <w:lang w:eastAsia="en-GB"/>
-          <w14:ligatures w14:val="none"/>
-        </w:rPr>
-        <w:t xml:space="preserve"> closing price from features available up to day </w:t>
-      </w:r>
-      <w:r>
-        <w:rPr>
-          <w:rFonts w:eastAsia="Times New Roman" w:cs="Times New Roman"/>
-          <w:i/>
-          <w:iCs/>
-          <w:color w:val="000000"/>
-          <w:kern w:val="0"/>
-          <w:lang w:eastAsia="en-GB"/>
-          <w14:ligatures w14:val="none"/>
-        </w:rPr>
-        <w:t>t</w:t>
-      </w:r>
-      <w:r>
-        <w:rPr>
-          <w:rFonts w:eastAsia="Times New Roman" w:cs="Times New Roman"/>
-          <w:color w:val="000000"/>
-          <w:kern w:val="0"/>
-          <w:lang w:eastAsia="en-GB"/>
-          <w14:ligatures w14:val="none"/>
-        </w:rPr>
-        <w:t>. The baseline is a naive persistence model (tomorrow's close equals today's close), which all subsequent models must outperform.</w:t>
+          <w:b/>
+          <w:bCs/>
+          <w:color w:val="000000"/>
+          <w:kern w:val="0"/>
+          <w:lang w:eastAsia="en-GB"/>
+          <w14:ligatures w14:val="none"/>
+        </w:rPr>
+        <w:t>Deployment</w:t>
+      </w:r>
+      <w:r>
+        <w:rPr>
+          <w:rFonts w:eastAsia="Times New Roman" w:cs="Times New Roman"/>
+          <w:color w:val="000000"/>
+          <w:kern w:val="0"/>
+          <w:lang w:eastAsia="en-GB"/>
+          <w14:ligatures w14:val="none"/>
+        </w:rPr>
+        <w:t>: Outline how you will deploy the final model into a production environment. Will it be embedded into an existing system, or will you develop a new application</w:t>
+      </w:r>
+      <w:r>
+        <w:rPr>
+          <w:rFonts w:eastAsia="Times New Roman" w:cs="Times New Roman"/>
+          <w:color w:val="000000"/>
+          <w:kern w:val="0"/>
+          <w:lang w:eastAsia="en-GB"/>
+          <w14:ligatures w14:val="none"/>
+        </w:rPr>
+        <w:t>?</w:t>
       </w:r>
     </w:p>
     <w:p>
       <w:pPr>
-        <w:spacing w:before="100" w:beforeAutospacing="1" w:after="100" w:afterAutospacing="1" w:line="240" w:lineRule="auto"/>
-        <w:rPr>
-          <w:rFonts w:eastAsia="Times New Roman" w:cs="Times New Roman"/>
-          <w:color w:val="000000"/>
-          <w:kern w:val="0"/>
-          <w:lang w:eastAsia="en-GB"/>
-          <w14:ligatures w14:val="none"/>
-        </w:rPr>
-      </w:pPr>
-      <w:r>
-        <w:rPr>
-          <w:rFonts w:eastAsia="Times New Roman" w:cs="Times New Roman"/>
-          <w:color w:val="000000"/>
-          <w:kern w:val="0"/>
-          <w:lang w:eastAsia="en-GB"/>
-          <w14:ligatures w14:val="none"/>
-        </w:rPr>
-        <w:t xml:space="preserve">Three base models are selected for complementary strengths: Ridge Regression provides stable, interpretable linear predictions and handles multicollinearity well; Random Forest captures non-linear interactions through decorrelated trees and resists noisy features; </w:t>
-      </w:r>
-      <w:proofErr w:type="spellStart"/>
-      <w:r>
-        <w:rPr>
-          <w:rFonts w:eastAsia="Times New Roman" w:cs="Times New Roman"/>
-          <w:color w:val="000000"/>
-          <w:kern w:val="0"/>
-          <w:lang w:eastAsia="en-GB"/>
-          <w14:ligatures w14:val="none"/>
-        </w:rPr>
-        <w:t>XGBoost</w:t>
-      </w:r>
-      <w:proofErr w:type="spellEnd"/>
-      <w:r>
-        <w:rPr>
-          <w:rFonts w:eastAsia="Times New Roman" w:cs="Times New Roman"/>
-          <w:color w:val="000000"/>
-          <w:kern w:val="0"/>
-          <w:lang w:eastAsia="en-GB"/>
-          <w14:ligatures w14:val="none"/>
-        </w:rPr>
-        <w:t xml:space="preserve"> adds sequential error-correction by focusing on residuals, excelling at subtle patterns the others miss. All three are combined into a stacking ensemble with a linear meta-learner trained on out-of-fold predictions. Ridge anchors the ensemble with low-variance output, Random Forest adds non-linear capacity, and </w:t>
-      </w:r>
-      <w:proofErr w:type="spellStart"/>
-      <w:r>
-        <w:rPr>
-          <w:rFonts w:eastAsia="Times New Roman" w:cs="Times New Roman"/>
-          <w:color w:val="000000"/>
-          <w:kern w:val="0"/>
-          <w:lang w:eastAsia="en-GB"/>
-          <w14:ligatures w14:val="none"/>
-        </w:rPr>
-        <w:t>XGBoost</w:t>
-      </w:r>
-      <w:proofErr w:type="spellEnd"/>
-      <w:r>
-        <w:rPr>
-          <w:rFonts w:eastAsia="Times New Roman" w:cs="Times New Roman"/>
-          <w:color w:val="000000"/>
-          <w:kern w:val="0"/>
-          <w:lang w:eastAsia="en-GB"/>
-          <w14:ligatures w14:val="none"/>
-        </w:rPr>
-        <w:t xml:space="preserve"> captures residual complexity — when one underperforms </w:t>
-      </w:r>
-      <w:proofErr w:type="gramStart"/>
-      <w:r>
-        <w:rPr>
-          <w:rFonts w:eastAsia="Times New Roman" w:cs="Times New Roman"/>
-          <w:color w:val="000000"/>
-          <w:kern w:val="0"/>
-          <w:lang w:eastAsia="en-GB"/>
-          <w14:ligatures w14:val="none"/>
-        </w:rPr>
-        <w:t>in a given</w:t>
-      </w:r>
-      <w:proofErr w:type="gramEnd"/>
-      <w:r>
-        <w:rPr>
-          <w:rFonts w:eastAsia="Times New Roman" w:cs="Times New Roman"/>
-          <w:color w:val="000000"/>
-          <w:kern w:val="0"/>
-          <w:lang w:eastAsia="en-GB"/>
-          <w14:ligatures w14:val="none"/>
-        </w:rPr>
-        <w:t xml:space="preserve"> market regime, the others compensate.</w:t>
-      </w:r>
-    </w:p>
-    <w:p>
-      <w:pPr>
-        <w:spacing w:before="100" w:beforeAutospacing="1" w:after="100" w:afterAutospacing="1" w:line="240" w:lineRule="auto"/>
-        <w:rPr>
-          <w:rFonts w:eastAsia="Times New Roman" w:cs="Times New Roman"/>
-          <w:color w:val="000000"/>
-          <w:kern w:val="0"/>
-          <w:lang w:eastAsia="en-GB"/>
-          <w14:ligatures w14:val="none"/>
-        </w:rPr>
-      </w:pPr>
-      <w:r>
-        <w:rPr>
-          <w:rFonts w:eastAsia="Times New Roman" w:cs="Times New Roman"/>
-          <w:color w:val="000000"/>
-          <w:kern w:val="0"/>
-          <w:lang w:eastAsia="en-GB"/>
-          <w14:ligatures w14:val="none"/>
-        </w:rPr>
-        <w:t>A time-based split prevents lookahead bias: training (~70%, 2015–mid-2021), validation (~15%, mid-2021–mid-2023), and test (~15%, mid-2023–2025). Walk-forward cross-validation simulates periodic retraining during the training phase.</w:t>
-      </w:r>
-    </w:p>
-    <w:p>
-      <w:pPr>
-        <w:spacing w:before="100" w:beforeAutospacing="1" w:after="100" w:afterAutospacing="1" w:line="240" w:lineRule="auto"/>
-        <w:rPr>
-          <w:rFonts w:eastAsia="Times New Roman" w:cs="Times New Roman"/>
-          <w:color w:val="000000"/>
-          <w:kern w:val="0"/>
-          <w:lang w:eastAsia="en-GB"/>
-          <w14:ligatures w14:val="none"/>
-        </w:rPr>
-      </w:pPr>
-      <w:r>
-        <w:rPr>
-          <w:rFonts w:eastAsia="Times New Roman" w:cs="Times New Roman"/>
-          <w:b/>
-          <w:bCs/>
-          <w:color w:val="000000"/>
-          <w:kern w:val="0"/>
-          <w:lang w:eastAsia="en-GB"/>
-          <w14:ligatures w14:val="none"/>
-        </w:rPr>
-        <w:t>2.3 Evaluation Metrics</w:t>
-      </w:r>
-    </w:p>
-    <w:p>
-      <w:pPr>
-        <w:spacing w:before="100" w:beforeAutospacing="1" w:after="100" w:afterAutospacing="1" w:line="240" w:lineRule="auto"/>
-        <w:rPr>
-          <w:rFonts w:eastAsia="Times New Roman" w:cs="Times New Roman"/>
-          <w:color w:val="000000"/>
-          <w:kern w:val="0"/>
-          <w:lang w:eastAsia="en-GB"/>
-          <w14:ligatures w14:val="none"/>
-        </w:rPr>
-      </w:pPr>
-      <w:r>
-        <w:rPr>
-          <w:rFonts w:eastAsia="Times New Roman" w:cs="Times New Roman"/>
-          <w:color w:val="000000"/>
-          <w:kern w:val="0"/>
-          <w:lang w:eastAsia="en-GB"/>
-          <w14:ligatures w14:val="none"/>
-        </w:rPr>
-        <w:t>Primary metrics are MAE, RMSE, MAPE, and R². Z-scores of prediction errors will flag statistically anomalous forecasts by standardizing each error relative to the distribution, identifying predictions outside expected bounds (|z| &gt; 2) for both evaluation and as a runtime confidence warning on the dashboard. Directional accuracy measures how often the predicted price direction matches reality. All metrics are benchmarked against the naive baseline. Error analysis will examine whether failures cluster around specific market events or volatility regimes to inform further iteration.</w:t>
-      </w:r>
-    </w:p>
-    <w:p>
-      <w:pPr>
-        <w:spacing w:before="100" w:beforeAutospacing="1" w:after="100" w:afterAutospacing="1" w:line="240" w:lineRule="auto"/>
-        <w:rPr>
-          <w:rFonts w:eastAsia="Times New Roman" w:cs="Times New Roman"/>
-          <w:color w:val="000000"/>
-          <w:kern w:val="0"/>
-          <w:lang w:eastAsia="en-GB"/>
-          <w14:ligatures w14:val="none"/>
-        </w:rPr>
-      </w:pPr>
-      <w:r>
-        <w:rPr>
-          <w:rFonts w:eastAsia="Times New Roman" w:cs="Times New Roman"/>
-          <w:b/>
-          <w:bCs/>
-          <w:color w:val="000000"/>
-          <w:kern w:val="0"/>
-          <w:lang w:eastAsia="en-GB"/>
-          <w14:ligatures w14:val="none"/>
-        </w:rPr>
-        <w:t>2.4 Deployment</w:t>
-      </w:r>
-    </w:p>
-    <w:p>
-      <w:pPr>
-        <w:spacing w:before="100" w:beforeAutospacing="1" w:after="100" w:afterAutospacing="1" w:line="240" w:lineRule="auto"/>
-        <w:rPr>
-          <w:rFonts w:eastAsia="Times New Roman" w:cs="Times New Roman"/>
-          <w:color w:val="000000"/>
-          <w:kern w:val="0"/>
-          <w:lang w:eastAsia="en-GB"/>
-          <w14:ligatures w14:val="none"/>
-        </w:rPr>
-      </w:pPr>
-      <w:r>
-        <w:rPr>
-          <w:rFonts w:eastAsia="Times New Roman" w:cs="Times New Roman"/>
-          <w:color w:val="000000"/>
-          <w:kern w:val="0"/>
-          <w:lang w:eastAsia="en-GB"/>
-          <w14:ligatures w14:val="none"/>
-        </w:rPr>
-        <w:t xml:space="preserve">The ensemble will be deployed within a </w:t>
-      </w:r>
-      <w:proofErr w:type="spellStart"/>
-      <w:r>
-        <w:rPr>
-          <w:rFonts w:eastAsia="Times New Roman" w:cs="Times New Roman"/>
-          <w:color w:val="000000"/>
-          <w:kern w:val="0"/>
-          <w:lang w:eastAsia="en-GB"/>
-          <w14:ligatures w14:val="none"/>
-        </w:rPr>
-        <w:t>Streamlit</w:t>
-      </w:r>
-      <w:proofErr w:type="spellEnd"/>
-      <w:r>
-        <w:rPr>
-          <w:rFonts w:eastAsia="Times New Roman" w:cs="Times New Roman"/>
-          <w:color w:val="000000"/>
-          <w:kern w:val="0"/>
-          <w:lang w:eastAsia="en-GB"/>
-          <w14:ligatures w14:val="none"/>
-        </w:rPr>
-        <w:t xml:space="preserve"> dashboard following a three-tier architecture: a PostgreSQL data layer, a model layer that applies the same preprocessing pipeline at inference time, and a presentation layer with interactive visualizations of prices, predictions, feature importance, and error diagnostics. The entire stack will be containerized with Docker Compose, and a README with Poetry lock file will ensure reproducibility.</w:t>
-      </w:r>
-    </w:p>
-    <w:p>
-      <w:pPr>
-        <w:spacing w:before="100" w:beforeAutospacing="1" w:after="100" w:afterAutospacing="1" w:line="240" w:lineRule="auto"/>
-        <w:rPr>
-          <w:rFonts w:eastAsia="Times New Roman" w:cs="Times New Roman"/>
-          <w:color w:val="000000"/>
-          <w:kern w:val="0"/>
-          <w:lang w:eastAsia="en-GB"/>
-          <w14:ligatures w14:val="none"/>
-        </w:rPr>
-      </w:pPr>
-    </w:p>
-    <w:p>
-      <w:pPr>
-        <w:pStyle w:val="Listaszerbekezds"/>
+        <w:pStyle w:val="ListParagraph"/>
         <w:numPr>
           <w:ilvl w:val="0"/>
           <w:numId w:val="3"/>
         </w:numPr>
-        <w:spacing w:before="100" w:beforeAutospacing="1" w:after="100" w:afterAutospacing="1" w:line="240" w:lineRule="auto"/>
         <w:rPr>
           <w:b/>
           <w:bCs/>
@@ -1618,7 +1425,6 @@
           <w:szCs w:val="28"/>
           <w:lang w:val="en-GB"/>
         </w:rPr>
-        <w:lastRenderedPageBreak/>
         <w:t>Project Timeline</w:t>
       </w:r>
     </w:p>
@@ -1849,7 +1655,14 @@
               <w:rPr>
                 <w:lang w:val="en-GB"/>
               </w:rPr>
-              <w:t>ML modelling (Task 10), app architecture (Task 13), production ready code (Task 11), group proposal (Task 6)</w:t>
+              <w:t xml:space="preserve">ML modelling (Task 10), app architecture (Task 13), production ready </w:t>
+            </w:r>
+            <w:r>
+              <w:rPr>
+                <w:lang w:val="en-GB"/>
+              </w:rPr>
+              <w:lastRenderedPageBreak/>
+              <w:t>code (Task 11), group proposal (Task 6)</w:t>
             </w:r>
           </w:p>
         </w:tc>
@@ -1873,7 +1686,15 @@
               <w:rPr>
                 <w:lang w:val="en-GB"/>
               </w:rPr>
-              <w:t>Group proposal document, model notebook</w:t>
+              <w:lastRenderedPageBreak/>
+              <w:t xml:space="preserve">Group proposal document, </w:t>
+            </w:r>
+            <w:r>
+              <w:rPr>
+                <w:lang w:val="en-GB"/>
+              </w:rPr>
+              <w:lastRenderedPageBreak/>
+              <w:t>model notebook</w:t>
             </w:r>
           </w:p>
         </w:tc>
@@ -1897,6 +1718,7 @@
               <w:rPr>
                 <w:lang w:val="en-GB"/>
               </w:rPr>
+              <w:lastRenderedPageBreak/>
               <w:t>Tuesday: final proposal presentation</w:t>
             </w:r>
           </w:p>
@@ -2571,7 +2393,6 @@
               <w:rPr>
                 <w:lang w:val="en-GB"/>
               </w:rPr>
-              <w:lastRenderedPageBreak/>
               <w:t>Task 6 - Group project proposal</w:t>
             </w:r>
           </w:p>
@@ -2780,6 +2601,7 @@
               <w:rPr>
                 <w:lang w:val="en-GB"/>
               </w:rPr>
+              <w:lastRenderedPageBreak/>
               <w:t>Task 10 - ML model development</w:t>
             </w:r>
           </w:p>
@@ -3035,7 +2857,7 @@
       <w:sdtContent>
         <w:p>
           <w:pPr>
-            <w:pStyle w:val="Cmsor1"/>
+            <w:pStyle w:val="Heading1"/>
             <w:numPr>
               <w:ilvl w:val="0"/>
               <w:numId w:val="3"/>
@@ -3070,7 +2892,7 @@
           <w:sdtContent>
             <w:p>
               <w:pPr>
-                <w:pStyle w:val="Irodalomjegyzk"/>
+                <w:pStyle w:val="Bibliography"/>
                 <w:ind w:left="720" w:hanging="720"/>
                 <w:rPr>
                   <w:noProof/>
@@ -3114,7 +2936,7 @@
             </w:p>
             <w:p>
               <w:pPr>
-                <w:pStyle w:val="Irodalomjegyzk"/>
+                <w:pStyle w:val="Bibliography"/>
                 <w:ind w:left="720" w:hanging="720"/>
                 <w:rPr>
                   <w:noProof/>
@@ -3232,51 +3054,7 @@
           <w:lang w:eastAsia="en-GB"/>
           <w14:ligatures w14:val="none"/>
         </w:rPr>
-        <w:t xml:space="preserve"> you consulted during the development of your proposal. These can include academic papers, datasets, articles, websites, and any other materials that </w:t>
-      </w:r>
-      <w:proofErr w:type="gramStart"/>
-      <w:r>
-        <w:rPr>
-          <w:rFonts w:eastAsia="Times New Roman" w:cs="Times New Roman"/>
-          <w:color w:val="000000"/>
-          <w:kern w:val="0"/>
-          <w:lang w:eastAsia="en-GB"/>
-          <w14:ligatures w14:val="none"/>
-        </w:rPr>
-        <w:t>contributed</w:t>
-      </w:r>
-      <w:proofErr w:type="gramEnd"/>
-      <w:r>
-        <w:rPr>
-          <w:rFonts w:eastAsia="Times New Roman" w:cs="Times New Roman"/>
-          <w:color w:val="000000"/>
-          <w:kern w:val="0"/>
-          <w:lang w:eastAsia="en-GB"/>
-          <w14:ligatures w14:val="none"/>
-        </w:rPr>
-        <w:t xml:space="preserve"> to your understanding of the problem or </w:t>
-      </w:r>
-      <w:proofErr w:type="gramStart"/>
-      <w:r>
-        <w:rPr>
-          <w:rFonts w:eastAsia="Times New Roman" w:cs="Times New Roman"/>
-          <w:color w:val="000000"/>
-          <w:kern w:val="0"/>
-          <w:lang w:eastAsia="en-GB"/>
-          <w14:ligatures w14:val="none"/>
-        </w:rPr>
-        <w:t>guided</w:t>
-      </w:r>
-      <w:proofErr w:type="gramEnd"/>
-      <w:r>
-        <w:rPr>
-          <w:rFonts w:eastAsia="Times New Roman" w:cs="Times New Roman"/>
-          <w:color w:val="000000"/>
-          <w:kern w:val="0"/>
-          <w:lang w:eastAsia="en-GB"/>
-          <w14:ligatures w14:val="none"/>
-        </w:rPr>
-        <w:t xml:space="preserve"> your methodology.</w:t>
+        <w:t> you consulted during the development of your proposal. These can include academic papers, datasets, articles, websites, and any other materials that contributed to your understanding of the problem or guided your methodology.</w:t>
       </w:r>
     </w:p>
     <w:p>
@@ -3335,7 +3113,7 @@
       <w:hyperlink r:id="rId9" w:history="1">
         <w:r>
           <w:rPr>
-            <w:rStyle w:val="Hiperhivatkozs"/>
+            <w:rStyle w:val="Hyperlink"/>
             <w:rFonts w:eastAsia="Times New Roman" w:cs="Times New Roman"/>
             <w:kern w:val="0"/>
             <w:lang w:eastAsia="en-GB"/>
@@ -3388,92 +3166,6 @@
 <file path=word/numbering.xml><?xml version="1.0" encoding="utf-8"?>
 <w:numbering xmlns:wpc="http://schemas.microsoft.com/office/word/2010/wordprocessingCanvas" xmlns:cx="http://schemas.microsoft.com/office/drawing/2014/chartex" xmlns:cx1="http://schemas.microsoft.com/office/drawing/2015/9/8/chartex" xmlns:cx2="http://schemas.microsoft.com/office/drawing/2015/10/21/chartex" xmlns:cx3="http://schemas.microsoft.com/office/drawing/2016/5/9/chartex" xmlns:cx4="http://schemas.microsoft.com/office/drawing/2016/5/10/chartex" xmlns:cx5="http://schemas.microsoft.com/office/drawing/2016/5/11/chartex" xmlns:cx6="http://schemas.microsoft.com/office/drawing/2016/5/12/chartex" xmlns:cx7="http://schemas.microsoft.com/office/drawing/2016/5/13/chartex" xmlns:cx8="http://schemas.microsoft.com/office/drawing/2016/5/14/chartex" xmlns:mc="http://schemas.openxmlformats.org/markup-compatibility/2006" xmlns:aink="http://schemas.microsoft.com/office/drawing/2016/ink" xmlns:am3d="http://schemas.microsoft.com/office/drawing/2017/model3d" xmlns:o="urn:schemas-microsoft-com:office:office" xmlns:oel="http://schemas.microsoft.com/office/2019/extlst" xmlns:r="http://schemas.openxmlformats.org/officeDocument/2006/relationships" xmlns:m="http://schemas.openxmlformats.org/officeDocument/2006/math" xmlns:v="urn:schemas-microsoft-com:vml" xmlns:wp14="http://schemas.microsoft.com/office/word/2010/wordprocessingDrawing" xmlns:wp="http://schemas.openxmlformats.org/drawingml/2006/wordprocessingDrawing" xmlns:w10="urn:schemas-microsoft-com:office:word" xmlns:w="http://schemas.openxmlformats.org/wordprocessingml/2006/main" xmlns:w14="http://schemas.microsoft.com/office/word/2010/wordml" xmlns:w15="http://schemas.microsoft.com/office/word/2012/wordml" xmlns:w16cex="http://schemas.microsoft.com/office/word/2018/wordml/cex" xmlns:w16cid="http://schemas.microsoft.com/office/word/2016/wordml/cid" xmlns:w16="http://schemas.microsoft.com/office/word/2018/wordml" xmlns:w16du="http://schemas.microsoft.com/office/word/2023/wordml/word16du" xmlns:w16sdtdh="http://schemas.microsoft.com/office/word/2020/wordml/sdtdatahash" xmlns:w16sdtfl="http://schemas.microsoft.com/office/word/2024/wordml/sdtformatlock" xmlns:w16se="http://schemas.microsoft.com/office/word/2015/wordml/symex" xmlns:wpg="http://schemas.microsoft.com/office/word/2010/wordprocessingGroup" xmlns:wpi="http://schemas.microsoft.com/office/word/2010/wordprocessingInk" xmlns:wne="http://schemas.microsoft.com/office/word/2006/wordml" xmlns:wps="http://schemas.microsoft.com/office/word/2010/wordprocessingShape" mc:Ignorable="w14 w15 w16se w16cid w16 w16cex w16sdtdh w16sdtfl w16du wp14">
   <w:abstractNum w:abstractNumId="0" w15:restartNumberingAfterBreak="0">
-    <w:nsid w:val="33395FD0"/>
-    <w:multiLevelType w:val="hybridMultilevel"/>
-    <w:tmpl w:val="FB825406"/>
-    <w:lvl w:ilvl="0" w:tplc="040E000F">
-      <w:start w:val="1"/>
-      <w:numFmt w:val="decimal"/>
-      <w:lvlText w:val="%1."/>
-      <w:lvlJc w:val="left"/>
-      <w:pPr>
-        <w:ind w:left="720" w:hanging="360"/>
-      </w:pPr>
-    </w:lvl>
-    <w:lvl w:ilvl="1" w:tplc="040E0019" w:tentative="1">
-      <w:start w:val="1"/>
-      <w:numFmt w:val="lowerLetter"/>
-      <w:lvlText w:val="%2."/>
-      <w:lvlJc w:val="left"/>
-      <w:pPr>
-        <w:ind w:left="1440" w:hanging="360"/>
-      </w:pPr>
-    </w:lvl>
-    <w:lvl w:ilvl="2" w:tplc="040E001B" w:tentative="1">
-      <w:start w:val="1"/>
-      <w:numFmt w:val="lowerRoman"/>
-      <w:lvlText w:val="%3."/>
-      <w:lvlJc w:val="right"/>
-      <w:pPr>
-        <w:ind w:left="2160" w:hanging="180"/>
-      </w:pPr>
-    </w:lvl>
-    <w:lvl w:ilvl="3" w:tplc="040E000F" w:tentative="1">
-      <w:start w:val="1"/>
-      <w:numFmt w:val="decimal"/>
-      <w:lvlText w:val="%4."/>
-      <w:lvlJc w:val="left"/>
-      <w:pPr>
-        <w:ind w:left="2880" w:hanging="360"/>
-      </w:pPr>
-    </w:lvl>
-    <w:lvl w:ilvl="4" w:tplc="040E0019" w:tentative="1">
-      <w:start w:val="1"/>
-      <w:numFmt w:val="lowerLetter"/>
-      <w:lvlText w:val="%5."/>
-      <w:lvlJc w:val="left"/>
-      <w:pPr>
-        <w:ind w:left="3600" w:hanging="360"/>
-      </w:pPr>
-    </w:lvl>
-    <w:lvl w:ilvl="5" w:tplc="040E001B" w:tentative="1">
-      <w:start w:val="1"/>
-      <w:numFmt w:val="lowerRoman"/>
-      <w:lvlText w:val="%6."/>
-      <w:lvlJc w:val="right"/>
-      <w:pPr>
-        <w:ind w:left="4320" w:hanging="180"/>
-      </w:pPr>
-    </w:lvl>
-    <w:lvl w:ilvl="6" w:tplc="040E000F" w:tentative="1">
-      <w:start w:val="1"/>
-      <w:numFmt w:val="decimal"/>
-      <w:lvlText w:val="%7."/>
-      <w:lvlJc w:val="left"/>
-      <w:pPr>
-        <w:ind w:left="5040" w:hanging="360"/>
-      </w:pPr>
-    </w:lvl>
-    <w:lvl w:ilvl="7" w:tplc="040E0019" w:tentative="1">
-      <w:start w:val="1"/>
-      <w:numFmt w:val="lowerLetter"/>
-      <w:lvlText w:val="%8."/>
-      <w:lvlJc w:val="left"/>
-      <w:pPr>
-        <w:ind w:left="5760" w:hanging="360"/>
-      </w:pPr>
-    </w:lvl>
-    <w:lvl w:ilvl="8" w:tplc="040E001B" w:tentative="1">
-      <w:start w:val="1"/>
-      <w:numFmt w:val="lowerRoman"/>
-      <w:lvlText w:val="%9."/>
-      <w:lvlJc w:val="right"/>
-      <w:pPr>
-        <w:ind w:left="6480" w:hanging="180"/>
-      </w:pPr>
-    </w:lvl>
-  </w:abstractNum>
-  <w:abstractNum w:abstractNumId="1" w15:restartNumberingAfterBreak="0">
     <w:nsid w:val="33493FC4"/>
     <w:multiLevelType w:val="hybridMultilevel"/>
     <w:tmpl w:val="DC9CD876"/>
@@ -3562,7 +3254,7 @@
       </w:pPr>
     </w:lvl>
   </w:abstractNum>
-  <w:abstractNum w:abstractNumId="2" w15:restartNumberingAfterBreak="0">
+  <w:abstractNum w:abstractNumId="1" w15:restartNumberingAfterBreak="0">
     <w:nsid w:val="3D632CCF"/>
     <w:multiLevelType w:val="multilevel"/>
     <w:tmpl w:val="984E53B0"/>
@@ -3711,7 +3403,7 @@
       </w:rPr>
     </w:lvl>
   </w:abstractNum>
-  <w:abstractNum w:abstractNumId="3" w15:restartNumberingAfterBreak="0">
+  <w:abstractNum w:abstractNumId="2" w15:restartNumberingAfterBreak="0">
     <w:nsid w:val="41692D00"/>
     <w:multiLevelType w:val="hybridMultilevel"/>
     <w:tmpl w:val="9B92CFEE"/>
@@ -3800,7 +3492,7 @@
       </w:pPr>
     </w:lvl>
   </w:abstractNum>
-  <w:abstractNum w:abstractNumId="4" w15:restartNumberingAfterBreak="0">
+  <w:abstractNum w:abstractNumId="3" w15:restartNumberingAfterBreak="0">
     <w:nsid w:val="41C43BDE"/>
     <w:multiLevelType w:val="multilevel"/>
     <w:tmpl w:val="0B5C127A"/>
@@ -3949,7 +3641,7 @@
       </w:rPr>
     </w:lvl>
   </w:abstractNum>
-  <w:abstractNum w:abstractNumId="5" w15:restartNumberingAfterBreak="0">
+  <w:abstractNum w:abstractNumId="4" w15:restartNumberingAfterBreak="0">
     <w:nsid w:val="484957B8"/>
     <w:multiLevelType w:val="hybridMultilevel"/>
     <w:tmpl w:val="054440B6"/>
@@ -4039,22 +3731,19 @@
     </w:lvl>
   </w:abstractNum>
   <w:num w:numId="1" w16cid:durableId="1510018963">
-    <w:abstractNumId w:val="1"/>
+    <w:abstractNumId w:val="0"/>
   </w:num>
   <w:num w:numId="2" w16cid:durableId="406538478">
+    <w:abstractNumId w:val="2"/>
+  </w:num>
+  <w:num w:numId="3" w16cid:durableId="932280022">
+    <w:abstractNumId w:val="4"/>
+  </w:num>
+  <w:num w:numId="4" w16cid:durableId="1021277151">
     <w:abstractNumId w:val="3"/>
   </w:num>
-  <w:num w:numId="3" w16cid:durableId="932280022">
-    <w:abstractNumId w:val="5"/>
-  </w:num>
-  <w:num w:numId="4" w16cid:durableId="1021277151">
-    <w:abstractNumId w:val="4"/>
-  </w:num>
   <w:num w:numId="5" w16cid:durableId="669910041">
-    <w:abstractNumId w:val="2"/>
-  </w:num>
-  <w:num w:numId="6" w16cid:durableId="1584071891">
-    <w:abstractNumId w:val="0"/>
+    <w:abstractNumId w:val="1"/>
   </w:num>
 </w:numbering>
 </file>
@@ -4456,15 +4145,15 @@
     <w:lsdException w:name="Unresolved Mention" w:semiHidden="1" w:unhideWhenUsed="1"/>
     <w:lsdException w:name="Smart Link" w:semiHidden="1" w:unhideWhenUsed="1"/>
   </w:latentStyles>
-  <w:style w:type="paragraph" w:default="1" w:styleId="Norml">
+  <w:style w:type="paragraph" w:default="1" w:styleId="Normal">
     <w:name w:val="Normal"/>
     <w:qFormat/>
   </w:style>
-  <w:style w:type="paragraph" w:styleId="Cmsor1">
+  <w:style w:type="paragraph" w:styleId="Heading1">
     <w:name w:val="heading 1"/>
-    <w:basedOn w:val="Norml"/>
-    <w:next w:val="Norml"/>
-    <w:link w:val="Cmsor1Char"/>
+    <w:basedOn w:val="Normal"/>
+    <w:next w:val="Normal"/>
+    <w:link w:val="Heading1Char"/>
     <w:uiPriority w:val="9"/>
     <w:qFormat/>
     <w:rsid w:val="00FD5A73"/>
@@ -4481,11 +4170,11 @@
       <w:szCs w:val="40"/>
     </w:rPr>
   </w:style>
-  <w:style w:type="paragraph" w:styleId="Cmsor2">
+  <w:style w:type="paragraph" w:styleId="Heading2">
     <w:name w:val="heading 2"/>
-    <w:basedOn w:val="Norml"/>
-    <w:next w:val="Norml"/>
-    <w:link w:val="Cmsor2Char"/>
+    <w:basedOn w:val="Normal"/>
+    <w:next w:val="Normal"/>
+    <w:link w:val="Heading2Char"/>
     <w:uiPriority w:val="9"/>
     <w:semiHidden/>
     <w:unhideWhenUsed/>
@@ -4504,11 +4193,11 @@
       <w:szCs w:val="32"/>
     </w:rPr>
   </w:style>
-  <w:style w:type="paragraph" w:styleId="Cmsor3">
+  <w:style w:type="paragraph" w:styleId="Heading3">
     <w:name w:val="heading 3"/>
-    <w:basedOn w:val="Norml"/>
-    <w:next w:val="Norml"/>
-    <w:link w:val="Cmsor3Char"/>
+    <w:basedOn w:val="Normal"/>
+    <w:next w:val="Normal"/>
+    <w:link w:val="Heading3Char"/>
     <w:uiPriority w:val="9"/>
     <w:semiHidden/>
     <w:unhideWhenUsed/>
@@ -4527,11 +4216,11 @@
       <w:szCs w:val="28"/>
     </w:rPr>
   </w:style>
-  <w:style w:type="paragraph" w:styleId="Cmsor4">
+  <w:style w:type="paragraph" w:styleId="Heading4">
     <w:name w:val="heading 4"/>
-    <w:basedOn w:val="Norml"/>
-    <w:next w:val="Norml"/>
-    <w:link w:val="Cmsor4Char"/>
+    <w:basedOn w:val="Normal"/>
+    <w:next w:val="Normal"/>
+    <w:link w:val="Heading4Char"/>
     <w:uiPriority w:val="9"/>
     <w:semiHidden/>
     <w:unhideWhenUsed/>
@@ -4550,11 +4239,11 @@
       <w:color w:val="0F4761" w:themeColor="accent1" w:themeShade="BF"/>
     </w:rPr>
   </w:style>
-  <w:style w:type="paragraph" w:styleId="Cmsor5">
+  <w:style w:type="paragraph" w:styleId="Heading5">
     <w:name w:val="heading 5"/>
-    <w:basedOn w:val="Norml"/>
-    <w:next w:val="Norml"/>
-    <w:link w:val="Cmsor5Char"/>
+    <w:basedOn w:val="Normal"/>
+    <w:next w:val="Normal"/>
+    <w:link w:val="Heading5Char"/>
     <w:uiPriority w:val="9"/>
     <w:semiHidden/>
     <w:unhideWhenUsed/>
@@ -4571,11 +4260,11 @@
       <w:color w:val="0F4761" w:themeColor="accent1" w:themeShade="BF"/>
     </w:rPr>
   </w:style>
-  <w:style w:type="paragraph" w:styleId="Cmsor6">
+  <w:style w:type="paragraph" w:styleId="Heading6">
     <w:name w:val="heading 6"/>
-    <w:basedOn w:val="Norml"/>
-    <w:next w:val="Norml"/>
-    <w:link w:val="Cmsor6Char"/>
+    <w:basedOn w:val="Normal"/>
+    <w:next w:val="Normal"/>
+    <w:link w:val="Heading6Char"/>
     <w:uiPriority w:val="9"/>
     <w:semiHidden/>
     <w:unhideWhenUsed/>
@@ -4594,11 +4283,11 @@
       <w:color w:val="595959" w:themeColor="text1" w:themeTint="A6"/>
     </w:rPr>
   </w:style>
-  <w:style w:type="paragraph" w:styleId="Cmsor7">
+  <w:style w:type="paragraph" w:styleId="Heading7">
     <w:name w:val="heading 7"/>
-    <w:basedOn w:val="Norml"/>
-    <w:next w:val="Norml"/>
-    <w:link w:val="Cmsor7Char"/>
+    <w:basedOn w:val="Normal"/>
+    <w:next w:val="Normal"/>
+    <w:link w:val="Heading7Char"/>
     <w:uiPriority w:val="9"/>
     <w:semiHidden/>
     <w:unhideWhenUsed/>
@@ -4615,11 +4304,11 @@
       <w:color w:val="595959" w:themeColor="text1" w:themeTint="A6"/>
     </w:rPr>
   </w:style>
-  <w:style w:type="paragraph" w:styleId="Cmsor8">
+  <w:style w:type="paragraph" w:styleId="Heading8">
     <w:name w:val="heading 8"/>
-    <w:basedOn w:val="Norml"/>
-    <w:next w:val="Norml"/>
-    <w:link w:val="Cmsor8Char"/>
+    <w:basedOn w:val="Normal"/>
+    <w:next w:val="Normal"/>
+    <w:link w:val="Heading8Char"/>
     <w:uiPriority w:val="9"/>
     <w:semiHidden/>
     <w:unhideWhenUsed/>
@@ -4638,11 +4327,11 @@
       <w:color w:val="272727" w:themeColor="text1" w:themeTint="D8"/>
     </w:rPr>
   </w:style>
-  <w:style w:type="paragraph" w:styleId="Cmsor9">
+  <w:style w:type="paragraph" w:styleId="Heading9">
     <w:name w:val="heading 9"/>
-    <w:basedOn w:val="Norml"/>
-    <w:next w:val="Norml"/>
-    <w:link w:val="Cmsor9Char"/>
+    <w:basedOn w:val="Normal"/>
+    <w:next w:val="Normal"/>
+    <w:link w:val="Heading9Char"/>
     <w:uiPriority w:val="9"/>
     <w:semiHidden/>
     <w:unhideWhenUsed/>
@@ -4659,12 +4348,13 @@
       <w:color w:val="272727" w:themeColor="text1" w:themeTint="D8"/>
     </w:rPr>
   </w:style>
-  <w:style w:type="character" w:default="1" w:styleId="Bekezdsalapbettpusa">
+  <w:style w:type="character" w:default="1" w:styleId="DefaultParagraphFont">
     <w:name w:val="Default Paragraph Font"/>
     <w:uiPriority w:val="1"/>
+    <w:semiHidden/>
     <w:unhideWhenUsed/>
   </w:style>
-  <w:style w:type="table" w:default="1" w:styleId="Normltblzat">
+  <w:style w:type="table" w:default="1" w:styleId="TableNormal">
     <w:name w:val="Normal Table"/>
     <w:uiPriority w:val="99"/>
     <w:semiHidden/>
@@ -4679,16 +4369,16 @@
       </w:tblCellMar>
     </w:tblPr>
   </w:style>
-  <w:style w:type="numbering" w:default="1" w:styleId="Nemlista">
+  <w:style w:type="numbering" w:default="1" w:styleId="NoList">
     <w:name w:val="No List"/>
     <w:uiPriority w:val="99"/>
     <w:semiHidden/>
     <w:unhideWhenUsed/>
   </w:style>
-  <w:style w:type="character" w:customStyle="1" w:styleId="Cmsor1Char">
-    <w:name w:val="Címsor 1 Char"/>
-    <w:basedOn w:val="Bekezdsalapbettpusa"/>
-    <w:link w:val="Cmsor1"/>
+  <w:style w:type="character" w:customStyle="1" w:styleId="Heading1Char">
+    <w:name w:val="Heading 1 Char"/>
+    <w:basedOn w:val="DefaultParagraphFont"/>
+    <w:link w:val="Heading1"/>
     <w:uiPriority w:val="9"/>
     <w:rsid w:val="00FD5A73"/>
     <w:rPr>
@@ -4698,10 +4388,10 @@
       <w:szCs w:val="40"/>
     </w:rPr>
   </w:style>
-  <w:style w:type="character" w:customStyle="1" w:styleId="Cmsor2Char">
-    <w:name w:val="Címsor 2 Char"/>
-    <w:basedOn w:val="Bekezdsalapbettpusa"/>
-    <w:link w:val="Cmsor2"/>
+  <w:style w:type="character" w:customStyle="1" w:styleId="Heading2Char">
+    <w:name w:val="Heading 2 Char"/>
+    <w:basedOn w:val="DefaultParagraphFont"/>
+    <w:link w:val="Heading2"/>
     <w:uiPriority w:val="9"/>
     <w:semiHidden/>
     <w:rsid w:val="00FD5A73"/>
@@ -4712,10 +4402,10 @@
       <w:szCs w:val="32"/>
     </w:rPr>
   </w:style>
-  <w:style w:type="character" w:customStyle="1" w:styleId="Cmsor3Char">
-    <w:name w:val="Címsor 3 Char"/>
-    <w:basedOn w:val="Bekezdsalapbettpusa"/>
-    <w:link w:val="Cmsor3"/>
+  <w:style w:type="character" w:customStyle="1" w:styleId="Heading3Char">
+    <w:name w:val="Heading 3 Char"/>
+    <w:basedOn w:val="DefaultParagraphFont"/>
+    <w:link w:val="Heading3"/>
     <w:uiPriority w:val="9"/>
     <w:semiHidden/>
     <w:rsid w:val="00FD5A73"/>
@@ -4726,10 +4416,10 @@
       <w:szCs w:val="28"/>
     </w:rPr>
   </w:style>
-  <w:style w:type="character" w:customStyle="1" w:styleId="Cmsor4Char">
-    <w:name w:val="Címsor 4 Char"/>
-    <w:basedOn w:val="Bekezdsalapbettpusa"/>
-    <w:link w:val="Cmsor4"/>
+  <w:style w:type="character" w:customStyle="1" w:styleId="Heading4Char">
+    <w:name w:val="Heading 4 Char"/>
+    <w:basedOn w:val="DefaultParagraphFont"/>
+    <w:link w:val="Heading4"/>
     <w:uiPriority w:val="9"/>
     <w:semiHidden/>
     <w:rsid w:val="00FD5A73"/>
@@ -4740,10 +4430,10 @@
       <w:color w:val="0F4761" w:themeColor="accent1" w:themeShade="BF"/>
     </w:rPr>
   </w:style>
-  <w:style w:type="character" w:customStyle="1" w:styleId="Cmsor5Char">
-    <w:name w:val="Címsor 5 Char"/>
-    <w:basedOn w:val="Bekezdsalapbettpusa"/>
-    <w:link w:val="Cmsor5"/>
+  <w:style w:type="character" w:customStyle="1" w:styleId="Heading5Char">
+    <w:name w:val="Heading 5 Char"/>
+    <w:basedOn w:val="DefaultParagraphFont"/>
+    <w:link w:val="Heading5"/>
     <w:uiPriority w:val="9"/>
     <w:semiHidden/>
     <w:rsid w:val="00FD5A73"/>
@@ -4752,10 +4442,10 @@
       <w:color w:val="0F4761" w:themeColor="accent1" w:themeShade="BF"/>
     </w:rPr>
   </w:style>
-  <w:style w:type="character" w:customStyle="1" w:styleId="Cmsor6Char">
-    <w:name w:val="Címsor 6 Char"/>
-    <w:basedOn w:val="Bekezdsalapbettpusa"/>
-    <w:link w:val="Cmsor6"/>
+  <w:style w:type="character" w:customStyle="1" w:styleId="Heading6Char">
+    <w:name w:val="Heading 6 Char"/>
+    <w:basedOn w:val="DefaultParagraphFont"/>
+    <w:link w:val="Heading6"/>
     <w:uiPriority w:val="9"/>
     <w:semiHidden/>
     <w:rsid w:val="00FD5A73"/>
@@ -4766,10 +4456,10 @@
       <w:color w:val="595959" w:themeColor="text1" w:themeTint="A6"/>
     </w:rPr>
   </w:style>
-  <w:style w:type="character" w:customStyle="1" w:styleId="Cmsor7Char">
-    <w:name w:val="Címsor 7 Char"/>
-    <w:basedOn w:val="Bekezdsalapbettpusa"/>
-    <w:link w:val="Cmsor7"/>
+  <w:style w:type="character" w:customStyle="1" w:styleId="Heading7Char">
+    <w:name w:val="Heading 7 Char"/>
+    <w:basedOn w:val="DefaultParagraphFont"/>
+    <w:link w:val="Heading7"/>
     <w:uiPriority w:val="9"/>
     <w:semiHidden/>
     <w:rsid w:val="00FD5A73"/>
@@ -4778,10 +4468,10 @@
       <w:color w:val="595959" w:themeColor="text1" w:themeTint="A6"/>
     </w:rPr>
   </w:style>
-  <w:style w:type="character" w:customStyle="1" w:styleId="Cmsor8Char">
-    <w:name w:val="Címsor 8 Char"/>
-    <w:basedOn w:val="Bekezdsalapbettpusa"/>
-    <w:link w:val="Cmsor8"/>
+  <w:style w:type="character" w:customStyle="1" w:styleId="Heading8Char">
+    <w:name w:val="Heading 8 Char"/>
+    <w:basedOn w:val="DefaultParagraphFont"/>
+    <w:link w:val="Heading8"/>
     <w:uiPriority w:val="9"/>
     <w:semiHidden/>
     <w:rsid w:val="00FD5A73"/>
@@ -4792,10 +4482,10 @@
       <w:color w:val="272727" w:themeColor="text1" w:themeTint="D8"/>
     </w:rPr>
   </w:style>
-  <w:style w:type="character" w:customStyle="1" w:styleId="Cmsor9Char">
-    <w:name w:val="Címsor 9 Char"/>
-    <w:basedOn w:val="Bekezdsalapbettpusa"/>
-    <w:link w:val="Cmsor9"/>
+  <w:style w:type="character" w:customStyle="1" w:styleId="Heading9Char">
+    <w:name w:val="Heading 9 Char"/>
+    <w:basedOn w:val="DefaultParagraphFont"/>
+    <w:link w:val="Heading9"/>
     <w:uiPriority w:val="9"/>
     <w:semiHidden/>
     <w:rsid w:val="00FD5A73"/>
@@ -4804,11 +4494,11 @@
       <w:color w:val="272727" w:themeColor="text1" w:themeTint="D8"/>
     </w:rPr>
   </w:style>
-  <w:style w:type="paragraph" w:styleId="Cm">
+  <w:style w:type="paragraph" w:styleId="Title">
     <w:name w:val="Title"/>
-    <w:basedOn w:val="Norml"/>
-    <w:next w:val="Norml"/>
-    <w:link w:val="CmChar"/>
+    <w:basedOn w:val="Normal"/>
+    <w:next w:val="Normal"/>
+    <w:link w:val="TitleChar"/>
     <w:uiPriority w:val="10"/>
     <w:qFormat/>
     <w:rsid w:val="00FD5A73"/>
@@ -4824,10 +4514,10 @@
       <w:szCs w:val="56"/>
     </w:rPr>
   </w:style>
-  <w:style w:type="character" w:customStyle="1" w:styleId="CmChar">
-    <w:name w:val="Cím Char"/>
-    <w:basedOn w:val="Bekezdsalapbettpusa"/>
-    <w:link w:val="Cm"/>
+  <w:style w:type="character" w:customStyle="1" w:styleId="TitleChar">
+    <w:name w:val="Title Char"/>
+    <w:basedOn w:val="DefaultParagraphFont"/>
+    <w:link w:val="Title"/>
     <w:uiPriority w:val="10"/>
     <w:rsid w:val="00FD5A73"/>
     <w:rPr>
@@ -4838,11 +4528,11 @@
       <w:szCs w:val="56"/>
     </w:rPr>
   </w:style>
-  <w:style w:type="paragraph" w:styleId="Alcm">
+  <w:style w:type="paragraph" w:styleId="Subtitle">
     <w:name w:val="Subtitle"/>
-    <w:basedOn w:val="Norml"/>
-    <w:next w:val="Norml"/>
-    <w:link w:val="AlcmChar"/>
+    <w:basedOn w:val="Normal"/>
+    <w:next w:val="Normal"/>
+    <w:link w:val="SubtitleChar"/>
     <w:uiPriority w:val="11"/>
     <w:qFormat/>
     <w:rsid w:val="00FD5A73"/>
@@ -4859,10 +4549,10 @@
       <w:szCs w:val="28"/>
     </w:rPr>
   </w:style>
-  <w:style w:type="character" w:customStyle="1" w:styleId="AlcmChar">
-    <w:name w:val="Alcím Char"/>
-    <w:basedOn w:val="Bekezdsalapbettpusa"/>
-    <w:link w:val="Alcm"/>
+  <w:style w:type="character" w:customStyle="1" w:styleId="SubtitleChar">
+    <w:name w:val="Subtitle Char"/>
+    <w:basedOn w:val="DefaultParagraphFont"/>
+    <w:link w:val="Subtitle"/>
     <w:uiPriority w:val="11"/>
     <w:rsid w:val="00FD5A73"/>
     <w:rPr>
@@ -4873,11 +4563,11 @@
       <w:szCs w:val="28"/>
     </w:rPr>
   </w:style>
-  <w:style w:type="paragraph" w:styleId="Idzet">
+  <w:style w:type="paragraph" w:styleId="Quote">
     <w:name w:val="Quote"/>
-    <w:basedOn w:val="Norml"/>
-    <w:next w:val="Norml"/>
-    <w:link w:val="IdzetChar"/>
+    <w:basedOn w:val="Normal"/>
+    <w:next w:val="Normal"/>
+    <w:link w:val="QuoteChar"/>
     <w:uiPriority w:val="29"/>
     <w:qFormat/>
     <w:rsid w:val="00FD5A73"/>
@@ -4891,10 +4581,10 @@
       <w:color w:val="404040" w:themeColor="text1" w:themeTint="BF"/>
     </w:rPr>
   </w:style>
-  <w:style w:type="character" w:customStyle="1" w:styleId="IdzetChar">
-    <w:name w:val="Idézet Char"/>
-    <w:basedOn w:val="Bekezdsalapbettpusa"/>
-    <w:link w:val="Idzet"/>
+  <w:style w:type="character" w:customStyle="1" w:styleId="QuoteChar">
+    <w:name w:val="Quote Char"/>
+    <w:basedOn w:val="DefaultParagraphFont"/>
+    <w:link w:val="Quote"/>
     <w:uiPriority w:val="29"/>
     <w:rsid w:val="00FD5A73"/>
     <w:rPr>
@@ -4903,9 +4593,9 @@
       <w:color w:val="404040" w:themeColor="text1" w:themeTint="BF"/>
     </w:rPr>
   </w:style>
-  <w:style w:type="paragraph" w:styleId="Listaszerbekezds">
+  <w:style w:type="paragraph" w:styleId="ListParagraph">
     <w:name w:val="List Paragraph"/>
-    <w:basedOn w:val="Norml"/>
+    <w:basedOn w:val="Normal"/>
     <w:uiPriority w:val="34"/>
     <w:qFormat/>
     <w:rsid w:val="00FD5A73"/>
@@ -4914,9 +4604,9 @@
       <w:contextualSpacing/>
     </w:pPr>
   </w:style>
-  <w:style w:type="character" w:styleId="Erskiemels">
+  <w:style w:type="character" w:styleId="IntenseEmphasis">
     <w:name w:val="Intense Emphasis"/>
-    <w:basedOn w:val="Bekezdsalapbettpusa"/>
+    <w:basedOn w:val="DefaultParagraphFont"/>
     <w:uiPriority w:val="21"/>
     <w:qFormat/>
     <w:rsid w:val="00FD5A73"/>
@@ -4926,11 +4616,11 @@
       <w:color w:val="0F4761" w:themeColor="accent1" w:themeShade="BF"/>
     </w:rPr>
   </w:style>
-  <w:style w:type="paragraph" w:styleId="Kiemeltidzet">
+  <w:style w:type="paragraph" w:styleId="IntenseQuote">
     <w:name w:val="Intense Quote"/>
-    <w:basedOn w:val="Norml"/>
-    <w:next w:val="Norml"/>
-    <w:link w:val="KiemeltidzetChar"/>
+    <w:basedOn w:val="Normal"/>
+    <w:next w:val="Normal"/>
+    <w:link w:val="IntenseQuoteChar"/>
     <w:uiPriority w:val="30"/>
     <w:qFormat/>
     <w:rsid w:val="00FD5A73"/>
@@ -4949,10 +4639,10 @@
       <w:color w:val="0F4761" w:themeColor="accent1" w:themeShade="BF"/>
     </w:rPr>
   </w:style>
-  <w:style w:type="character" w:customStyle="1" w:styleId="KiemeltidzetChar">
-    <w:name w:val="Kiemelt idézet Char"/>
-    <w:basedOn w:val="Bekezdsalapbettpusa"/>
-    <w:link w:val="Kiemeltidzet"/>
+  <w:style w:type="character" w:customStyle="1" w:styleId="IntenseQuoteChar">
+    <w:name w:val="Intense Quote Char"/>
+    <w:basedOn w:val="DefaultParagraphFont"/>
+    <w:link w:val="IntenseQuote"/>
     <w:uiPriority w:val="30"/>
     <w:rsid w:val="00FD5A73"/>
     <w:rPr>
@@ -4961,9 +4651,9 @@
       <w:color w:val="0F4761" w:themeColor="accent1" w:themeShade="BF"/>
     </w:rPr>
   </w:style>
-  <w:style w:type="character" w:styleId="Ershivatkozs">
+  <w:style w:type="character" w:styleId="IntenseReference">
     <w:name w:val="Intense Reference"/>
-    <w:basedOn w:val="Bekezdsalapbettpusa"/>
+    <w:basedOn w:val="DefaultParagraphFont"/>
     <w:uiPriority w:val="32"/>
     <w:qFormat/>
     <w:rsid w:val="00FD5A73"/>
@@ -4977,12 +4667,12 @@
   </w:style>
   <w:style w:type="character" w:customStyle="1" w:styleId="apple-converted-space">
     <w:name w:val="apple-converted-space"/>
-    <w:basedOn w:val="Bekezdsalapbettpusa"/>
+    <w:basedOn w:val="DefaultParagraphFont"/>
     <w:rsid w:val="00FE3B45"/>
   </w:style>
-  <w:style w:type="character" w:styleId="Kiemels2">
+  <w:style w:type="character" w:styleId="Strong">
     <w:name w:val="Strong"/>
-    <w:basedOn w:val="Bekezdsalapbettpusa"/>
+    <w:basedOn w:val="DefaultParagraphFont"/>
     <w:uiPriority w:val="22"/>
     <w:qFormat/>
     <w:rsid w:val="00FE3B45"/>
@@ -4991,9 +4681,9 @@
       <w:bCs/>
     </w:rPr>
   </w:style>
-  <w:style w:type="character" w:styleId="Hiperhivatkozs">
+  <w:style w:type="character" w:styleId="Hyperlink">
     <w:name w:val="Hyperlink"/>
-    <w:basedOn w:val="Bekezdsalapbettpusa"/>
+    <w:basedOn w:val="DefaultParagraphFont"/>
     <w:uiPriority w:val="99"/>
     <w:unhideWhenUsed/>
     <w:rsid w:val="00205B2C"/>
@@ -5002,9 +4692,9 @@
       <w:u w:val="single"/>
     </w:rPr>
   </w:style>
-  <w:style w:type="character" w:styleId="Feloldatlanmegemlts">
+  <w:style w:type="character" w:styleId="UnresolvedMention">
     <w:name w:val="Unresolved Mention"/>
-    <w:basedOn w:val="Bekezdsalapbettpusa"/>
+    <w:basedOn w:val="DefaultParagraphFont"/>
     <w:uiPriority w:val="99"/>
     <w:semiHidden/>
     <w:unhideWhenUsed/>
@@ -5014,10 +4704,10 @@
       <w:shd w:val="clear" w:color="auto" w:fill="E1DFDD"/>
     </w:rPr>
   </w:style>
-  <w:style w:type="paragraph" w:styleId="Irodalomjegyzk">
+  <w:style w:type="paragraph" w:styleId="Bibliography">
     <w:name w:val="Bibliography"/>
-    <w:basedOn w:val="Norml"/>
-    <w:next w:val="Norml"/>
+    <w:basedOn w:val="Normal"/>
+    <w:next w:val="Normal"/>
     <w:uiPriority w:val="37"/>
     <w:unhideWhenUsed/>
     <w:rsid w:val="002B3BFB"/>
@@ -5320,29 +5010,68 @@
 </a:theme>
 </file>
 
-<file path=word/webextensions/taskpanes.xml><?xml version="1.0" encoding="utf-8"?>
-<wetp:taskpanes xmlns:wetp="http://schemas.microsoft.com/office/webextensions/taskpanes/2010/11">
-  <wetp:taskpane dockstate="right" visibility="0" width="350" row="0">
-    <wetp:webextensionref xmlns:r="http://schemas.openxmlformats.org/officeDocument/2006/relationships" r:id="rId1"/>
-  </wetp:taskpane>
-</wetp:taskpanes>
+<file path=customXml/item1.xml><?xml version="1.0" encoding="utf-8"?>
+<b:Sources xmlns:b="http://schemas.openxmlformats.org/officeDocument/2006/bibliography" xmlns="http://schemas.openxmlformats.org/officeDocument/2006/bibliography" SelectedStyle="\APASixthEditionOfficeOnline.xsl" StyleName="APA" Version="6">
+  <b:Source>
+    <b:Tag>Phi20</b:Tag>
+    <b:SourceType>InternetSite</b:SourceType>
+    <b:Guid>{370EA8DA-55BD-47F2-A140-624A4CA438B9}</b:Guid>
+    <b:Author>
+      <b:Author>
+        <b:NameList>
+          <b:Person>
+            <b:Last>Ndikum</b:Last>
+            <b:First>Philip</b:First>
+          </b:Person>
+        </b:NameList>
+      </b:Author>
+    </b:Author>
+    <b:Title>Machine Learning Algorithms for Financial Asset Price Forecasting</b:Title>
+    <b:InternetSiteTitle>arxiv</b:InternetSiteTitle>
+    <b:Year>2020</b:Year>
+    <b:URL>https://arxiv.org/abs/2004.01504</b:URL>
+    <b:RefOrder>1</b:RefOrder>
+  </b:Source>
+  <b:Source>
+    <b:Tag>Alb23</b:Tag>
+    <b:SourceType>InternetSite</b:SourceType>
+    <b:Guid>{CAC6EDDE-0592-4C82-9906-7CB97CCD92C8}</b:Guid>
+    <b:Author>
+      <b:Author>
+        <b:NameList>
+          <b:Person>
+            <b:Last>Albert Wong</b:Last>
+            <b:First>Steven</b:First>
+            <b:Middle>Whang, Emilio Sagre, Niha Sachin, Gustavo Dutra, Yew-Wei Lim, Gaetan Hains, Youry Khmelevsky, Frank Zhang</b:Middle>
+          </b:Person>
+        </b:NameList>
+      </b:Author>
+    </b:Author>
+    <b:Title>Short-Term Stock Price Forecasting using exogenous variables and Machine Learning Algorithms</b:Title>
+    <b:InternetSiteTitle>Trading and Market Microstructure</b:InternetSiteTitle>
+    <b:Year>2023</b:Year>
+    <b:URL>https://arxiv.org/abs/2309.00618</b:URL>
+    <b:RefOrder>2</b:RefOrder>
+  </b:Source>
+</b:Sources>
 </file>
 
-<file path=word/webextensions/webextension1.xml><?xml version="1.0" encoding="utf-8"?>
-<we:webextension xmlns:we="http://schemas.microsoft.com/office/webextensions/webextension/2010/11" id="{0216BC73-9689-4AD0-8FA3-5E7E60634E87}">
-  <we:reference id="wa200010453" version="1.0.0.1" store="hu-HU" storeType="OMEX"/>
-  <we:alternateReferences>
-    <we:reference id="WA200010453" version="1.0.0.1" store="WA200010453" storeType="OMEX"/>
-  </we:alternateReferences>
-  <we:properties>
-    <we:property name="claude.fileId" value="&quot;655e0b50-5da2-4ea0-814f-f9d971ca5baf&quot;"/>
-  </we:properties>
-  <we:bindings/>
-  <we:snapshot xmlns:r="http://schemas.openxmlformats.org/officeDocument/2006/relationships"/>
-</we:webextension>
+<file path=customXml/item2.xml><?xml version="1.0" encoding="utf-8"?>
+<p:properties xmlns:p="http://schemas.microsoft.com/office/2006/metadata/properties" xmlns:xsi="http://www.w3.org/2001/XMLSchema-instance" xmlns:pc="http://schemas.microsoft.com/office/infopath/2007/PartnerControls">
+  <documentManagement/>
+</p:properties>
 </file>
 
-<file path=customXml/item1.xml><?xml version="1.0" encoding="utf-8"?>
+<file path=customXml/item3.xml><?xml version="1.0" encoding="utf-8"?>
+<?mso-contentType ?>
+<FormTemplates xmlns="http://schemas.microsoft.com/sharepoint/v3/contenttype/forms">
+  <Display>DocumentLibraryForm</Display>
+  <Edit>DocumentLibraryForm</Edit>
+  <New>DocumentLibraryForm</New>
+</FormTemplates>
+</file>
+
+<file path=customXml/item4.xml><?xml version="1.0" encoding="utf-8"?>
 <ct:contentTypeSchema xmlns:ct="http://schemas.microsoft.com/office/2006/metadata/contentType" xmlns:ma="http://schemas.microsoft.com/office/2006/metadata/properties/metaAttributes" ct:_="" ma:_="" ma:contentTypeName="Document" ma:contentTypeID="0x010100CA0648AB48CC2344B6C41470F89B25D4" ma:contentTypeVersion="4" ma:contentTypeDescription="Create a new document." ma:contentTypeScope="" ma:versionID="a660c338eb59bfff4af50e265a6ab854">
   <xsd:schema xmlns:xsd="http://www.w3.org/2001/XMLSchema" xmlns:xs="http://www.w3.org/2001/XMLSchema" xmlns:p="http://schemas.microsoft.com/office/2006/metadata/properties" xmlns:ns2="f3492271-d953-408b-9284-5d0a710cdb1a" targetNamespace="http://schemas.microsoft.com/office/2006/metadata/properties" ma:root="true" ma:fieldsID="5f8157e55ce76d062aad01a2da979587" ns2:_="">
     <xsd:import namespace="f3492271-d953-408b-9284-5d0a710cdb1a"/>
@@ -5486,68 +5215,32 @@
 </ct:contentTypeSchema>
 </file>
 
-<file path=customXml/item2.xml><?xml version="1.0" encoding="utf-8"?>
-<?mso-contentType ?>
-<FormTemplates xmlns="http://schemas.microsoft.com/sharepoint/v3/contenttype/forms">
-  <Display>DocumentLibraryForm</Display>
-  <Edit>DocumentLibraryForm</Edit>
-  <New>DocumentLibraryForm</New>
-</FormTemplates>
+<file path=customXml/itemProps1.xml><?xml version="1.0" encoding="utf-8"?>
+<ds:datastoreItem xmlns:ds="http://schemas.openxmlformats.org/officeDocument/2006/customXml" ds:itemID="{C8132FE0-DAB3-4537-BC70-39321B387155}">
+  <ds:schemaRefs>
+    <ds:schemaRef ds:uri="http://schemas.openxmlformats.org/officeDocument/2006/bibliography"/>
+  </ds:schemaRefs>
+</ds:datastoreItem>
 </file>
 
-<file path=customXml/item3.xml><?xml version="1.0" encoding="utf-8"?>
-<p:properties xmlns:p="http://schemas.microsoft.com/office/2006/metadata/properties" xmlns:xsi="http://www.w3.org/2001/XMLSchema-instance" xmlns:pc="http://schemas.microsoft.com/office/infopath/2007/PartnerControls">
-  <documentManagement/>
-</p:properties>
+<file path=customXml/itemProps2.xml><?xml version="1.0" encoding="utf-8"?>
+<ds:datastoreItem xmlns:ds="http://schemas.openxmlformats.org/officeDocument/2006/customXml" ds:itemID="{A8834EE7-90FD-4006-BF8D-556140116A2D}">
+  <ds:schemaRefs>
+    <ds:schemaRef ds:uri="http://schemas.microsoft.com/office/2006/metadata/properties"/>
+    <ds:schemaRef ds:uri="http://schemas.microsoft.com/office/infopath/2007/PartnerControls"/>
+  </ds:schemaRefs>
+</ds:datastoreItem>
 </file>
 
-<file path=customXml/item4.xml><?xml version="1.0" encoding="utf-8"?>
-<b:Sources xmlns:b="http://schemas.openxmlformats.org/officeDocument/2006/bibliography" xmlns="http://schemas.openxmlformats.org/officeDocument/2006/bibliography" SelectedStyle="\APASixthEditionOfficeOnline.xsl" StyleName="APA" Version="6">
-  <b:Source>
-    <b:Tag>Phi20</b:Tag>
-    <b:SourceType>InternetSite</b:SourceType>
-    <b:Guid>{370EA8DA-55BD-47F2-A140-624A4CA438B9}</b:Guid>
-    <b:Author>
-      <b:Author>
-        <b:NameList>
-          <b:Person>
-            <b:Last>Ndikum</b:Last>
-            <b:First>Philip</b:First>
-          </b:Person>
-        </b:NameList>
-      </b:Author>
-    </b:Author>
-    <b:Title>Machine Learning Algorithms for Financial Asset Price Forecasting</b:Title>
-    <b:InternetSiteTitle>arxiv</b:InternetSiteTitle>
-    <b:Year>2020</b:Year>
-    <b:URL>https://arxiv.org/abs/2004.01504</b:URL>
-    <b:RefOrder>1</b:RefOrder>
-  </b:Source>
-  <b:Source>
-    <b:Tag>Alb23</b:Tag>
-    <b:SourceType>InternetSite</b:SourceType>
-    <b:Guid>{CAC6EDDE-0592-4C82-9906-7CB97CCD92C8}</b:Guid>
-    <b:Author>
-      <b:Author>
-        <b:NameList>
-          <b:Person>
-            <b:Last>Albert Wong</b:Last>
-            <b:First>Steven</b:First>
-            <b:Middle>Whang, Emilio Sagre, Niha Sachin, Gustavo Dutra, Yew-Wei Lim, Gaetan Hains, Youry Khmelevsky, Frank Zhang</b:Middle>
-          </b:Person>
-        </b:NameList>
-      </b:Author>
-    </b:Author>
-    <b:Title>Short-Term Stock Price Forecasting using exogenous variables and Machine Learning Algorithms</b:Title>
-    <b:InternetSiteTitle>Trading and Market Microstructure</b:InternetSiteTitle>
-    <b:Year>2023</b:Year>
-    <b:URL>https://arxiv.org/abs/2309.00618</b:URL>
-    <b:RefOrder>2</b:RefOrder>
-  </b:Source>
-</b:Sources>
+<file path=customXml/itemProps3.xml><?xml version="1.0" encoding="utf-8"?>
+<ds:datastoreItem xmlns:ds="http://schemas.openxmlformats.org/officeDocument/2006/customXml" ds:itemID="{09ECDD89-9376-4D0D-8E13-549D769B12AB}">
+  <ds:schemaRefs>
+    <ds:schemaRef ds:uri="http://schemas.microsoft.com/sharepoint/v3/contenttype/forms"/>
+  </ds:schemaRefs>
+</ds:datastoreItem>
 </file>
 
-<file path=customXml/itemProps1.xml><?xml version="1.0" encoding="utf-8"?>
+<file path=customXml/itemProps4.xml><?xml version="1.0" encoding="utf-8"?>
 <ds:datastoreItem xmlns:ds="http://schemas.openxmlformats.org/officeDocument/2006/customXml" ds:itemID="{0646EBB2-5A1D-42FE-B060-FCDBA64E390D}">
   <ds:schemaRefs>
     <ds:schemaRef ds:uri="http://schemas.microsoft.com/office/2006/metadata/contentType"/>
@@ -5563,29 +5256,4 @@
     <ds:schemaRef ds:uri="http://schemas.microsoft.com/internal/obd"/>
   </ds:schemaRefs>
 </ds:datastoreItem>
-</file>
-
-<file path=customXml/itemProps2.xml><?xml version="1.0" encoding="utf-8"?>
-<ds:datastoreItem xmlns:ds="http://schemas.openxmlformats.org/officeDocument/2006/customXml" ds:itemID="{09ECDD89-9376-4D0D-8E13-549D769B12AB}">
-  <ds:schemaRefs>
-    <ds:schemaRef ds:uri="http://schemas.microsoft.com/sharepoint/v3/contenttype/forms"/>
-  </ds:schemaRefs>
-</ds:datastoreItem>
-</file>
-
-<file path=customXml/itemProps3.xml><?xml version="1.0" encoding="utf-8"?>
-<ds:datastoreItem xmlns:ds="http://schemas.openxmlformats.org/officeDocument/2006/customXml" ds:itemID="{A8834EE7-90FD-4006-BF8D-556140116A2D}">
-  <ds:schemaRefs>
-    <ds:schemaRef ds:uri="http://schemas.microsoft.com/office/2006/metadata/properties"/>
-    <ds:schemaRef ds:uri="http://schemas.microsoft.com/office/infopath/2007/PartnerControls"/>
-  </ds:schemaRefs>
-</ds:datastoreItem>
-</file>
-
-<file path=customXml/itemProps4.xml><?xml version="1.0" encoding="utf-8"?>
-<ds:datastoreItem xmlns:ds="http://schemas.openxmlformats.org/officeDocument/2006/customXml" ds:itemID="{C8132FE0-DAB3-4537-BC70-39321B387155}">
-  <ds:schemaRefs>
-    <ds:schemaRef ds:uri="http://schemas.openxmlformats.org/officeDocument/2006/bibliography"/>
-  </ds:schemaRefs>
-</ds:datastoreItem>
 </file>
</xml_diff>

<commit_message>
3rd time's the charm
</commit_message>
<xml_diff>
--- a/datalabtasks_deliverables/Task 6 Group Project Proposals/ProjectProposal_Template.docx
+++ b/datalabtasks_deliverables/Task 6 Group Project Proposals/ProjectProposal_Template.docx
@@ -262,7 +262,7 @@
     </w:p>
     <w:p>
       <w:pPr>
-        <w:pStyle w:val="ListParagraph"/>
+        <w:pStyle w:val="Listaszerbekezds"/>
         <w:numPr>
           <w:ilvl w:val="0"/>
           <w:numId w:val="3"/>
@@ -396,21 +396,21 @@
       </w:r>
       <w:r>
         <w:rPr>
-          <w:rStyle w:val="Strong"/>
+          <w:rStyle w:val="Kiemels2"/>
           <w:rFonts w:cs="Arial"/>
         </w:rPr>
         <w:t>exogenous</w:t>
       </w:r>
       <w:r>
         <w:rPr>
-          <w:rStyle w:val="Strong"/>
+          <w:rStyle w:val="Kiemels2"/>
           <w:rFonts w:cs="Arial"/>
         </w:rPr>
         <w:t xml:space="preserve"> </w:t>
       </w:r>
       <w:r>
         <w:rPr>
-          <w:rStyle w:val="Strong"/>
+          <w:rStyle w:val="Kiemels2"/>
           <w:rFonts w:cs="Arial"/>
           <w:b w:val="0"/>
           <w:bCs w:val="0"/>
@@ -494,29 +494,7 @@
           <w:lang w:eastAsia="en-GB"/>
           <w14:ligatures w14:val="none"/>
         </w:rPr>
-        <w:t xml:space="preserve"> stock market </w:t>
-      </w:r>
-      <w:proofErr w:type="spellStart"/>
-      <w:r>
-        <w:rPr>
-          <w:rFonts w:eastAsia="Times New Roman" w:cs="Times New Roman"/>
-          <w:color w:val="000000"/>
-          <w:kern w:val="0"/>
-          <w:lang w:eastAsia="en-GB"/>
-          <w14:ligatures w14:val="none"/>
-        </w:rPr>
-        <w:t>behaviour</w:t>
-      </w:r>
-      <w:proofErr w:type="spellEnd"/>
-      <w:r>
-        <w:rPr>
-          <w:rFonts w:eastAsia="Times New Roman" w:cs="Times New Roman"/>
-          <w:color w:val="000000"/>
-          <w:kern w:val="0"/>
-          <w:lang w:eastAsia="en-GB"/>
-          <w14:ligatures w14:val="none"/>
-        </w:rPr>
-        <w:t xml:space="preserve"> and help users analyze market better. </w:t>
+        <w:t xml:space="preserve"> stock market behaviour and help users analyze market better. </w:t>
       </w:r>
     </w:p>
     <w:p>
@@ -585,7 +563,7 @@
     </w:p>
     <w:p>
       <w:pPr>
-        <w:pStyle w:val="ListParagraph"/>
+        <w:pStyle w:val="Listaszerbekezds"/>
         <w:numPr>
           <w:ilvl w:val="0"/>
           <w:numId w:val="3"/>
@@ -993,7 +971,7 @@
     </w:p>
     <w:p>
       <w:pPr>
-        <w:pStyle w:val="ListParagraph"/>
+        <w:pStyle w:val="Listaszerbekezds"/>
         <w:numPr>
           <w:ilvl w:val="0"/>
           <w:numId w:val="3"/>
@@ -1037,80 +1015,380 @@
           <w:lang w:eastAsia="en-GB"/>
           <w14:ligatures w14:val="none"/>
         </w:rPr>
-        <w:t>This section should outline the </w:t>
-      </w:r>
-      <w:r>
-        <w:rPr>
-          <w:rFonts w:eastAsia="Times New Roman" w:cs="Times New Roman"/>
-          <w:b/>
-          <w:bCs/>
-          <w:color w:val="000000"/>
-          <w:kern w:val="0"/>
-          <w:lang w:eastAsia="en-GB"/>
-          <w14:ligatures w14:val="none"/>
-        </w:rPr>
-        <w:t>datasets</w:t>
-      </w:r>
-      <w:r>
-        <w:rPr>
-          <w:rFonts w:eastAsia="Times New Roman" w:cs="Times New Roman"/>
-          <w:color w:val="000000"/>
-          <w:kern w:val="0"/>
-          <w:lang w:eastAsia="en-GB"/>
-          <w14:ligatures w14:val="none"/>
-        </w:rPr>
-        <w:t> you plan to use for the project. Begin by describing the </w:t>
-      </w:r>
-      <w:r>
-        <w:rPr>
-          <w:rFonts w:eastAsia="Times New Roman" w:cs="Times New Roman"/>
-          <w:b/>
-          <w:bCs/>
-          <w:color w:val="000000"/>
-          <w:kern w:val="0"/>
-          <w:lang w:eastAsia="en-GB"/>
-          <w14:ligatures w14:val="none"/>
-        </w:rPr>
-        <w:t>data sources</w:t>
-      </w:r>
-      <w:r>
-        <w:rPr>
-          <w:rFonts w:eastAsia="Times New Roman" w:cs="Times New Roman"/>
-          <w:color w:val="000000"/>
-          <w:kern w:val="0"/>
-          <w:lang w:eastAsia="en-GB"/>
-          <w14:ligatures w14:val="none"/>
-        </w:rPr>
-        <w:t>—include relevant details such as where the data is coming from, how it’s structured, and its key attributes or features.</w:t>
-      </w:r>
-      <w:r>
-        <w:rPr>
-          <w:rFonts w:eastAsia="Times New Roman" w:cs="Times New Roman"/>
-          <w:color w:val="000000"/>
-          <w:kern w:val="0"/>
-          <w:lang w:eastAsia="en-GB"/>
-          <w14:ligatures w14:val="none"/>
-        </w:rPr>
-        <w:t xml:space="preserve"> </w:t>
-      </w:r>
-      <w:r>
-        <w:rPr>
-          <w:rFonts w:eastAsia="Times New Roman" w:cs="Times New Roman"/>
-          <w:color w:val="000000"/>
-          <w:kern w:val="0"/>
-          <w:lang w:eastAsia="en-GB"/>
-          <w14:ligatures w14:val="none"/>
-        </w:rPr>
-        <w:t>Discuss any potential data quality issues (e.g., missing values, outliers) and how these will be handled in the pre-processing phase..</w:t>
-      </w:r>
-    </w:p>
-    <w:p>
-      <w:pPr>
-        <w:pStyle w:val="ListParagraph"/>
+        <w:t>This project forecasts the next-day closing price of Microsoft Corporation (MSFT) stock using a multi-source approach that combines stock-specific trading data with market indices, macroeconomic indicators, commodity prices, and exchange rates. Equity prices are shaped by sector-wide trends, monetary policy, currency movements, and commodity markets, so incorporating these external signals should improve predictive power over a univariate baseline.</w:t>
+      </w:r>
+    </w:p>
+    <w:p>
+      <w:pPr>
+        <w:spacing w:before="100" w:beforeAutospacing="1" w:after="100" w:afterAutospacing="1" w:line="240" w:lineRule="auto"/>
+        <w:rPr>
+          <w:rFonts w:eastAsia="Times New Roman" w:cs="Times New Roman"/>
+          <w:color w:val="000000"/>
+          <w:kern w:val="0"/>
+          <w:lang w:eastAsia="en-GB"/>
+          <w14:ligatures w14:val="none"/>
+        </w:rPr>
+      </w:pPr>
+      <w:r>
+        <w:rPr>
+          <w:rFonts w:eastAsia="Times New Roman" w:cs="Times New Roman"/>
+          <w:color w:val="000000"/>
+          <w:kern w:val="0"/>
+          <w:lang w:eastAsia="en-GB"/>
+          <w14:ligatures w14:val="none"/>
+        </w:rPr>
+        <w:t>The project uses eight datasets provided within the block's data package, all spanning approximately February 2015 through February 2025. The primary dataset is MSFT daily stock data (2,515 records) with Open, High, Low, Close, Volume, and Transactions — Close being the target variable. Supplementary daily datasets include the Nasdaq Composite, Dow Jones, and S&amp;P 500 indices for broad market sentiment; crude oil (WTI) and gold (XAU/USD) for commodity dynamics; and USD exchange rates against ten major currencies for international exposure. A macroeconomic indicators dataset provides twelve variables (GDP Growth, Unemployment, CPI, Fed Funds Rate, VIX, Treasury Yields, among others) at mixed frequencies, resulting in substantial null values that will require forward-filling during preprocessing.</w:t>
+      </w:r>
+    </w:p>
+    <w:p>
+      <w:pPr>
+        <w:spacing w:before="100" w:beforeAutospacing="1" w:after="100" w:afterAutospacing="1" w:line="240" w:lineRule="auto"/>
+        <w:rPr>
+          <w:rFonts w:eastAsia="Times New Roman" w:cs="Times New Roman"/>
+          <w:color w:val="000000"/>
+          <w:kern w:val="0"/>
+          <w:lang w:eastAsia="en-GB"/>
+          <w14:ligatures w14:val="none"/>
+        </w:rPr>
+      </w:pPr>
+      <w:r>
+        <w:rPr>
+          <w:rFonts w:eastAsia="Times New Roman" w:cs="Times New Roman"/>
+          <w:color w:val="000000"/>
+          <w:kern w:val="0"/>
+          <w:lang w:eastAsia="en-GB"/>
+          <w14:ligatures w14:val="none"/>
+        </w:rPr>
+        <w:t>The daily datasets contain no missing values and no unexpected temporal gaps — all gaps correspond to standard weekends and holidays. Eight MSFT trading days show extreme returns exceeding 8%, mostly during the March 2020 COVID-19 onset. These are genuine market events and will be retained, with robust scaling used to limit their influence during training. No duplicate dates or data inconsistencies were found.</w:t>
+      </w:r>
+    </w:p>
+    <w:p>
+      <w:pPr>
+        <w:pStyle w:val="Listaszerbekezds"/>
         <w:numPr>
           <w:ilvl w:val="0"/>
           <w:numId w:val="3"/>
         </w:numPr>
+        <w:rPr>
+          <w:b/>
+          <w:bCs/>
+          <w:sz w:val="28"/>
+          <w:szCs w:val="28"/>
+        </w:rPr>
+      </w:pPr>
+      <w:r>
+        <w:rPr>
+          <w:b/>
+          <w:bCs/>
+          <w:sz w:val="28"/>
+          <w:szCs w:val="28"/>
+        </w:rPr>
+        <w:t>Methodology</w:t>
+      </w:r>
+    </w:p>
+    <w:p>
+      <w:pPr>
+        <w:spacing w:before="100" w:beforeAutospacing="1" w:after="100" w:afterAutospacing="1" w:line="240" w:lineRule="auto"/>
+        <w:rPr>
+          <w:rFonts w:eastAsia="Times New Roman" w:cs="Times New Roman"/>
+          <w:color w:val="000000"/>
+          <w:kern w:val="0"/>
+          <w:lang w:eastAsia="en-GB"/>
+          <w14:ligatures w14:val="none"/>
+        </w:rPr>
+      </w:pPr>
+      <w:r>
+        <w:rPr>
+          <w:rFonts w:eastAsia="Times New Roman" w:cs="Times New Roman"/>
+          <w:b/>
+          <w:bCs/>
+          <w:color w:val="000000"/>
+          <w:kern w:val="0"/>
+          <w:lang w:eastAsia="en-GB"/>
+          <w14:ligatures w14:val="none"/>
+        </w:rPr>
+        <w:t>2.1 Data Collection and Preprocessing</w:t>
+      </w:r>
+    </w:p>
+    <w:p>
+      <w:pPr>
+        <w:spacing w:before="100" w:beforeAutospacing="1" w:after="100" w:afterAutospacing="1" w:line="240" w:lineRule="auto"/>
+        <w:rPr>
+          <w:rFonts w:eastAsia="Times New Roman" w:cs="Times New Roman"/>
+          <w:color w:val="000000"/>
+          <w:kern w:val="0"/>
+          <w:lang w:eastAsia="en-GB"/>
+          <w14:ligatures w14:val="none"/>
+        </w:rPr>
+      </w:pPr>
+      <w:r>
+        <w:rPr>
+          <w:rFonts w:eastAsia="Times New Roman" w:cs="Times New Roman"/>
+          <w:color w:val="000000"/>
+          <w:kern w:val="0"/>
+          <w:lang w:eastAsia="en-GB"/>
+          <w14:ligatures w14:val="none"/>
+        </w:rPr>
+        <w:t>All CSV files will be loaded into a PostgreSQL database. The MSFT date range serves as the reference index to which all other datasets are aligned. Macroeconomic indicators are forward-filled to daily granularity so the model only accesses information available at prediction time, avoiding lookahead bias.</w:t>
+      </w:r>
+    </w:p>
+    <w:p>
+      <w:pPr>
+        <w:spacing w:before="100" w:beforeAutospacing="1" w:after="100" w:afterAutospacing="1" w:line="240" w:lineRule="auto"/>
+        <w:rPr>
+          <w:rFonts w:eastAsia="Times New Roman" w:cs="Times New Roman"/>
+          <w:color w:val="000000"/>
+          <w:kern w:val="0"/>
+          <w:lang w:eastAsia="en-GB"/>
+          <w14:ligatures w14:val="none"/>
+        </w:rPr>
+      </w:pPr>
+      <w:r>
+        <w:rPr>
+          <w:rFonts w:eastAsia="Times New Roman" w:cs="Times New Roman"/>
+          <w:color w:val="000000"/>
+          <w:kern w:val="0"/>
+          <w:lang w:eastAsia="en-GB"/>
+          <w14:ligatures w14:val="none"/>
+        </w:rPr>
+        <w:lastRenderedPageBreak/>
+        <w:t>Engineered features will span five categories: lag features (1- to 21-day returns), rolling statistics (moving averages, volatility), technical indicators (RSI, MACD, Bollinger Bands, ATR), cross-asset features (index returns, commodity and currency changes, macro levels), and calendar features (day of week, month, quarter). Numerical features will be standardized using a robust scaler to limit outlier influence; categorical features will be one-hot encoded.</w:t>
+      </w:r>
+    </w:p>
+    <w:p>
+      <w:pPr>
+        <w:spacing w:before="100" w:beforeAutospacing="1" w:after="100" w:afterAutospacing="1" w:line="240" w:lineRule="auto"/>
+        <w:rPr>
+          <w:rFonts w:eastAsia="Times New Roman" w:cs="Times New Roman"/>
+          <w:color w:val="000000"/>
+          <w:kern w:val="0"/>
+          <w:lang w:eastAsia="en-GB"/>
+          <w14:ligatures w14:val="none"/>
+        </w:rPr>
+      </w:pPr>
+      <w:r>
+        <w:rPr>
+          <w:rFonts w:eastAsia="Times New Roman" w:cs="Times New Roman"/>
+          <w:b/>
+          <w:bCs/>
+          <w:color w:val="000000"/>
+          <w:kern w:val="0"/>
+          <w:lang w:eastAsia="en-GB"/>
+          <w14:ligatures w14:val="none"/>
+        </w:rPr>
+        <w:t>2.2 Model Selection and Training</w:t>
+      </w:r>
+    </w:p>
+    <w:p>
+      <w:pPr>
+        <w:spacing w:before="100" w:beforeAutospacing="1" w:after="100" w:afterAutospacing="1" w:line="240" w:lineRule="auto"/>
+        <w:rPr>
+          <w:rFonts w:eastAsia="Times New Roman" w:cs="Times New Roman"/>
+          <w:color w:val="000000"/>
+          <w:kern w:val="0"/>
+          <w:lang w:eastAsia="en-GB"/>
+          <w14:ligatures w14:val="none"/>
+        </w:rPr>
+      </w:pPr>
+      <w:r>
+        <w:rPr>
+          <w:rFonts w:eastAsia="Times New Roman" w:cs="Times New Roman"/>
+          <w:color w:val="000000"/>
+          <w:kern w:val="0"/>
+          <w:lang w:eastAsia="en-GB"/>
+          <w14:ligatures w14:val="none"/>
+        </w:rPr>
+        <w:t xml:space="preserve">The task is a supervised regression problem: predict day </w:t>
+      </w:r>
+      <w:r>
+        <w:rPr>
+          <w:rFonts w:eastAsia="Times New Roman" w:cs="Times New Roman"/>
+          <w:i/>
+          <w:iCs/>
+          <w:color w:val="000000"/>
+          <w:kern w:val="0"/>
+          <w:lang w:eastAsia="en-GB"/>
+          <w14:ligatures w14:val="none"/>
+        </w:rPr>
+        <w:t>t+1</w:t>
+      </w:r>
+      <w:r>
+        <w:rPr>
+          <w:rFonts w:eastAsia="Times New Roman" w:cs="Times New Roman"/>
+          <w:color w:val="000000"/>
+          <w:kern w:val="0"/>
+          <w:lang w:eastAsia="en-GB"/>
+          <w14:ligatures w14:val="none"/>
+        </w:rPr>
+        <w:t xml:space="preserve"> closing price from features available up to day </w:t>
+      </w:r>
+      <w:r>
+        <w:rPr>
+          <w:rFonts w:eastAsia="Times New Roman" w:cs="Times New Roman"/>
+          <w:i/>
+          <w:iCs/>
+          <w:color w:val="000000"/>
+          <w:kern w:val="0"/>
+          <w:lang w:eastAsia="en-GB"/>
+          <w14:ligatures w14:val="none"/>
+        </w:rPr>
+        <w:t>t</w:t>
+      </w:r>
+      <w:r>
+        <w:rPr>
+          <w:rFonts w:eastAsia="Times New Roman" w:cs="Times New Roman"/>
+          <w:color w:val="000000"/>
+          <w:kern w:val="0"/>
+          <w:lang w:eastAsia="en-GB"/>
+          <w14:ligatures w14:val="none"/>
+        </w:rPr>
+        <w:t>. The baseline is a naive persistence model (tomorrow's close equals today's close), which all subsequent models must outperform.</w:t>
+      </w:r>
+    </w:p>
+    <w:p>
+      <w:pPr>
+        <w:spacing w:before="100" w:beforeAutospacing="1" w:after="100" w:afterAutospacing="1" w:line="240" w:lineRule="auto"/>
+        <w:rPr>
+          <w:rFonts w:eastAsia="Times New Roman" w:cs="Times New Roman"/>
+          <w:color w:val="000000"/>
+          <w:kern w:val="0"/>
+          <w:lang w:eastAsia="en-GB"/>
+          <w14:ligatures w14:val="none"/>
+        </w:rPr>
+      </w:pPr>
+      <w:r>
+        <w:rPr>
+          <w:rFonts w:eastAsia="Times New Roman" w:cs="Times New Roman"/>
+          <w:color w:val="000000"/>
+          <w:kern w:val="0"/>
+          <w:lang w:eastAsia="en-GB"/>
+          <w14:ligatures w14:val="none"/>
+        </w:rPr>
+        <w:t>Three base models are selected for complementary strengths: Ridge Regression provides stable, interpretable linear predictions and handles multicollinearity well; Random Forest captures non-linear interactions through decorrelated trees and resists noisy features; XGBoost adds sequential error-correction by focusing on residuals, excelling at subtle patterns the others miss. All three are combined into a stacking ensemble with a linear meta-learner trained on out-of-fold predictions. Ridge anchors the ensemble with low-variance output, Random Forest adds non-linear capacity, and XGBoost captures residual complexity — when one underperforms in a given market regime, the others compensate.</w:t>
+      </w:r>
+    </w:p>
+    <w:p>
+      <w:pPr>
+        <w:spacing w:before="100" w:beforeAutospacing="1" w:after="100" w:afterAutospacing="1" w:line="240" w:lineRule="auto"/>
+        <w:rPr>
+          <w:rFonts w:eastAsia="Times New Roman" w:cs="Times New Roman"/>
+          <w:color w:val="000000"/>
+          <w:kern w:val="0"/>
+          <w:lang w:eastAsia="en-GB"/>
+          <w14:ligatures w14:val="none"/>
+        </w:rPr>
+      </w:pPr>
+      <w:r>
+        <w:rPr>
+          <w:rFonts w:eastAsia="Times New Roman" w:cs="Times New Roman"/>
+          <w:color w:val="000000"/>
+          <w:kern w:val="0"/>
+          <w:lang w:eastAsia="en-GB"/>
+          <w14:ligatures w14:val="none"/>
+        </w:rPr>
+        <w:t>A time-based split prevents lookahead bias: training (~70%, 2015–mid-2021), validation (~15%, mid-2021–mid-2023), and test (~15%, mid-2023–2025). Walk-forward cross-validation simulates periodic retraining during the training phase.</w:t>
+      </w:r>
+    </w:p>
+    <w:p>
+      <w:pPr>
+        <w:spacing w:before="100" w:beforeAutospacing="1" w:after="100" w:afterAutospacing="1" w:line="240" w:lineRule="auto"/>
+        <w:rPr>
+          <w:rFonts w:eastAsia="Times New Roman" w:cs="Times New Roman"/>
+          <w:color w:val="000000"/>
+          <w:kern w:val="0"/>
+          <w:lang w:eastAsia="en-GB"/>
+          <w14:ligatures w14:val="none"/>
+        </w:rPr>
+      </w:pPr>
+      <w:r>
+        <w:rPr>
+          <w:rFonts w:eastAsia="Times New Roman" w:cs="Times New Roman"/>
+          <w:b/>
+          <w:bCs/>
+          <w:color w:val="000000"/>
+          <w:kern w:val="0"/>
+          <w:lang w:eastAsia="en-GB"/>
+          <w14:ligatures w14:val="none"/>
+        </w:rPr>
+        <w:t>2.3 Evaluation Metrics</w:t>
+      </w:r>
+    </w:p>
+    <w:p>
+      <w:pPr>
+        <w:spacing w:before="100" w:beforeAutospacing="1" w:after="100" w:afterAutospacing="1" w:line="240" w:lineRule="auto"/>
+        <w:rPr>
+          <w:rFonts w:eastAsia="Times New Roman" w:cs="Times New Roman"/>
+          <w:color w:val="000000"/>
+          <w:kern w:val="0"/>
+          <w:lang w:eastAsia="en-GB"/>
+          <w14:ligatures w14:val="none"/>
+        </w:rPr>
+      </w:pPr>
+      <w:r>
+        <w:rPr>
+          <w:rFonts w:eastAsia="Times New Roman" w:cs="Times New Roman"/>
+          <w:color w:val="000000"/>
+          <w:kern w:val="0"/>
+          <w:lang w:eastAsia="en-GB"/>
+          <w14:ligatures w14:val="none"/>
+        </w:rPr>
+        <w:t>Primary metrics are MAE, RMSE, MAPE, and R². Z-scores of prediction errors will flag statistically anomalous forecasts by standardizing each error relative to the distribution, identifying predictions outside expected bounds (|z| &gt; 2) for both evaluation and as a runtime confidence warning on the dashboard. Directional accuracy measures how often the predicted price direction matches reality. All metrics are benchmarked against the naive baseline. Error analysis will examine whether failures cluster around specific market events or volatility regimes to inform further iteration.</w:t>
+      </w:r>
+    </w:p>
+    <w:p>
+      <w:pPr>
+        <w:spacing w:before="100" w:beforeAutospacing="1" w:after="100" w:afterAutospacing="1" w:line="240" w:lineRule="auto"/>
+        <w:rPr>
+          <w:rFonts w:eastAsia="Times New Roman" w:cs="Times New Roman"/>
+          <w:color w:val="000000"/>
+          <w:kern w:val="0"/>
+          <w:lang w:eastAsia="en-GB"/>
+          <w14:ligatures w14:val="none"/>
+        </w:rPr>
+      </w:pPr>
+      <w:r>
+        <w:rPr>
+          <w:rFonts w:eastAsia="Times New Roman" w:cs="Times New Roman"/>
+          <w:b/>
+          <w:bCs/>
+          <w:color w:val="000000"/>
+          <w:kern w:val="0"/>
+          <w:lang w:eastAsia="en-GB"/>
+          <w14:ligatures w14:val="none"/>
+        </w:rPr>
+        <w:t>2.4 Deployment</w:t>
+      </w:r>
+    </w:p>
+    <w:p>
+      <w:pPr>
+        <w:spacing w:before="100" w:beforeAutospacing="1" w:after="100" w:afterAutospacing="1" w:line="240" w:lineRule="auto"/>
+        <w:rPr>
+          <w:rFonts w:eastAsia="Times New Roman" w:cs="Times New Roman"/>
+          <w:color w:val="000000"/>
+          <w:kern w:val="0"/>
+          <w:lang w:eastAsia="en-GB"/>
+          <w14:ligatures w14:val="none"/>
+        </w:rPr>
+      </w:pPr>
+      <w:r>
+        <w:rPr>
+          <w:rFonts w:eastAsia="Times New Roman" w:cs="Times New Roman"/>
+          <w:color w:val="000000"/>
+          <w:kern w:val="0"/>
+          <w:lang w:eastAsia="en-GB"/>
+          <w14:ligatures w14:val="none"/>
+        </w:rPr>
+        <w:t>The ensemble will be deployed within a Streamlit dashboard following a three-tier architecture: a PostgreSQL data layer, a model layer that applies the same preprocessing pipeline at inference time, and a presentation layer with interactive visualizations of prices, predictions, feature importance, and error diagnostics. The entire stack will be containerized with Docker Compose, and a README with Poetry lock file will ensure reproducibility.</w:t>
+      </w:r>
+    </w:p>
+    <w:p>
+      <w:pPr>
+        <w:pStyle w:val="Listaszerbekezds"/>
+        <w:numPr>
+          <w:ilvl w:val="0"/>
+          <w:numId w:val="3"/>
+        </w:numPr>
+        <w:spacing w:before="100" w:beforeAutospacing="1" w:after="100" w:afterAutospacing="1" w:line="240" w:lineRule="auto"/>
         <w:rPr>
           <w:b/>
           <w:bCs/>
@@ -1127,304 +1405,7 @@
           <w:szCs w:val="28"/>
           <w:lang w:val="en-GB"/>
         </w:rPr>
-        <w:t>Methodology</w:t>
-      </w:r>
-    </w:p>
-    <w:p>
-      <w:pPr>
-        <w:spacing w:before="100" w:beforeAutospacing="1" w:after="100" w:afterAutospacing="1" w:line="240" w:lineRule="auto"/>
-        <w:rPr>
-          <w:rFonts w:eastAsia="Times New Roman" w:cs="Times New Roman"/>
-          <w:color w:val="000000"/>
-          <w:kern w:val="0"/>
-          <w:lang w:eastAsia="en-GB"/>
-          <w14:ligatures w14:val="none"/>
-        </w:rPr>
-      </w:pPr>
-      <w:r>
-        <w:rPr>
-          <w:rFonts w:eastAsia="Times New Roman" w:cs="Times New Roman"/>
-          <w:color w:val="000000"/>
-          <w:kern w:val="0"/>
-          <w:lang w:eastAsia="en-GB"/>
-          <w14:ligatures w14:val="none"/>
-        </w:rPr>
-        <w:t>In this section, describe the </w:t>
-      </w:r>
-      <w:r>
-        <w:rPr>
-          <w:rFonts w:eastAsia="Times New Roman" w:cs="Times New Roman"/>
-          <w:b/>
-          <w:bCs/>
-          <w:color w:val="000000"/>
-          <w:kern w:val="0"/>
-          <w:lang w:eastAsia="en-GB"/>
-          <w14:ligatures w14:val="none"/>
-        </w:rPr>
-        <w:t>approach</w:t>
-      </w:r>
-      <w:r>
-        <w:rPr>
-          <w:rFonts w:eastAsia="Times New Roman" w:cs="Times New Roman"/>
-          <w:color w:val="000000"/>
-          <w:kern w:val="0"/>
-          <w:lang w:eastAsia="en-GB"/>
-          <w14:ligatures w14:val="none"/>
-        </w:rPr>
-        <w:t> your team will take to solve the problem using machine learning techniques. Break it down into clearly defined steps:</w:t>
-      </w:r>
-    </w:p>
-    <w:p>
-      <w:pPr>
-        <w:numPr>
-          <w:ilvl w:val="0"/>
-          <w:numId w:val="4"/>
-        </w:numPr>
-        <w:spacing w:before="100" w:beforeAutospacing="1" w:after="100" w:afterAutospacing="1" w:line="240" w:lineRule="auto"/>
-        <w:rPr>
-          <w:rFonts w:eastAsia="Times New Roman" w:cs="Times New Roman"/>
-          <w:color w:val="000000"/>
-          <w:kern w:val="0"/>
-          <w:lang w:eastAsia="en-GB"/>
-          <w14:ligatures w14:val="none"/>
-        </w:rPr>
-      </w:pPr>
-      <w:r>
-        <w:rPr>
-          <w:rFonts w:eastAsia="Times New Roman" w:cs="Times New Roman"/>
-          <w:b/>
-          <w:bCs/>
-          <w:color w:val="000000"/>
-          <w:kern w:val="0"/>
-          <w:lang w:eastAsia="en-GB"/>
-          <w14:ligatures w14:val="none"/>
-        </w:rPr>
-        <w:t>Data Collection &amp; Pre-processing</w:t>
-      </w:r>
-      <w:r>
-        <w:rPr>
-          <w:rFonts w:eastAsia="Times New Roman" w:cs="Times New Roman"/>
-          <w:color w:val="000000"/>
-          <w:kern w:val="0"/>
-          <w:lang w:eastAsia="en-GB"/>
-          <w14:ligatures w14:val="none"/>
-        </w:rPr>
-        <w:t>: Explain how you will gather and clean the data, handle missing values, and address any inconsistencies or biases.</w:t>
-      </w:r>
-    </w:p>
-    <w:p>
-      <w:pPr>
-        <w:numPr>
-          <w:ilvl w:val="0"/>
-          <w:numId w:val="4"/>
-        </w:numPr>
-        <w:spacing w:before="100" w:beforeAutospacing="1" w:after="100" w:afterAutospacing="1" w:line="240" w:lineRule="auto"/>
-        <w:rPr>
-          <w:rFonts w:eastAsia="Times New Roman" w:cs="Times New Roman"/>
-          <w:color w:val="000000"/>
-          <w:kern w:val="0"/>
-          <w:lang w:eastAsia="en-GB"/>
-          <w14:ligatures w14:val="none"/>
-        </w:rPr>
-      </w:pPr>
-      <w:r>
-        <w:rPr>
-          <w:rFonts w:eastAsia="Times New Roman" w:cs="Times New Roman"/>
-          <w:b/>
-          <w:bCs/>
-          <w:color w:val="000000"/>
-          <w:kern w:val="0"/>
-          <w:lang w:eastAsia="en-GB"/>
-          <w14:ligatures w14:val="none"/>
-        </w:rPr>
-        <w:t>Model Selection &amp; Training</w:t>
-      </w:r>
-      <w:r>
-        <w:rPr>
-          <w:rFonts w:eastAsia="Times New Roman" w:cs="Times New Roman"/>
-          <w:color w:val="000000"/>
-          <w:kern w:val="0"/>
-          <w:lang w:eastAsia="en-GB"/>
-          <w14:ligatures w14:val="none"/>
-        </w:rPr>
-        <w:t>: Identify the </w:t>
-      </w:r>
-      <w:r>
-        <w:rPr>
-          <w:rFonts w:eastAsia="Times New Roman" w:cs="Times New Roman"/>
-          <w:b/>
-          <w:bCs/>
-          <w:color w:val="000000"/>
-          <w:kern w:val="0"/>
-          <w:lang w:eastAsia="en-GB"/>
-          <w14:ligatures w14:val="none"/>
-        </w:rPr>
-        <w:t>machine learning models</w:t>
-      </w:r>
-      <w:r>
-        <w:rPr>
-          <w:rFonts w:eastAsia="Times New Roman" w:cs="Times New Roman"/>
-          <w:color w:val="000000"/>
-          <w:kern w:val="0"/>
-          <w:lang w:eastAsia="en-GB"/>
-          <w14:ligatures w14:val="none"/>
-        </w:rPr>
-        <w:t> (e.g., regression, classification, neural networks) you plan to use and justify why these models are well-suited for your problem. Explain how you will split the data for </w:t>
-      </w:r>
-      <w:r>
-        <w:rPr>
-          <w:rFonts w:eastAsia="Times New Roman" w:cs="Times New Roman"/>
-          <w:b/>
-          <w:bCs/>
-          <w:color w:val="000000"/>
-          <w:kern w:val="0"/>
-          <w:lang w:eastAsia="en-GB"/>
-          <w14:ligatures w14:val="none"/>
-        </w:rPr>
-        <w:t>training</w:t>
-      </w:r>
-      <w:r>
-        <w:rPr>
-          <w:rFonts w:eastAsia="Times New Roman" w:cs="Times New Roman"/>
-          <w:color w:val="000000"/>
-          <w:kern w:val="0"/>
-          <w:lang w:eastAsia="en-GB"/>
-          <w14:ligatures w14:val="none"/>
-        </w:rPr>
-        <w:t> and </w:t>
-      </w:r>
-      <w:r>
-        <w:rPr>
-          <w:rFonts w:eastAsia="Times New Roman" w:cs="Times New Roman"/>
-          <w:b/>
-          <w:bCs/>
-          <w:color w:val="000000"/>
-          <w:kern w:val="0"/>
-          <w:lang w:eastAsia="en-GB"/>
-          <w14:ligatures w14:val="none"/>
-        </w:rPr>
-        <w:t>validation</w:t>
-      </w:r>
-      <w:r>
-        <w:rPr>
-          <w:rFonts w:eastAsia="Times New Roman" w:cs="Times New Roman"/>
-          <w:color w:val="000000"/>
-          <w:kern w:val="0"/>
-          <w:lang w:eastAsia="en-GB"/>
-          <w14:ligatures w14:val="none"/>
-        </w:rPr>
-        <w:t>.</w:t>
-      </w:r>
-    </w:p>
-    <w:p>
-      <w:pPr>
-        <w:numPr>
-          <w:ilvl w:val="0"/>
-          <w:numId w:val="4"/>
-        </w:numPr>
-        <w:spacing w:before="100" w:beforeAutospacing="1" w:after="100" w:afterAutospacing="1" w:line="240" w:lineRule="auto"/>
-        <w:rPr>
-          <w:rFonts w:eastAsia="Times New Roman" w:cs="Times New Roman"/>
-          <w:color w:val="000000"/>
-          <w:kern w:val="0"/>
-          <w:lang w:eastAsia="en-GB"/>
-          <w14:ligatures w14:val="none"/>
-        </w:rPr>
-      </w:pPr>
-      <w:r>
-        <w:rPr>
-          <w:rFonts w:eastAsia="Times New Roman" w:cs="Times New Roman"/>
-          <w:b/>
-          <w:bCs/>
-          <w:color w:val="000000"/>
-          <w:kern w:val="0"/>
-          <w:lang w:eastAsia="en-GB"/>
-          <w14:ligatures w14:val="none"/>
-        </w:rPr>
-        <w:t>Evaluation Metrics</w:t>
-      </w:r>
-      <w:r>
-        <w:rPr>
-          <w:rFonts w:eastAsia="Times New Roman" w:cs="Times New Roman"/>
-          <w:color w:val="000000"/>
-          <w:kern w:val="0"/>
-          <w:lang w:eastAsia="en-GB"/>
-          <w14:ligatures w14:val="none"/>
-        </w:rPr>
-        <w:t>: Discuss how you will assess the model's performance. Which evaluation metrics (e.g., accuracy, precision, recall, F1 score) will be used to validate your results?</w:t>
-      </w:r>
-    </w:p>
-    <w:p>
-      <w:pPr>
-        <w:numPr>
-          <w:ilvl w:val="0"/>
-          <w:numId w:val="4"/>
-        </w:numPr>
-        <w:spacing w:before="100" w:beforeAutospacing="1" w:after="100" w:afterAutospacing="1" w:line="240" w:lineRule="auto"/>
-        <w:rPr>
-          <w:rFonts w:eastAsia="Times New Roman" w:cs="Times New Roman"/>
-          <w:color w:val="000000"/>
-          <w:kern w:val="0"/>
-          <w:lang w:eastAsia="en-GB"/>
-          <w14:ligatures w14:val="none"/>
-        </w:rPr>
-      </w:pPr>
-      <w:r>
-        <w:rPr>
-          <w:rFonts w:eastAsia="Times New Roman" w:cs="Times New Roman"/>
-          <w:b/>
-          <w:bCs/>
-          <w:color w:val="000000"/>
-          <w:kern w:val="0"/>
-          <w:lang w:eastAsia="en-GB"/>
-          <w14:ligatures w14:val="none"/>
-        </w:rPr>
-        <w:t>Deployment</w:t>
-      </w:r>
-      <w:r>
-        <w:rPr>
-          <w:rFonts w:eastAsia="Times New Roman" w:cs="Times New Roman"/>
-          <w:color w:val="000000"/>
-          <w:kern w:val="0"/>
-          <w:lang w:eastAsia="en-GB"/>
-          <w14:ligatures w14:val="none"/>
-        </w:rPr>
-        <w:t>: Outline how you will deploy the final model into a production environment. Will it be embedded into an existing system, or will you develop a new application</w:t>
-      </w:r>
-      <w:r>
-        <w:rPr>
-          <w:rFonts w:eastAsia="Times New Roman" w:cs="Times New Roman"/>
-          <w:color w:val="000000"/>
-          <w:kern w:val="0"/>
-          <w:lang w:eastAsia="en-GB"/>
-          <w14:ligatures w14:val="none"/>
-        </w:rPr>
-        <w:t>?</w:t>
-      </w:r>
-    </w:p>
-    <w:p>
-      <w:pPr>
-        <w:pStyle w:val="ListParagraph"/>
-        <w:numPr>
-          <w:ilvl w:val="0"/>
-          <w:numId w:val="3"/>
-        </w:numPr>
-        <w:rPr>
-          <w:b/>
-          <w:bCs/>
-          <w:sz w:val="28"/>
-          <w:szCs w:val="28"/>
-          <w:lang w:val="en-GB"/>
-        </w:rPr>
-      </w:pPr>
-      <w:r>
-        <w:rPr>
-          <w:b/>
-          <w:bCs/>
-          <w:sz w:val="28"/>
-          <w:szCs w:val="28"/>
-          <w:lang w:val="en-GB"/>
-        </w:rPr>
+        <w:lastRenderedPageBreak/>
         <w:t>Project Timeline</w:t>
       </w:r>
     </w:p>
@@ -1655,14 +1636,7 @@
               <w:rPr>
                 <w:lang w:val="en-GB"/>
               </w:rPr>
-              <w:t xml:space="preserve">ML modelling (Task 10), app architecture (Task 13), production ready </w:t>
-            </w:r>
-            <w:r>
-              <w:rPr>
-                <w:lang w:val="en-GB"/>
-              </w:rPr>
-              <w:lastRenderedPageBreak/>
-              <w:t>code (Task 11), group proposal (Task 6)</w:t>
+              <w:t>ML modelling (Task 10), app architecture (Task 13), production ready code (Task 11), group proposal (Task 6)</w:t>
             </w:r>
           </w:p>
         </w:tc>
@@ -1686,15 +1660,7 @@
               <w:rPr>
                 <w:lang w:val="en-GB"/>
               </w:rPr>
-              <w:lastRenderedPageBreak/>
-              <w:t xml:space="preserve">Group proposal document, </w:t>
-            </w:r>
-            <w:r>
-              <w:rPr>
-                <w:lang w:val="en-GB"/>
-              </w:rPr>
-              <w:lastRenderedPageBreak/>
-              <w:t>model notebook</w:t>
+              <w:t>Group proposal document, model notebook</w:t>
             </w:r>
           </w:p>
         </w:tc>
@@ -1718,7 +1684,6 @@
               <w:rPr>
                 <w:lang w:val="en-GB"/>
               </w:rPr>
-              <w:lastRenderedPageBreak/>
               <w:t>Tuesday: final proposal presentation</w:t>
             </w:r>
           </w:p>
@@ -2355,19 +2320,11 @@
             <w:r>
               <w:t>á</w:t>
             </w:r>
-            <w:proofErr w:type="spellStart"/>
-            <w:r>
-              <w:rPr>
-                <w:lang w:val="en-GB"/>
-              </w:rPr>
-              <w:t>dor</w:t>
-            </w:r>
-            <w:proofErr w:type="spellEnd"/>
-            <w:r>
-              <w:rPr>
-                <w:lang w:val="en-GB"/>
-              </w:rPr>
-              <w:t>, Gergely</w:t>
+            <w:r>
+              <w:rPr>
+                <w:lang w:val="en-GB"/>
+              </w:rPr>
+              <w:t>dor, Gergely</w:t>
             </w:r>
           </w:p>
         </w:tc>
@@ -2393,6 +2350,7 @@
               <w:rPr>
                 <w:lang w:val="en-GB"/>
               </w:rPr>
+              <w:lastRenderedPageBreak/>
               <w:t>Task 6 - Group project proposal</w:t>
             </w:r>
           </w:p>
@@ -2513,19 +2471,11 @@
                 <w:lang w:val="en-GB"/>
               </w:rPr>
             </w:pPr>
-            <w:proofErr w:type="spellStart"/>
-            <w:r>
-              <w:rPr>
-                <w:lang w:val="en-GB"/>
-              </w:rPr>
-              <w:t>Qusaily</w:t>
-            </w:r>
-            <w:proofErr w:type="spellEnd"/>
-            <w:r>
-              <w:rPr>
-                <w:lang w:val="en-GB"/>
-              </w:rPr>
-              <w:t>, Qusai Al</w:t>
+            <w:r>
+              <w:rPr>
+                <w:lang w:val="en-GB"/>
+              </w:rPr>
+              <w:t>Qusaily, Qusai Al</w:t>
             </w:r>
           </w:p>
         </w:tc>
@@ -2601,7 +2551,6 @@
               <w:rPr>
                 <w:lang w:val="en-GB"/>
               </w:rPr>
-              <w:lastRenderedPageBreak/>
               <w:t>Task 10 - ML model development</w:t>
             </w:r>
           </w:p>
@@ -2857,7 +2806,7 @@
       <w:sdtContent>
         <w:p>
           <w:pPr>
-            <w:pStyle w:val="Heading1"/>
+            <w:pStyle w:val="Cmsor1"/>
             <w:numPr>
               <w:ilvl w:val="0"/>
               <w:numId w:val="3"/>
@@ -2892,7 +2841,7 @@
           <w:sdtContent>
             <w:p>
               <w:pPr>
-                <w:pStyle w:val="Bibliography"/>
+                <w:pStyle w:val="Irodalomjegyzk"/>
                 <w:ind w:left="720" w:hanging="720"/>
                 <w:rPr>
                   <w:noProof/>
@@ -2936,7 +2885,7 @@
             </w:p>
             <w:p>
               <w:pPr>
-                <w:pStyle w:val="Bibliography"/>
+                <w:pStyle w:val="Irodalomjegyzk"/>
                 <w:ind w:left="720" w:hanging="720"/>
                 <w:rPr>
                   <w:noProof/>
@@ -3113,7 +3062,7 @@
       <w:hyperlink r:id="rId9" w:history="1">
         <w:r>
           <w:rPr>
-            <w:rStyle w:val="Hyperlink"/>
+            <w:rStyle w:val="Hiperhivatkozs"/>
             <w:rFonts w:eastAsia="Times New Roman" w:cs="Times New Roman"/>
             <w:kern w:val="0"/>
             <w:lang w:eastAsia="en-GB"/>
@@ -4145,15 +4094,15 @@
     <w:lsdException w:name="Unresolved Mention" w:semiHidden="1" w:unhideWhenUsed="1"/>
     <w:lsdException w:name="Smart Link" w:semiHidden="1" w:unhideWhenUsed="1"/>
   </w:latentStyles>
-  <w:style w:type="paragraph" w:default="1" w:styleId="Normal">
+  <w:style w:type="paragraph" w:default="1" w:styleId="Norml">
     <w:name w:val="Normal"/>
     <w:qFormat/>
   </w:style>
-  <w:style w:type="paragraph" w:styleId="Heading1">
+  <w:style w:type="paragraph" w:styleId="Cmsor1">
     <w:name w:val="heading 1"/>
-    <w:basedOn w:val="Normal"/>
-    <w:next w:val="Normal"/>
-    <w:link w:val="Heading1Char"/>
+    <w:basedOn w:val="Norml"/>
+    <w:next w:val="Norml"/>
+    <w:link w:val="Cmsor1Char"/>
     <w:uiPriority w:val="9"/>
     <w:qFormat/>
     <w:rsid w:val="00FD5A73"/>
@@ -4170,11 +4119,11 @@
       <w:szCs w:val="40"/>
     </w:rPr>
   </w:style>
-  <w:style w:type="paragraph" w:styleId="Heading2">
+  <w:style w:type="paragraph" w:styleId="Cmsor2">
     <w:name w:val="heading 2"/>
-    <w:basedOn w:val="Normal"/>
-    <w:next w:val="Normal"/>
-    <w:link w:val="Heading2Char"/>
+    <w:basedOn w:val="Norml"/>
+    <w:next w:val="Norml"/>
+    <w:link w:val="Cmsor2Char"/>
     <w:uiPriority w:val="9"/>
     <w:semiHidden/>
     <w:unhideWhenUsed/>
@@ -4193,11 +4142,11 @@
       <w:szCs w:val="32"/>
     </w:rPr>
   </w:style>
-  <w:style w:type="paragraph" w:styleId="Heading3">
+  <w:style w:type="paragraph" w:styleId="Cmsor3">
     <w:name w:val="heading 3"/>
-    <w:basedOn w:val="Normal"/>
-    <w:next w:val="Normal"/>
-    <w:link w:val="Heading3Char"/>
+    <w:basedOn w:val="Norml"/>
+    <w:next w:val="Norml"/>
+    <w:link w:val="Cmsor3Char"/>
     <w:uiPriority w:val="9"/>
     <w:semiHidden/>
     <w:unhideWhenUsed/>
@@ -4216,11 +4165,11 @@
       <w:szCs w:val="28"/>
     </w:rPr>
   </w:style>
-  <w:style w:type="paragraph" w:styleId="Heading4">
+  <w:style w:type="paragraph" w:styleId="Cmsor4">
     <w:name w:val="heading 4"/>
-    <w:basedOn w:val="Normal"/>
-    <w:next w:val="Normal"/>
-    <w:link w:val="Heading4Char"/>
+    <w:basedOn w:val="Norml"/>
+    <w:next w:val="Norml"/>
+    <w:link w:val="Cmsor4Char"/>
     <w:uiPriority w:val="9"/>
     <w:semiHidden/>
     <w:unhideWhenUsed/>
@@ -4239,11 +4188,11 @@
       <w:color w:val="0F4761" w:themeColor="accent1" w:themeShade="BF"/>
     </w:rPr>
   </w:style>
-  <w:style w:type="paragraph" w:styleId="Heading5">
+  <w:style w:type="paragraph" w:styleId="Cmsor5">
     <w:name w:val="heading 5"/>
-    <w:basedOn w:val="Normal"/>
-    <w:next w:val="Normal"/>
-    <w:link w:val="Heading5Char"/>
+    <w:basedOn w:val="Norml"/>
+    <w:next w:val="Norml"/>
+    <w:link w:val="Cmsor5Char"/>
     <w:uiPriority w:val="9"/>
     <w:semiHidden/>
     <w:unhideWhenUsed/>
@@ -4260,11 +4209,11 @@
       <w:color w:val="0F4761" w:themeColor="accent1" w:themeShade="BF"/>
     </w:rPr>
   </w:style>
-  <w:style w:type="paragraph" w:styleId="Heading6">
+  <w:style w:type="paragraph" w:styleId="Cmsor6">
     <w:name w:val="heading 6"/>
-    <w:basedOn w:val="Normal"/>
-    <w:next w:val="Normal"/>
-    <w:link w:val="Heading6Char"/>
+    <w:basedOn w:val="Norml"/>
+    <w:next w:val="Norml"/>
+    <w:link w:val="Cmsor6Char"/>
     <w:uiPriority w:val="9"/>
     <w:semiHidden/>
     <w:unhideWhenUsed/>
@@ -4283,11 +4232,11 @@
       <w:color w:val="595959" w:themeColor="text1" w:themeTint="A6"/>
     </w:rPr>
   </w:style>
-  <w:style w:type="paragraph" w:styleId="Heading7">
+  <w:style w:type="paragraph" w:styleId="Cmsor7">
     <w:name w:val="heading 7"/>
-    <w:basedOn w:val="Normal"/>
-    <w:next w:val="Normal"/>
-    <w:link w:val="Heading7Char"/>
+    <w:basedOn w:val="Norml"/>
+    <w:next w:val="Norml"/>
+    <w:link w:val="Cmsor7Char"/>
     <w:uiPriority w:val="9"/>
     <w:semiHidden/>
     <w:unhideWhenUsed/>
@@ -4304,11 +4253,11 @@
       <w:color w:val="595959" w:themeColor="text1" w:themeTint="A6"/>
     </w:rPr>
   </w:style>
-  <w:style w:type="paragraph" w:styleId="Heading8">
+  <w:style w:type="paragraph" w:styleId="Cmsor8">
     <w:name w:val="heading 8"/>
-    <w:basedOn w:val="Normal"/>
-    <w:next w:val="Normal"/>
-    <w:link w:val="Heading8Char"/>
+    <w:basedOn w:val="Norml"/>
+    <w:next w:val="Norml"/>
+    <w:link w:val="Cmsor8Char"/>
     <w:uiPriority w:val="9"/>
     <w:semiHidden/>
     <w:unhideWhenUsed/>
@@ -4327,11 +4276,11 @@
       <w:color w:val="272727" w:themeColor="text1" w:themeTint="D8"/>
     </w:rPr>
   </w:style>
-  <w:style w:type="paragraph" w:styleId="Heading9">
+  <w:style w:type="paragraph" w:styleId="Cmsor9">
     <w:name w:val="heading 9"/>
-    <w:basedOn w:val="Normal"/>
-    <w:next w:val="Normal"/>
-    <w:link w:val="Heading9Char"/>
+    <w:basedOn w:val="Norml"/>
+    <w:next w:val="Norml"/>
+    <w:link w:val="Cmsor9Char"/>
     <w:uiPriority w:val="9"/>
     <w:semiHidden/>
     <w:unhideWhenUsed/>
@@ -4348,13 +4297,12 @@
       <w:color w:val="272727" w:themeColor="text1" w:themeTint="D8"/>
     </w:rPr>
   </w:style>
-  <w:style w:type="character" w:default="1" w:styleId="DefaultParagraphFont">
+  <w:style w:type="character" w:default="1" w:styleId="Bekezdsalapbettpusa">
     <w:name w:val="Default Paragraph Font"/>
     <w:uiPriority w:val="1"/>
-    <w:semiHidden/>
     <w:unhideWhenUsed/>
   </w:style>
-  <w:style w:type="table" w:default="1" w:styleId="TableNormal">
+  <w:style w:type="table" w:default="1" w:styleId="Normltblzat">
     <w:name w:val="Normal Table"/>
     <w:uiPriority w:val="99"/>
     <w:semiHidden/>
@@ -4369,16 +4317,16 @@
       </w:tblCellMar>
     </w:tblPr>
   </w:style>
-  <w:style w:type="numbering" w:default="1" w:styleId="NoList">
+  <w:style w:type="numbering" w:default="1" w:styleId="Nemlista">
     <w:name w:val="No List"/>
     <w:uiPriority w:val="99"/>
     <w:semiHidden/>
     <w:unhideWhenUsed/>
   </w:style>
-  <w:style w:type="character" w:customStyle="1" w:styleId="Heading1Char">
-    <w:name w:val="Heading 1 Char"/>
-    <w:basedOn w:val="DefaultParagraphFont"/>
-    <w:link w:val="Heading1"/>
+  <w:style w:type="character" w:customStyle="1" w:styleId="Cmsor1Char">
+    <w:name w:val="Címsor 1 Char"/>
+    <w:basedOn w:val="Bekezdsalapbettpusa"/>
+    <w:link w:val="Cmsor1"/>
     <w:uiPriority w:val="9"/>
     <w:rsid w:val="00FD5A73"/>
     <w:rPr>
@@ -4388,10 +4336,10 @@
       <w:szCs w:val="40"/>
     </w:rPr>
   </w:style>
-  <w:style w:type="character" w:customStyle="1" w:styleId="Heading2Char">
-    <w:name w:val="Heading 2 Char"/>
-    <w:basedOn w:val="DefaultParagraphFont"/>
-    <w:link w:val="Heading2"/>
+  <w:style w:type="character" w:customStyle="1" w:styleId="Cmsor2Char">
+    <w:name w:val="Címsor 2 Char"/>
+    <w:basedOn w:val="Bekezdsalapbettpusa"/>
+    <w:link w:val="Cmsor2"/>
     <w:uiPriority w:val="9"/>
     <w:semiHidden/>
     <w:rsid w:val="00FD5A73"/>
@@ -4402,10 +4350,10 @@
       <w:szCs w:val="32"/>
     </w:rPr>
   </w:style>
-  <w:style w:type="character" w:customStyle="1" w:styleId="Heading3Char">
-    <w:name w:val="Heading 3 Char"/>
-    <w:basedOn w:val="DefaultParagraphFont"/>
-    <w:link w:val="Heading3"/>
+  <w:style w:type="character" w:customStyle="1" w:styleId="Cmsor3Char">
+    <w:name w:val="Címsor 3 Char"/>
+    <w:basedOn w:val="Bekezdsalapbettpusa"/>
+    <w:link w:val="Cmsor3"/>
     <w:uiPriority w:val="9"/>
     <w:semiHidden/>
     <w:rsid w:val="00FD5A73"/>
@@ -4416,10 +4364,10 @@
       <w:szCs w:val="28"/>
     </w:rPr>
   </w:style>
-  <w:style w:type="character" w:customStyle="1" w:styleId="Heading4Char">
-    <w:name w:val="Heading 4 Char"/>
-    <w:basedOn w:val="DefaultParagraphFont"/>
-    <w:link w:val="Heading4"/>
+  <w:style w:type="character" w:customStyle="1" w:styleId="Cmsor4Char">
+    <w:name w:val="Címsor 4 Char"/>
+    <w:basedOn w:val="Bekezdsalapbettpusa"/>
+    <w:link w:val="Cmsor4"/>
     <w:uiPriority w:val="9"/>
     <w:semiHidden/>
     <w:rsid w:val="00FD5A73"/>
@@ -4430,10 +4378,10 @@
       <w:color w:val="0F4761" w:themeColor="accent1" w:themeShade="BF"/>
     </w:rPr>
   </w:style>
-  <w:style w:type="character" w:customStyle="1" w:styleId="Heading5Char">
-    <w:name w:val="Heading 5 Char"/>
-    <w:basedOn w:val="DefaultParagraphFont"/>
-    <w:link w:val="Heading5"/>
+  <w:style w:type="character" w:customStyle="1" w:styleId="Cmsor5Char">
+    <w:name w:val="Címsor 5 Char"/>
+    <w:basedOn w:val="Bekezdsalapbettpusa"/>
+    <w:link w:val="Cmsor5"/>
     <w:uiPriority w:val="9"/>
     <w:semiHidden/>
     <w:rsid w:val="00FD5A73"/>
@@ -4442,10 +4390,10 @@
       <w:color w:val="0F4761" w:themeColor="accent1" w:themeShade="BF"/>
     </w:rPr>
   </w:style>
-  <w:style w:type="character" w:customStyle="1" w:styleId="Heading6Char">
-    <w:name w:val="Heading 6 Char"/>
-    <w:basedOn w:val="DefaultParagraphFont"/>
-    <w:link w:val="Heading6"/>
+  <w:style w:type="character" w:customStyle="1" w:styleId="Cmsor6Char">
+    <w:name w:val="Címsor 6 Char"/>
+    <w:basedOn w:val="Bekezdsalapbettpusa"/>
+    <w:link w:val="Cmsor6"/>
     <w:uiPriority w:val="9"/>
     <w:semiHidden/>
     <w:rsid w:val="00FD5A73"/>
@@ -4456,10 +4404,10 @@
       <w:color w:val="595959" w:themeColor="text1" w:themeTint="A6"/>
     </w:rPr>
   </w:style>
-  <w:style w:type="character" w:customStyle="1" w:styleId="Heading7Char">
-    <w:name w:val="Heading 7 Char"/>
-    <w:basedOn w:val="DefaultParagraphFont"/>
-    <w:link w:val="Heading7"/>
+  <w:style w:type="character" w:customStyle="1" w:styleId="Cmsor7Char">
+    <w:name w:val="Címsor 7 Char"/>
+    <w:basedOn w:val="Bekezdsalapbettpusa"/>
+    <w:link w:val="Cmsor7"/>
     <w:uiPriority w:val="9"/>
     <w:semiHidden/>
     <w:rsid w:val="00FD5A73"/>
@@ -4468,10 +4416,10 @@
       <w:color w:val="595959" w:themeColor="text1" w:themeTint="A6"/>
     </w:rPr>
   </w:style>
-  <w:style w:type="character" w:customStyle="1" w:styleId="Heading8Char">
-    <w:name w:val="Heading 8 Char"/>
-    <w:basedOn w:val="DefaultParagraphFont"/>
-    <w:link w:val="Heading8"/>
+  <w:style w:type="character" w:customStyle="1" w:styleId="Cmsor8Char">
+    <w:name w:val="Címsor 8 Char"/>
+    <w:basedOn w:val="Bekezdsalapbettpusa"/>
+    <w:link w:val="Cmsor8"/>
     <w:uiPriority w:val="9"/>
     <w:semiHidden/>
     <w:rsid w:val="00FD5A73"/>
@@ -4482,10 +4430,10 @@
       <w:color w:val="272727" w:themeColor="text1" w:themeTint="D8"/>
     </w:rPr>
   </w:style>
-  <w:style w:type="character" w:customStyle="1" w:styleId="Heading9Char">
-    <w:name w:val="Heading 9 Char"/>
-    <w:basedOn w:val="DefaultParagraphFont"/>
-    <w:link w:val="Heading9"/>
+  <w:style w:type="character" w:customStyle="1" w:styleId="Cmsor9Char">
+    <w:name w:val="Címsor 9 Char"/>
+    <w:basedOn w:val="Bekezdsalapbettpusa"/>
+    <w:link w:val="Cmsor9"/>
     <w:uiPriority w:val="9"/>
     <w:semiHidden/>
     <w:rsid w:val="00FD5A73"/>
@@ -4494,11 +4442,11 @@
       <w:color w:val="272727" w:themeColor="text1" w:themeTint="D8"/>
     </w:rPr>
   </w:style>
-  <w:style w:type="paragraph" w:styleId="Title">
+  <w:style w:type="paragraph" w:styleId="Cm">
     <w:name w:val="Title"/>
-    <w:basedOn w:val="Normal"/>
-    <w:next w:val="Normal"/>
-    <w:link w:val="TitleChar"/>
+    <w:basedOn w:val="Norml"/>
+    <w:next w:val="Norml"/>
+    <w:link w:val="CmChar"/>
     <w:uiPriority w:val="10"/>
     <w:qFormat/>
     <w:rsid w:val="00FD5A73"/>
@@ -4514,10 +4462,10 @@
       <w:szCs w:val="56"/>
     </w:rPr>
   </w:style>
-  <w:style w:type="character" w:customStyle="1" w:styleId="TitleChar">
-    <w:name w:val="Title Char"/>
-    <w:basedOn w:val="DefaultParagraphFont"/>
-    <w:link w:val="Title"/>
+  <w:style w:type="character" w:customStyle="1" w:styleId="CmChar">
+    <w:name w:val="Cím Char"/>
+    <w:basedOn w:val="Bekezdsalapbettpusa"/>
+    <w:link w:val="Cm"/>
     <w:uiPriority w:val="10"/>
     <w:rsid w:val="00FD5A73"/>
     <w:rPr>
@@ -4528,11 +4476,11 @@
       <w:szCs w:val="56"/>
     </w:rPr>
   </w:style>
-  <w:style w:type="paragraph" w:styleId="Subtitle">
+  <w:style w:type="paragraph" w:styleId="Alcm">
     <w:name w:val="Subtitle"/>
-    <w:basedOn w:val="Normal"/>
-    <w:next w:val="Normal"/>
-    <w:link w:val="SubtitleChar"/>
+    <w:basedOn w:val="Norml"/>
+    <w:next w:val="Norml"/>
+    <w:link w:val="AlcmChar"/>
     <w:uiPriority w:val="11"/>
     <w:qFormat/>
     <w:rsid w:val="00FD5A73"/>
@@ -4549,10 +4497,10 @@
       <w:szCs w:val="28"/>
     </w:rPr>
   </w:style>
-  <w:style w:type="character" w:customStyle="1" w:styleId="SubtitleChar">
-    <w:name w:val="Subtitle Char"/>
-    <w:basedOn w:val="DefaultParagraphFont"/>
-    <w:link w:val="Subtitle"/>
+  <w:style w:type="character" w:customStyle="1" w:styleId="AlcmChar">
+    <w:name w:val="Alcím Char"/>
+    <w:basedOn w:val="Bekezdsalapbettpusa"/>
+    <w:link w:val="Alcm"/>
     <w:uiPriority w:val="11"/>
     <w:rsid w:val="00FD5A73"/>
     <w:rPr>
@@ -4563,11 +4511,11 @@
       <w:szCs w:val="28"/>
     </w:rPr>
   </w:style>
-  <w:style w:type="paragraph" w:styleId="Quote">
+  <w:style w:type="paragraph" w:styleId="Idzet">
     <w:name w:val="Quote"/>
-    <w:basedOn w:val="Normal"/>
-    <w:next w:val="Normal"/>
-    <w:link w:val="QuoteChar"/>
+    <w:basedOn w:val="Norml"/>
+    <w:next w:val="Norml"/>
+    <w:link w:val="IdzetChar"/>
     <w:uiPriority w:val="29"/>
     <w:qFormat/>
     <w:rsid w:val="00FD5A73"/>
@@ -4581,10 +4529,10 @@
       <w:color w:val="404040" w:themeColor="text1" w:themeTint="BF"/>
     </w:rPr>
   </w:style>
-  <w:style w:type="character" w:customStyle="1" w:styleId="QuoteChar">
-    <w:name w:val="Quote Char"/>
-    <w:basedOn w:val="DefaultParagraphFont"/>
-    <w:link w:val="Quote"/>
+  <w:style w:type="character" w:customStyle="1" w:styleId="IdzetChar">
+    <w:name w:val="Idézet Char"/>
+    <w:basedOn w:val="Bekezdsalapbettpusa"/>
+    <w:link w:val="Idzet"/>
     <w:uiPriority w:val="29"/>
     <w:rsid w:val="00FD5A73"/>
     <w:rPr>
@@ -4593,9 +4541,9 @@
       <w:color w:val="404040" w:themeColor="text1" w:themeTint="BF"/>
     </w:rPr>
   </w:style>
-  <w:style w:type="paragraph" w:styleId="ListParagraph">
+  <w:style w:type="paragraph" w:styleId="Listaszerbekezds">
     <w:name w:val="List Paragraph"/>
-    <w:basedOn w:val="Normal"/>
+    <w:basedOn w:val="Norml"/>
     <w:uiPriority w:val="34"/>
     <w:qFormat/>
     <w:rsid w:val="00FD5A73"/>
@@ -4604,9 +4552,9 @@
       <w:contextualSpacing/>
     </w:pPr>
   </w:style>
-  <w:style w:type="character" w:styleId="IntenseEmphasis">
+  <w:style w:type="character" w:styleId="Erskiemels">
     <w:name w:val="Intense Emphasis"/>
-    <w:basedOn w:val="DefaultParagraphFont"/>
+    <w:basedOn w:val="Bekezdsalapbettpusa"/>
     <w:uiPriority w:val="21"/>
     <w:qFormat/>
     <w:rsid w:val="00FD5A73"/>
@@ -4616,11 +4564,11 @@
       <w:color w:val="0F4761" w:themeColor="accent1" w:themeShade="BF"/>
     </w:rPr>
   </w:style>
-  <w:style w:type="paragraph" w:styleId="IntenseQuote">
+  <w:style w:type="paragraph" w:styleId="Kiemeltidzet">
     <w:name w:val="Intense Quote"/>
-    <w:basedOn w:val="Normal"/>
-    <w:next w:val="Normal"/>
-    <w:link w:val="IntenseQuoteChar"/>
+    <w:basedOn w:val="Norml"/>
+    <w:next w:val="Norml"/>
+    <w:link w:val="KiemeltidzetChar"/>
     <w:uiPriority w:val="30"/>
     <w:qFormat/>
     <w:rsid w:val="00FD5A73"/>
@@ -4639,10 +4587,10 @@
       <w:color w:val="0F4761" w:themeColor="accent1" w:themeShade="BF"/>
     </w:rPr>
   </w:style>
-  <w:style w:type="character" w:customStyle="1" w:styleId="IntenseQuoteChar">
-    <w:name w:val="Intense Quote Char"/>
-    <w:basedOn w:val="DefaultParagraphFont"/>
-    <w:link w:val="IntenseQuote"/>
+  <w:style w:type="character" w:customStyle="1" w:styleId="KiemeltidzetChar">
+    <w:name w:val="Kiemelt idézet Char"/>
+    <w:basedOn w:val="Bekezdsalapbettpusa"/>
+    <w:link w:val="Kiemeltidzet"/>
     <w:uiPriority w:val="30"/>
     <w:rsid w:val="00FD5A73"/>
     <w:rPr>
@@ -4651,9 +4599,9 @@
       <w:color w:val="0F4761" w:themeColor="accent1" w:themeShade="BF"/>
     </w:rPr>
   </w:style>
-  <w:style w:type="character" w:styleId="IntenseReference">
+  <w:style w:type="character" w:styleId="Ershivatkozs">
     <w:name w:val="Intense Reference"/>
-    <w:basedOn w:val="DefaultParagraphFont"/>
+    <w:basedOn w:val="Bekezdsalapbettpusa"/>
     <w:uiPriority w:val="32"/>
     <w:qFormat/>
     <w:rsid w:val="00FD5A73"/>
@@ -4667,12 +4615,12 @@
   </w:style>
   <w:style w:type="character" w:customStyle="1" w:styleId="apple-converted-space">
     <w:name w:val="apple-converted-space"/>
-    <w:basedOn w:val="DefaultParagraphFont"/>
+    <w:basedOn w:val="Bekezdsalapbettpusa"/>
     <w:rsid w:val="00FE3B45"/>
   </w:style>
-  <w:style w:type="character" w:styleId="Strong">
+  <w:style w:type="character" w:styleId="Kiemels2">
     <w:name w:val="Strong"/>
-    <w:basedOn w:val="DefaultParagraphFont"/>
+    <w:basedOn w:val="Bekezdsalapbettpusa"/>
     <w:uiPriority w:val="22"/>
     <w:qFormat/>
     <w:rsid w:val="00FE3B45"/>
@@ -4681,9 +4629,9 @@
       <w:bCs/>
     </w:rPr>
   </w:style>
-  <w:style w:type="character" w:styleId="Hyperlink">
+  <w:style w:type="character" w:styleId="Hiperhivatkozs">
     <w:name w:val="Hyperlink"/>
-    <w:basedOn w:val="DefaultParagraphFont"/>
+    <w:basedOn w:val="Bekezdsalapbettpusa"/>
     <w:uiPriority w:val="99"/>
     <w:unhideWhenUsed/>
     <w:rsid w:val="00205B2C"/>
@@ -4692,9 +4640,9 @@
       <w:u w:val="single"/>
     </w:rPr>
   </w:style>
-  <w:style w:type="character" w:styleId="UnresolvedMention">
+  <w:style w:type="character" w:styleId="Feloldatlanmegemlts">
     <w:name w:val="Unresolved Mention"/>
-    <w:basedOn w:val="DefaultParagraphFont"/>
+    <w:basedOn w:val="Bekezdsalapbettpusa"/>
     <w:uiPriority w:val="99"/>
     <w:semiHidden/>
     <w:unhideWhenUsed/>
@@ -4704,10 +4652,10 @@
       <w:shd w:val="clear" w:color="auto" w:fill="E1DFDD"/>
     </w:rPr>
   </w:style>
-  <w:style w:type="paragraph" w:styleId="Bibliography">
+  <w:style w:type="paragraph" w:styleId="Irodalomjegyzk">
     <w:name w:val="Bibliography"/>
-    <w:basedOn w:val="Normal"/>
-    <w:next w:val="Normal"/>
+    <w:basedOn w:val="Norml"/>
+    <w:next w:val="Norml"/>
     <w:uiPriority w:val="37"/>
     <w:unhideWhenUsed/>
     <w:rsid w:val="002B3BFB"/>
@@ -5011,67 +4959,6 @@
 </file>
 
 <file path=customXml/item1.xml><?xml version="1.0" encoding="utf-8"?>
-<b:Sources xmlns:b="http://schemas.openxmlformats.org/officeDocument/2006/bibliography" xmlns="http://schemas.openxmlformats.org/officeDocument/2006/bibliography" SelectedStyle="\APASixthEditionOfficeOnline.xsl" StyleName="APA" Version="6">
-  <b:Source>
-    <b:Tag>Phi20</b:Tag>
-    <b:SourceType>InternetSite</b:SourceType>
-    <b:Guid>{370EA8DA-55BD-47F2-A140-624A4CA438B9}</b:Guid>
-    <b:Author>
-      <b:Author>
-        <b:NameList>
-          <b:Person>
-            <b:Last>Ndikum</b:Last>
-            <b:First>Philip</b:First>
-          </b:Person>
-        </b:NameList>
-      </b:Author>
-    </b:Author>
-    <b:Title>Machine Learning Algorithms for Financial Asset Price Forecasting</b:Title>
-    <b:InternetSiteTitle>arxiv</b:InternetSiteTitle>
-    <b:Year>2020</b:Year>
-    <b:URL>https://arxiv.org/abs/2004.01504</b:URL>
-    <b:RefOrder>1</b:RefOrder>
-  </b:Source>
-  <b:Source>
-    <b:Tag>Alb23</b:Tag>
-    <b:SourceType>InternetSite</b:SourceType>
-    <b:Guid>{CAC6EDDE-0592-4C82-9906-7CB97CCD92C8}</b:Guid>
-    <b:Author>
-      <b:Author>
-        <b:NameList>
-          <b:Person>
-            <b:Last>Albert Wong</b:Last>
-            <b:First>Steven</b:First>
-            <b:Middle>Whang, Emilio Sagre, Niha Sachin, Gustavo Dutra, Yew-Wei Lim, Gaetan Hains, Youry Khmelevsky, Frank Zhang</b:Middle>
-          </b:Person>
-        </b:NameList>
-      </b:Author>
-    </b:Author>
-    <b:Title>Short-Term Stock Price Forecasting using exogenous variables and Machine Learning Algorithms</b:Title>
-    <b:InternetSiteTitle>Trading and Market Microstructure</b:InternetSiteTitle>
-    <b:Year>2023</b:Year>
-    <b:URL>https://arxiv.org/abs/2309.00618</b:URL>
-    <b:RefOrder>2</b:RefOrder>
-  </b:Source>
-</b:Sources>
-</file>
-
-<file path=customXml/item2.xml><?xml version="1.0" encoding="utf-8"?>
-<p:properties xmlns:p="http://schemas.microsoft.com/office/2006/metadata/properties" xmlns:xsi="http://www.w3.org/2001/XMLSchema-instance" xmlns:pc="http://schemas.microsoft.com/office/infopath/2007/PartnerControls">
-  <documentManagement/>
-</p:properties>
-</file>
-
-<file path=customXml/item3.xml><?xml version="1.0" encoding="utf-8"?>
-<?mso-contentType ?>
-<FormTemplates xmlns="http://schemas.microsoft.com/sharepoint/v3/contenttype/forms">
-  <Display>DocumentLibraryForm</Display>
-  <Edit>DocumentLibraryForm</Edit>
-  <New>DocumentLibraryForm</New>
-</FormTemplates>
-</file>
-
-<file path=customXml/item4.xml><?xml version="1.0" encoding="utf-8"?>
 <ct:contentTypeSchema xmlns:ct="http://schemas.microsoft.com/office/2006/metadata/contentType" xmlns:ma="http://schemas.microsoft.com/office/2006/metadata/properties/metaAttributes" ct:_="" ma:_="" ma:contentTypeName="Document" ma:contentTypeID="0x010100CA0648AB48CC2344B6C41470F89B25D4" ma:contentTypeVersion="4" ma:contentTypeDescription="Create a new document." ma:contentTypeScope="" ma:versionID="a660c338eb59bfff4af50e265a6ab854">
   <xsd:schema xmlns:xsd="http://www.w3.org/2001/XMLSchema" xmlns:xs="http://www.w3.org/2001/XMLSchema" xmlns:p="http://schemas.microsoft.com/office/2006/metadata/properties" xmlns:ns2="f3492271-d953-408b-9284-5d0a710cdb1a" targetNamespace="http://schemas.microsoft.com/office/2006/metadata/properties" ma:root="true" ma:fieldsID="5f8157e55ce76d062aad01a2da979587" ns2:_="">
     <xsd:import namespace="f3492271-d953-408b-9284-5d0a710cdb1a"/>
@@ -5215,32 +5102,68 @@
 </ct:contentTypeSchema>
 </file>
 
-<file path=customXml/itemProps1.xml><?xml version="1.0" encoding="utf-8"?>
-<ds:datastoreItem xmlns:ds="http://schemas.openxmlformats.org/officeDocument/2006/customXml" ds:itemID="{C8132FE0-DAB3-4537-BC70-39321B387155}">
-  <ds:schemaRefs>
-    <ds:schemaRef ds:uri="http://schemas.openxmlformats.org/officeDocument/2006/bibliography"/>
-  </ds:schemaRefs>
-</ds:datastoreItem>
+<file path=customXml/item2.xml><?xml version="1.0" encoding="utf-8"?>
+<?mso-contentType ?>
+<FormTemplates xmlns="http://schemas.microsoft.com/sharepoint/v3/contenttype/forms">
+  <Display>DocumentLibraryForm</Display>
+  <Edit>DocumentLibraryForm</Edit>
+  <New>DocumentLibraryForm</New>
+</FormTemplates>
 </file>
 
-<file path=customXml/itemProps2.xml><?xml version="1.0" encoding="utf-8"?>
-<ds:datastoreItem xmlns:ds="http://schemas.openxmlformats.org/officeDocument/2006/customXml" ds:itemID="{A8834EE7-90FD-4006-BF8D-556140116A2D}">
-  <ds:schemaRefs>
-    <ds:schemaRef ds:uri="http://schemas.microsoft.com/office/2006/metadata/properties"/>
-    <ds:schemaRef ds:uri="http://schemas.microsoft.com/office/infopath/2007/PartnerControls"/>
-  </ds:schemaRefs>
-</ds:datastoreItem>
+<file path=customXml/item3.xml><?xml version="1.0" encoding="utf-8"?>
+<p:properties xmlns:p="http://schemas.microsoft.com/office/2006/metadata/properties" xmlns:xsi="http://www.w3.org/2001/XMLSchema-instance" xmlns:pc="http://schemas.microsoft.com/office/infopath/2007/PartnerControls">
+  <documentManagement/>
+</p:properties>
 </file>
 
-<file path=customXml/itemProps3.xml><?xml version="1.0" encoding="utf-8"?>
-<ds:datastoreItem xmlns:ds="http://schemas.openxmlformats.org/officeDocument/2006/customXml" ds:itemID="{09ECDD89-9376-4D0D-8E13-549D769B12AB}">
-  <ds:schemaRefs>
-    <ds:schemaRef ds:uri="http://schemas.microsoft.com/sharepoint/v3/contenttype/forms"/>
-  </ds:schemaRefs>
-</ds:datastoreItem>
+<file path=customXml/item4.xml><?xml version="1.0" encoding="utf-8"?>
+<b:Sources xmlns:b="http://schemas.openxmlformats.org/officeDocument/2006/bibliography" xmlns="http://schemas.openxmlformats.org/officeDocument/2006/bibliography" SelectedStyle="\APASixthEditionOfficeOnline.xsl" StyleName="APA" Version="6">
+  <b:Source>
+    <b:Tag>Phi20</b:Tag>
+    <b:SourceType>InternetSite</b:SourceType>
+    <b:Guid>{370EA8DA-55BD-47F2-A140-624A4CA438B9}</b:Guid>
+    <b:Author>
+      <b:Author>
+        <b:NameList>
+          <b:Person>
+            <b:Last>Ndikum</b:Last>
+            <b:First>Philip</b:First>
+          </b:Person>
+        </b:NameList>
+      </b:Author>
+    </b:Author>
+    <b:Title>Machine Learning Algorithms for Financial Asset Price Forecasting</b:Title>
+    <b:InternetSiteTitle>arxiv</b:InternetSiteTitle>
+    <b:Year>2020</b:Year>
+    <b:URL>https://arxiv.org/abs/2004.01504</b:URL>
+    <b:RefOrder>1</b:RefOrder>
+  </b:Source>
+  <b:Source>
+    <b:Tag>Alb23</b:Tag>
+    <b:SourceType>InternetSite</b:SourceType>
+    <b:Guid>{CAC6EDDE-0592-4C82-9906-7CB97CCD92C8}</b:Guid>
+    <b:Author>
+      <b:Author>
+        <b:NameList>
+          <b:Person>
+            <b:Last>Albert Wong</b:Last>
+            <b:First>Steven</b:First>
+            <b:Middle>Whang, Emilio Sagre, Niha Sachin, Gustavo Dutra, Yew-Wei Lim, Gaetan Hains, Youry Khmelevsky, Frank Zhang</b:Middle>
+          </b:Person>
+        </b:NameList>
+      </b:Author>
+    </b:Author>
+    <b:Title>Short-Term Stock Price Forecasting using exogenous variables and Machine Learning Algorithms</b:Title>
+    <b:InternetSiteTitle>Trading and Market Microstructure</b:InternetSiteTitle>
+    <b:Year>2023</b:Year>
+    <b:URL>https://arxiv.org/abs/2309.00618</b:URL>
+    <b:RefOrder>2</b:RefOrder>
+  </b:Source>
+</b:Sources>
 </file>
 
-<file path=customXml/itemProps4.xml><?xml version="1.0" encoding="utf-8"?>
+<file path=customXml/itemProps1.xml><?xml version="1.0" encoding="utf-8"?>
 <ds:datastoreItem xmlns:ds="http://schemas.openxmlformats.org/officeDocument/2006/customXml" ds:itemID="{0646EBB2-5A1D-42FE-B060-FCDBA64E390D}">
   <ds:schemaRefs>
     <ds:schemaRef ds:uri="http://schemas.microsoft.com/office/2006/metadata/contentType"/>
@@ -5256,4 +5179,29 @@
     <ds:schemaRef ds:uri="http://schemas.microsoft.com/internal/obd"/>
   </ds:schemaRefs>
 </ds:datastoreItem>
+</file>
+
+<file path=customXml/itemProps2.xml><?xml version="1.0" encoding="utf-8"?>
+<ds:datastoreItem xmlns:ds="http://schemas.openxmlformats.org/officeDocument/2006/customXml" ds:itemID="{09ECDD89-9376-4D0D-8E13-549D769B12AB}">
+  <ds:schemaRefs>
+    <ds:schemaRef ds:uri="http://schemas.microsoft.com/sharepoint/v3/contenttype/forms"/>
+  </ds:schemaRefs>
+</ds:datastoreItem>
+</file>
+
+<file path=customXml/itemProps3.xml><?xml version="1.0" encoding="utf-8"?>
+<ds:datastoreItem xmlns:ds="http://schemas.openxmlformats.org/officeDocument/2006/customXml" ds:itemID="{A8834EE7-90FD-4006-BF8D-556140116A2D}">
+  <ds:schemaRefs>
+    <ds:schemaRef ds:uri="http://schemas.microsoft.com/office/2006/metadata/properties"/>
+    <ds:schemaRef ds:uri="http://schemas.microsoft.com/office/infopath/2007/PartnerControls"/>
+  </ds:schemaRefs>
+</ds:datastoreItem>
+</file>
+
+<file path=customXml/itemProps4.xml><?xml version="1.0" encoding="utf-8"?>
+<ds:datastoreItem xmlns:ds="http://schemas.openxmlformats.org/officeDocument/2006/customXml" ds:itemID="{C8132FE0-DAB3-4537-BC70-39321B387155}">
+  <ds:schemaRefs>
+    <ds:schemaRef ds:uri="http://schemas.openxmlformats.org/officeDocument/2006/bibliography"/>
+  </ds:schemaRefs>
+</ds:datastoreItem>
 </file>
</xml_diff>